<commit_message>
fix: preserve Vietnamese text in Live Fire SRS
</commit_message>
<xml_diff>
--- a/TaiLieu/SRS_Live_Fire_Message.docx
+++ b/TaiLieu/SRS_Live_Fire_Message.docx
@@ -13,7 +13,7 @@
           <w:b/>
           <w:sz w:val="40"/>
         </w:rPr>
-        <w:t>T?I LI?U ??C T? Y?U C?U PH?N M?M</w:t>
+        <w:t>TÀI LIỆU ĐẶC TẢ YÊU CẦU PHẦN MỀM</w:t>
       </w:r>
     </w:p>
     <w:p>
@@ -26,7 +26,7 @@
           <w:b/>
           <w:sz w:val="36"/>
         </w:rPr>
-        <w:t>T?O V? PH? DUY?T LIVE FIRE MESSAGE</w:t>
+        <w:t>TẠO VÀ PHÊ DUYỆT LIVE FIRE MESSAGE</w:t>
       </w:r>
     </w:p>
     <w:p>
@@ -35,16 +35,13 @@
         <w:jc w:val="center"/>
       </w:pPr>
       <w:r>
-        <w:rPr>
-          <w:sz w:val="26"/>
-        </w:rPr>
-        <w:t>H? th?ng: ATFM_WEB</w:t>
+        <w:t>Hệ thống: ATFM_WEB</w:t>
         <w:br/>
-        <w:t>Ph?n h?: MessManagement</w:t>
+        <w:t>Phân hệ: MessManagement</w:t>
         <w:br/>
-        <w:t>Phi?n b?n t?i li?u: 1.0</w:t>
+        <w:t>Phiên bản tài liệu: 1.1</w:t>
         <w:br/>
-        <w:t>Ng?y l?p: 11/08/2026</w:t>
+        <w:t>Ngày cập nhật: 11/08/2026</w:t>
       </w:r>
     </w:p>
     <w:p>
@@ -57,7 +54,7 @@
         <w:pStyle w:val="Heading1"/>
       </w:pPr>
       <w:r>
-        <w:t>1. Th?ng tin chung</w:t>
+        <w:t>1. Thông tin chung</w:t>
       </w:r>
     </w:p>
     <w:tbl>
@@ -77,31 +74,29 @@
         </w:trPr>
         <w:tc>
           <w:tcPr>
-            <w:tcW w:type="dxa" w:w="2835"/>
+            <w:tcW w:type="dxa" w:w="4844"/>
             <w:shd w:fill="D9EAF7"/>
-            <w:vAlign w:val="center"/>
           </w:tcPr>
           <w:p>
             <w:r>
               <w:rPr>
                 <w:b/>
               </w:rPr>
-              <w:t>N?i dung</w:t>
+              <w:t>Nội dung</w:t>
             </w:r>
           </w:p>
         </w:tc>
         <w:tc>
           <w:tcPr>
-            <w:tcW w:type="dxa" w:w="6803"/>
+            <w:tcW w:type="dxa" w:w="4844"/>
             <w:shd w:fill="D9EAF7"/>
-            <w:vAlign w:val="center"/>
           </w:tcPr>
           <w:p>
             <w:r>
               <w:rPr>
                 <w:b/>
               </w:rPr>
-              <w:t>Gi? tr?</w:t>
+              <w:t>Giá trị</w:t>
             </w:r>
           </w:p>
         </w:tc>
@@ -109,23 +104,23 @@
       <w:tr>
         <w:tc>
           <w:tcPr>
-            <w:tcW w:type="dxa" w:w="2835"/>
+            <w:tcW w:type="dxa" w:w="4844"/>
             <w:vAlign w:val="center"/>
           </w:tcPr>
           <w:p>
             <w:r>
-              <w:t>T?n t?nh n?ng</w:t>
+              <w:t>Tên tính năng</w:t>
             </w:r>
           </w:p>
         </w:tc>
         <w:tc>
           <w:tcPr>
-            <w:tcW w:type="dxa" w:w="6803"/>
+            <w:tcW w:type="dxa" w:w="4844"/>
             <w:vAlign w:val="center"/>
           </w:tcPr>
           <w:p>
             <w:r>
-              <w:t>Qu?n l? ?i?n v?n b?n ??n th?t</w:t>
+              <w:t>Quản lý điện văn bắn đạn thật</w:t>
             </w:r>
           </w:p>
         </w:tc>
@@ -133,18 +128,18 @@
       <w:tr>
         <w:tc>
           <w:tcPr>
-            <w:tcW w:type="dxa" w:w="2835"/>
+            <w:tcW w:type="dxa" w:w="4844"/>
             <w:vAlign w:val="center"/>
           </w:tcPr>
           <w:p>
             <w:r>
-              <w:t>M?n h?nh t?o ?i?n v?n</w:t>
+              <w:t>Màn hình tạo điện văn</w:t>
             </w:r>
           </w:p>
         </w:tc>
         <w:tc>
           <w:tcPr>
-            <w:tcW w:type="dxa" w:w="6803"/>
+            <w:tcW w:type="dxa" w:w="4844"/>
             <w:vAlign w:val="center"/>
           </w:tcPr>
           <w:p>
@@ -157,18 +152,18 @@
       <w:tr>
         <w:tc>
           <w:tcPr>
-            <w:tcW w:type="dxa" w:w="2835"/>
+            <w:tcW w:type="dxa" w:w="4844"/>
             <w:vAlign w:val="center"/>
           </w:tcPr>
           <w:p>
             <w:r>
-              <w:t>M?n h?nh ph? duy?t</w:t>
+              <w:t>Màn hình phê duyệt</w:t>
             </w:r>
           </w:p>
         </w:tc>
         <w:tc>
           <w:tcPr>
-            <w:tcW w:type="dxa" w:w="6803"/>
+            <w:tcW w:type="dxa" w:w="4844"/>
             <w:vAlign w:val="center"/>
           </w:tcPr>
           <w:p>
@@ -181,23 +176,23 @@
       <w:tr>
         <w:tc>
           <w:tcPr>
-            <w:tcW w:type="dxa" w:w="2835"/>
+            <w:tcW w:type="dxa" w:w="4844"/>
             <w:vAlign w:val="center"/>
           </w:tcPr>
           <w:p>
             <w:r>
-              <w:t>??i t??ng s? d?ng</w:t>
+              <w:t>Đối tượng sử dụng</w:t>
             </w:r>
           </w:p>
         </w:tc>
         <w:tc>
           <w:tcPr>
-            <w:tcW w:type="dxa" w:w="6803"/>
+            <w:tcW w:type="dxa" w:w="4844"/>
             <w:vAlign w:val="center"/>
           </w:tcPr>
           <w:p>
             <w:r>
-              <w:t>Ng??i nh?p ?i?n v?n; ng??i ph? duy?t</w:t>
+              <w:t>Người nhập điện văn; người phê duyệt</w:t>
             </w:r>
           </w:p>
         </w:tc>
@@ -205,18 +200,18 @@
       <w:tr>
         <w:tc>
           <w:tcPr>
-            <w:tcW w:type="dxa" w:w="2835"/>
+            <w:tcW w:type="dxa" w:w="4844"/>
             <w:vAlign w:val="center"/>
           </w:tcPr>
           <w:p>
             <w:r>
-              <w:t>H? th?ng</w:t>
+              <w:t>Hệ thống</w:t>
             </w:r>
           </w:p>
         </w:tc>
         <w:tc>
           <w:tcPr>
-            <w:tcW w:type="dxa" w:w="6803"/>
+            <w:tcW w:type="dxa" w:w="4844"/>
             <w:vAlign w:val="center"/>
           </w:tcPr>
           <w:p>
@@ -229,18 +224,18 @@
       <w:tr>
         <w:tc>
           <w:tcPr>
-            <w:tcW w:type="dxa" w:w="2835"/>
+            <w:tcW w:type="dxa" w:w="4844"/>
             <w:vAlign w:val="center"/>
           </w:tcPr>
           <w:p>
             <w:r>
-              <w:t>Ph?n h?</w:t>
+              <w:t>Phân hệ</w:t>
             </w:r>
           </w:p>
         </w:tc>
         <w:tc>
           <w:tcPr>
-            <w:tcW w:type="dxa" w:w="6803"/>
+            <w:tcW w:type="dxa" w:w="4844"/>
             <w:vAlign w:val="center"/>
           </w:tcPr>
           <w:p>
@@ -257,15 +252,12 @@
         <w:pStyle w:val="Heading1"/>
       </w:pPr>
       <w:r>
-        <w:t>2. M?c ??ch v? ph?m vi</w:t>
+        <w:t>2. Mục đích và phạm vi</w:t>
       </w:r>
     </w:p>
     <w:p>
-      <w:pPr>
-        <w:spacing w:after="120"/>
-      </w:pPr>
       <w:r>
-        <w:t>T?nh n?ng h? tr? l?p, l?u nh?p, g?i duy?t, ph? duy?t v? t? ch?i ?i?n v?n b?n ??n th?t; ??ng th?i cho ph?p tra c?u ?i?n v?n theo ng?y, tr?ng th?i v? t? kh?a.</w:t>
+        <w:t>Tính năng hỗ trợ lập, lưu nháp, gửi duyệt, phê duyệt và từ chối điện văn bắn đạn thật; đồng thời cho phép tra cứu điện văn theo ngày, trạng thái và từ khóa.</w:t>
       </w:r>
     </w:p>
     <w:p>
@@ -273,7 +265,7 @@
         <w:pStyle w:val="ListBullet"/>
       </w:pPr>
       <w:r>
-        <w:t>T?o m?i v? l?u ?i?n v?n ? tr?ng th?i Nh?p.</w:t>
+        <w:t>Tạo mới và lưu điện văn ở trạng thái Nháp.</w:t>
       </w:r>
     </w:p>
     <w:p>
@@ -281,7 +273,7 @@
         <w:pStyle w:val="ListBullet"/>
       </w:pPr>
       <w:r>
-        <w:t>Ch?nh s?a ?i?n v?n Nh?p ho?c ?i?n v?n b? T? ch?i.</w:t>
+        <w:t>Chỉnh sửa điện văn Nháp hoặc điện văn bị Từ chối.</w:t>
       </w:r>
     </w:p>
     <w:p>
@@ -289,7 +281,7 @@
         <w:pStyle w:val="ListBullet"/>
       </w:pPr>
       <w:r>
-        <w:t>G?i ?i?n v?n sang b? ph?n ph? duy?t.</w:t>
+        <w:t>Gửi điện văn sang bộ phận phê duyệt.</w:t>
       </w:r>
     </w:p>
     <w:p>
@@ -297,7 +289,7 @@
         <w:pStyle w:val="ListBullet"/>
       </w:pPr>
       <w:r>
-        <w:t>Xem, duy?t ho?c t? ch?i ?i?n v?n k?m l? do.</w:t>
+        <w:t>Xem, duyệt hoặc từ chối điện văn kèm lý do.</w:t>
       </w:r>
     </w:p>
     <w:p>
@@ -305,15 +297,12 @@
         <w:pStyle w:val="ListBullet"/>
       </w:pPr>
       <w:r>
-        <w:t>Tra c?u v? ph?n trang danh s?ch ?i?n v?n.</w:t>
+        <w:t>Tra cứu và phân trang danh sách điện văn.</w:t>
       </w:r>
     </w:p>
     <w:p>
-      <w:pPr>
-        <w:spacing w:after="120"/>
-      </w:pPr>
       <w:r>
-        <w:t>Lu?ng export ?i?n v?n ?? duy?t sang T_PLAN_MESSAGE ???c hi?n th? tr?n m?n h?nh ph? duy?t nh?ng kh?ng thu?c ph?m vi ki?m ??nh ch?nh c?a t?i li?u n?y.</w:t>
+        <w:t>Luồng export điện văn đã duyệt sang T_PLAN_MESSAGE được hiển thị trên màn hình phê duyệt nhưng không thuộc phạm vi kiểm định chính của tài liệu này.</w:t>
       </w:r>
     </w:p>
     <w:p>
@@ -321,7 +310,7 @@
         <w:pStyle w:val="Heading1"/>
       </w:pPr>
       <w:r>
-        <w:t>3. Vai tr? v? ph?n quy?n</w:t>
+        <w:t>3. Vai trò và phân quyền</w:t>
       </w:r>
     </w:p>
     <w:tbl>
@@ -342,46 +331,43 @@
         </w:trPr>
         <w:tc>
           <w:tcPr>
-            <w:tcW w:type="dxa" w:w="2835"/>
+            <w:tcW w:type="dxa" w:w="3230"/>
             <w:shd w:fill="D9EAF7"/>
-            <w:vAlign w:val="center"/>
           </w:tcPr>
           <w:p>
             <w:r>
               <w:rPr>
                 <w:b/>
               </w:rPr>
-              <w:t>Vai tr?</w:t>
+              <w:t>Vai trò</w:t>
             </w:r>
           </w:p>
         </w:tc>
         <w:tc>
           <w:tcPr>
-            <w:tcW w:type="dxa" w:w="1701"/>
+            <w:tcW w:type="dxa" w:w="3230"/>
             <w:shd w:fill="D9EAF7"/>
-            <w:vAlign w:val="center"/>
           </w:tcPr>
           <w:p>
             <w:r>
               <w:rPr>
                 <w:b/>
               </w:rPr>
-              <w:t>Quy?n</w:t>
+              <w:t>Quyền</w:t>
             </w:r>
           </w:p>
         </w:tc>
         <w:tc>
           <w:tcPr>
-            <w:tcW w:type="dxa" w:w="5102"/>
+            <w:tcW w:type="dxa" w:w="3230"/>
             <w:shd w:fill="D9EAF7"/>
-            <w:vAlign w:val="center"/>
           </w:tcPr>
           <w:p>
             <w:r>
               <w:rPr>
                 <w:b/>
               </w:rPr>
-              <w:t>Ch?c n?ng</w:t>
+              <w:t>Chức năng</w:t>
             </w:r>
           </w:p>
         </w:tc>
@@ -389,18 +375,18 @@
       <w:tr>
         <w:tc>
           <w:tcPr>
-            <w:tcW w:type="dxa" w:w="2835"/>
+            <w:tcW w:type="dxa" w:w="3230"/>
             <w:vAlign w:val="center"/>
           </w:tcPr>
           <w:p>
             <w:r>
-              <w:t>Ng??i nh?p ?i?n v?n</w:t>
+              <w:t>Người nhập điện văn</w:t>
             </w:r>
           </w:p>
         </w:tc>
         <w:tc>
           <w:tcPr>
-            <w:tcW w:type="dxa" w:w="1701"/>
+            <w:tcW w:type="dxa" w:w="3230"/>
             <w:vAlign w:val="center"/>
           </w:tcPr>
           <w:p>
@@ -411,12 +397,12 @@
         </w:tc>
         <w:tc>
           <w:tcPr>
-            <w:tcW w:type="dxa" w:w="5102"/>
+            <w:tcW w:type="dxa" w:w="3230"/>
             <w:vAlign w:val="center"/>
           </w:tcPr>
           <w:p>
             <w:r>
-              <w:t>T?o ?i?n v?n m?i</w:t>
+              <w:t>Tạo điện văn mới</w:t>
             </w:r>
           </w:p>
         </w:tc>
@@ -424,18 +410,18 @@
       <w:tr>
         <w:tc>
           <w:tcPr>
-            <w:tcW w:type="dxa" w:w="2835"/>
+            <w:tcW w:type="dxa" w:w="3230"/>
             <w:vAlign w:val="center"/>
           </w:tcPr>
           <w:p>
             <w:r>
-              <w:t>Ng??i c?p nh?t ?i?n v?n</w:t>
+              <w:t>Người cập nhật điện văn</w:t>
             </w:r>
           </w:p>
         </w:tc>
         <w:tc>
           <w:tcPr>
-            <w:tcW w:type="dxa" w:w="1701"/>
+            <w:tcW w:type="dxa" w:w="3230"/>
             <w:vAlign w:val="center"/>
           </w:tcPr>
           <w:p>
@@ -446,12 +432,12 @@
         </w:tc>
         <w:tc>
           <w:tcPr>
-            <w:tcW w:type="dxa" w:w="5102"/>
+            <w:tcW w:type="dxa" w:w="3230"/>
             <w:vAlign w:val="center"/>
           </w:tcPr>
           <w:p>
             <w:r>
-              <w:t>S?a, l?u nh?p v? g?i duy?t</w:t>
+              <w:t>Sửa, lưu nháp và gửi duyệt</w:t>
             </w:r>
           </w:p>
         </w:tc>
@@ -459,18 +445,18 @@
       <w:tr>
         <w:tc>
           <w:tcPr>
-            <w:tcW w:type="dxa" w:w="2835"/>
+            <w:tcW w:type="dxa" w:w="3230"/>
             <w:vAlign w:val="center"/>
           </w:tcPr>
           <w:p>
             <w:r>
-              <w:t>Ng??i ph? duy?t</w:t>
+              <w:t>Người phê duyệt</w:t>
             </w:r>
           </w:p>
         </w:tc>
         <w:tc>
           <w:tcPr>
-            <w:tcW w:type="dxa" w:w="1701"/>
+            <w:tcW w:type="dxa" w:w="3230"/>
             <w:vAlign w:val="center"/>
           </w:tcPr>
           <w:p>
@@ -481,12 +467,12 @@
         </w:tc>
         <w:tc>
           <w:tcPr>
-            <w:tcW w:type="dxa" w:w="5102"/>
+            <w:tcW w:type="dxa" w:w="3230"/>
             <w:vAlign w:val="center"/>
           </w:tcPr>
           <w:p>
             <w:r>
-              <w:t>Duy?t ho?c t? ch?i ?i?n v?n</w:t>
+              <w:t>Duyệt hoặc từ chối điện văn</w:t>
             </w:r>
           </w:p>
         </w:tc>
@@ -494,34 +480,34 @@
       <w:tr>
         <w:tc>
           <w:tcPr>
-            <w:tcW w:type="dxa" w:w="2835"/>
+            <w:tcW w:type="dxa" w:w="3230"/>
             <w:vAlign w:val="center"/>
           </w:tcPr>
           <w:p>
             <w:r>
-              <w:t>Ng??i xem</w:t>
+              <w:t>Người xem</w:t>
             </w:r>
           </w:p>
         </w:tc>
         <w:tc>
           <w:tcPr>
-            <w:tcW w:type="dxa" w:w="1701"/>
+            <w:tcW w:type="dxa" w:w="3230"/>
             <w:vAlign w:val="center"/>
           </w:tcPr>
           <w:p>
             <w:r>
-              <w:t>Quy?n truy c?p menu</w:t>
+              <w:t>Quyền truy cập menu</w:t>
             </w:r>
           </w:p>
         </w:tc>
         <w:tc>
           <w:tcPr>
-            <w:tcW w:type="dxa" w:w="5102"/>
+            <w:tcW w:type="dxa" w:w="3230"/>
             <w:vAlign w:val="center"/>
           </w:tcPr>
           <w:p>
             <w:r>
-              <w:t>Tra c?u v? xem chi ti?t</w:t>
+              <w:t>Tra cứu và xem chi tiết</w:t>
             </w:r>
           </w:p>
         </w:tc>
@@ -529,11 +515,8 @@
     </w:tbl>
     <w:p/>
     <w:p>
-      <w:pPr>
-        <w:spacing w:after="120"/>
-      </w:pPr>
       <w:r>
-        <w:t>H? th?ng ph?i ki?m tra quy?n t?i ph?a m?y ch?; ng??i d?ng kh?ng c? quy?n t??ng ?ng kh?ng ???c th?c hi?n thao t?c b?ng c?ch g?i tr?c ti?p API.</w:t>
+        <w:t>Hệ thống phải kiểm tra quyền tại phía máy chủ. Người dùng không có quyền tương ứng không được thực hiện thao tác bằng cách gọi trực tiếp API.</w:t>
       </w:r>
     </w:p>
     <w:p>
@@ -541,7 +524,7 @@
         <w:pStyle w:val="Heading1"/>
       </w:pPr>
       <w:r>
-        <w:t>4. Tr?ng th?i v? lu?ng x? l?</w:t>
+        <w:t>4. Trạng thái và luồng xử lý</w:t>
       </w:r>
     </w:p>
     <w:tbl>
@@ -562,46 +545,43 @@
         </w:trPr>
         <w:tc>
           <w:tcPr>
-            <w:tcW w:type="dxa" w:w="1134"/>
+            <w:tcW w:type="dxa" w:w="3230"/>
             <w:shd w:fill="D9EAF7"/>
-            <w:vAlign w:val="center"/>
           </w:tcPr>
           <w:p>
             <w:r>
               <w:rPr>
                 <w:b/>
               </w:rPr>
-              <w:t>Gi? tr?</w:t>
+              <w:t>Giá trị</w:t>
             </w:r>
           </w:p>
         </w:tc>
         <w:tc>
           <w:tcPr>
-            <w:tcW w:type="dxa" w:w="2268"/>
+            <w:tcW w:type="dxa" w:w="3230"/>
             <w:shd w:fill="D9EAF7"/>
-            <w:vAlign w:val="center"/>
           </w:tcPr>
           <w:p>
             <w:r>
               <w:rPr>
                 <w:b/>
               </w:rPr>
-              <w:t>Tr?ng th?i</w:t>
+              <w:t>Trạng thái</w:t>
             </w:r>
           </w:p>
         </w:tc>
         <w:tc>
           <w:tcPr>
-            <w:tcW w:type="dxa" w:w="6236"/>
+            <w:tcW w:type="dxa" w:w="3230"/>
             <w:shd w:fill="D9EAF7"/>
-            <w:vAlign w:val="center"/>
           </w:tcPr>
           <w:p>
             <w:r>
               <w:rPr>
                 <w:b/>
               </w:rPr>
-              <w:t>? ngh?a</w:t>
+              <w:t>Ý nghĩa</w:t>
             </w:r>
           </w:p>
         </w:tc>
@@ -609,7 +589,7 @@
       <w:tr>
         <w:tc>
           <w:tcPr>
-            <w:tcW w:type="dxa" w:w="1134"/>
+            <w:tcW w:type="dxa" w:w="3230"/>
             <w:vAlign w:val="center"/>
           </w:tcPr>
           <w:p>
@@ -620,23 +600,23 @@
         </w:tc>
         <w:tc>
           <w:tcPr>
-            <w:tcW w:type="dxa" w:w="2268"/>
+            <w:tcW w:type="dxa" w:w="3230"/>
             <w:vAlign w:val="center"/>
           </w:tcPr>
           <w:p>
             <w:r>
-              <w:t>Nh?p</w:t>
+              <w:t>Nháp</w:t>
             </w:r>
           </w:p>
         </w:tc>
         <w:tc>
           <w:tcPr>
-            <w:tcW w:type="dxa" w:w="6236"/>
+            <w:tcW w:type="dxa" w:w="3230"/>
             <w:vAlign w:val="center"/>
           </w:tcPr>
           <w:p>
             <w:r>
-              <w:t>?i?n v?n ?ang ???c nh?p ho?c ch?nh s?a</w:t>
+              <w:t>Điện văn đang được nhập hoặc chỉnh sửa</w:t>
             </w:r>
           </w:p>
         </w:tc>
@@ -644,7 +624,7 @@
       <w:tr>
         <w:tc>
           <w:tcPr>
-            <w:tcW w:type="dxa" w:w="1134"/>
+            <w:tcW w:type="dxa" w:w="3230"/>
             <w:vAlign w:val="center"/>
           </w:tcPr>
           <w:p>
@@ -655,23 +635,23 @@
         </w:tc>
         <w:tc>
           <w:tcPr>
-            <w:tcW w:type="dxa" w:w="2268"/>
+            <w:tcW w:type="dxa" w:w="3230"/>
             <w:vAlign w:val="center"/>
           </w:tcPr>
           <w:p>
             <w:r>
-              <w:t>?? duy?t</w:t>
+              <w:t>Đã duyệt</w:t>
             </w:r>
           </w:p>
         </w:tc>
         <w:tc>
           <w:tcPr>
-            <w:tcW w:type="dxa" w:w="6236"/>
+            <w:tcW w:type="dxa" w:w="3230"/>
             <w:vAlign w:val="center"/>
           </w:tcPr>
           <w:p>
             <w:r>
-              <w:t>?i?n v?n ?? ???c ng??i c? th?m quy?n duy?t</w:t>
+              <w:t>Điện văn đã được người có thẩm quyền duyệt</w:t>
             </w:r>
           </w:p>
         </w:tc>
@@ -679,7 +659,7 @@
       <w:tr>
         <w:tc>
           <w:tcPr>
-            <w:tcW w:type="dxa" w:w="1134"/>
+            <w:tcW w:type="dxa" w:w="3230"/>
             <w:vAlign w:val="center"/>
           </w:tcPr>
           <w:p>
@@ -690,23 +670,23 @@
         </w:tc>
         <w:tc>
           <w:tcPr>
-            <w:tcW w:type="dxa" w:w="2268"/>
+            <w:tcW w:type="dxa" w:w="3230"/>
             <w:vAlign w:val="center"/>
           </w:tcPr>
           <w:p>
             <w:r>
-              <w:t>Ch? duy?t</w:t>
+              <w:t>Chờ duyệt</w:t>
             </w:r>
           </w:p>
         </w:tc>
         <w:tc>
           <w:tcPr>
-            <w:tcW w:type="dxa" w:w="6236"/>
+            <w:tcW w:type="dxa" w:w="3230"/>
             <w:vAlign w:val="center"/>
           </w:tcPr>
           <w:p>
             <w:r>
-              <w:t>?i?n v?n ?? g?i sang m?n h?nh ph? duy?t</w:t>
+              <w:t>Điện văn đã gửi sang màn hình phê duyệt</w:t>
             </w:r>
           </w:p>
         </w:tc>
@@ -714,7 +694,7 @@
       <w:tr>
         <w:tc>
           <w:tcPr>
-            <w:tcW w:type="dxa" w:w="1134"/>
+            <w:tcW w:type="dxa" w:w="3230"/>
             <w:vAlign w:val="center"/>
           </w:tcPr>
           <w:p>
@@ -725,23 +705,23 @@
         </w:tc>
         <w:tc>
           <w:tcPr>
-            <w:tcW w:type="dxa" w:w="2268"/>
+            <w:tcW w:type="dxa" w:w="3230"/>
             <w:vAlign w:val="center"/>
           </w:tcPr>
           <w:p>
             <w:r>
-              <w:t>T? ch?i</w:t>
+              <w:t>Từ chối</w:t>
             </w:r>
           </w:p>
         </w:tc>
         <w:tc>
           <w:tcPr>
-            <w:tcW w:type="dxa" w:w="6236"/>
+            <w:tcW w:type="dxa" w:w="3230"/>
             <w:vAlign w:val="center"/>
           </w:tcPr>
           <w:p>
             <w:r>
-              <w:t>?i?n v?n kh?ng ???c duy?t v? c? l? do t? ch?i</w:t>
+              <w:t>Điện văn không được duyệt và có lý do từ chối</w:t>
             </w:r>
           </w:p>
         </w:tc>
@@ -749,7 +729,7 @@
       <w:tr>
         <w:tc>
           <w:tcPr>
-            <w:tcW w:type="dxa" w:w="1134"/>
+            <w:tcW w:type="dxa" w:w="3230"/>
             <w:vAlign w:val="center"/>
           </w:tcPr>
           <w:p>
@@ -760,23 +740,23 @@
         </w:tc>
         <w:tc>
           <w:tcPr>
-            <w:tcW w:type="dxa" w:w="2268"/>
+            <w:tcW w:type="dxa" w:w="3230"/>
             <w:vAlign w:val="center"/>
           </w:tcPr>
           <w:p>
             <w:r>
-              <w:t>?? export</w:t>
+              <w:t>Đã export</w:t>
             </w:r>
           </w:p>
         </w:tc>
         <w:tc>
           <w:tcPr>
-            <w:tcW w:type="dxa" w:w="6236"/>
+            <w:tcW w:type="dxa" w:w="3230"/>
             <w:vAlign w:val="center"/>
           </w:tcPr>
           <w:p>
             <w:r>
-              <w:t>?i?n v?n ?? ???c chuy?n sang T_PLAN_MESSAGE</w:t>
+              <w:t>Điện văn đã được chuyển sang T_PLAN_MESSAGE</w:t>
             </w:r>
           </w:p>
         </w:tc>
@@ -784,11 +764,8 @@
     </w:tbl>
     <w:p/>
     <w:p>
-      <w:pPr>
-        <w:spacing w:after="120"/>
-      </w:pPr>
       <w:r>
-        <w:t>Lu?ng ch?nh: T?o m?i ? Nh?p ? Ch? duy?t ? ?? duy?t. N?u b? t? ch?i: Ch? duy?t ? T? ch?i ? ch?nh s?a ? Ch? duy?t. ?i?n v?n ch? ???c ch?nh s?a khi ? tr?ng th?i Nh?p ho?c T? ch?i.</w:t>
+        <w:t>Luồng chính: Tạo mới → Nháp → Chờ duyệt → Đã duyệt. Nếu bị từ chối: Chờ duyệt → Từ chối → chỉnh sửa → Chờ duyệt. Điện văn chỉ được chỉnh sửa khi ở trạng thái Nháp hoặc Từ chối.</w:t>
       </w:r>
     </w:p>
     <w:p>
@@ -796,7 +773,7 @@
         <w:pStyle w:val="Heading1"/>
       </w:pPr>
       <w:r>
-        <w:t>5. Ch?c n?ng t?o Live Fire Message</w:t>
+        <w:t>5. Chức năng tạo Live Fire Message</w:t>
       </w:r>
     </w:p>
     <w:p>
@@ -804,7 +781,7 @@
         <w:pStyle w:val="Heading2"/>
       </w:pPr>
       <w:r>
-        <w:t>5.1. Th?ng tin ch?c n?ng</w:t>
+        <w:t>5.1. Thông tin chức năng</w:t>
       </w:r>
     </w:p>
     <w:tbl>
@@ -824,31 +801,29 @@
         </w:trPr>
         <w:tc>
           <w:tcPr>
-            <w:tcW w:type="dxa" w:w="2835"/>
+            <w:tcW w:type="dxa" w:w="4844"/>
             <w:shd w:fill="D9EAF7"/>
-            <w:vAlign w:val="center"/>
           </w:tcPr>
           <w:p>
             <w:r>
               <w:rPr>
                 <w:b/>
               </w:rPr>
-              <w:t>N?i dung</w:t>
+              <w:t>Nội dung</w:t>
             </w:r>
           </w:p>
         </w:tc>
         <w:tc>
           <w:tcPr>
-            <w:tcW w:type="dxa" w:w="6803"/>
+            <w:tcW w:type="dxa" w:w="4844"/>
             <w:shd w:fill="D9EAF7"/>
-            <w:vAlign w:val="center"/>
           </w:tcPr>
           <w:p>
             <w:r>
               <w:rPr>
                 <w:b/>
               </w:rPr>
-              <w:t>M? t?</w:t>
+              <w:t>Mô tả</w:t>
             </w:r>
           </w:p>
         </w:tc>
@@ -856,18 +831,18 @@
       <w:tr>
         <w:tc>
           <w:tcPr>
-            <w:tcW w:type="dxa" w:w="2835"/>
+            <w:tcW w:type="dxa" w:w="4844"/>
             <w:vAlign w:val="center"/>
           </w:tcPr>
           <w:p>
             <w:r>
-              <w:t>M? ch?c n?ng</w:t>
+              <w:t>Mã chức năng</w:t>
             </w:r>
           </w:p>
         </w:tc>
         <w:tc>
           <w:tcPr>
-            <w:tcW w:type="dxa" w:w="6803"/>
+            <w:tcW w:type="dxa" w:w="4844"/>
             <w:vAlign w:val="center"/>
           </w:tcPr>
           <w:p>
@@ -880,23 +855,23 @@
       <w:tr>
         <w:tc>
           <w:tcPr>
-            <w:tcW w:type="dxa" w:w="2835"/>
+            <w:tcW w:type="dxa" w:w="4844"/>
             <w:vAlign w:val="center"/>
           </w:tcPr>
           <w:p>
             <w:r>
-              <w:t>???ng d?n</w:t>
+              <w:t>Tác nhân</w:t>
             </w:r>
           </w:p>
         </w:tc>
         <w:tc>
           <w:tcPr>
-            <w:tcW w:type="dxa" w:w="6803"/>
+            <w:tcW w:type="dxa" w:w="4844"/>
             <w:vAlign w:val="center"/>
           </w:tcPr>
           <w:p>
             <w:r>
-              <w:t>/MessManagement/LiveFireMessage.aspx?Menu_ID=989</w:t>
+              <w:t>Người nhập điện văn</w:t>
             </w:r>
           </w:p>
         </w:tc>
@@ -904,23 +879,23 @@
       <w:tr>
         <w:tc>
           <w:tcPr>
-            <w:tcW w:type="dxa" w:w="2835"/>
+            <w:tcW w:type="dxa" w:w="4844"/>
             <w:vAlign w:val="center"/>
           </w:tcPr>
           <w:p>
             <w:r>
-              <w:t>T?c nh?n</w:t>
+              <w:t>Tiền điều kiện</w:t>
             </w:r>
           </w:p>
         </w:tc>
         <w:tc>
           <w:tcPr>
-            <w:tcW w:type="dxa" w:w="6803"/>
+            <w:tcW w:type="dxa" w:w="4844"/>
             <w:vAlign w:val="center"/>
           </w:tcPr>
           <w:p>
             <w:r>
-              <w:t>Ng??i nh?p ?i?n v?n</w:t>
+              <w:t>Đã đăng nhập và có quyền truy cập menu</w:t>
             </w:r>
           </w:p>
         </w:tc>
@@ -928,47 +903,23 @@
       <w:tr>
         <w:tc>
           <w:tcPr>
-            <w:tcW w:type="dxa" w:w="2835"/>
+            <w:tcW w:type="dxa" w:w="4844"/>
             <w:vAlign w:val="center"/>
           </w:tcPr>
           <w:p>
             <w:r>
-              <w:t>Ti?n ?i?u ki?n</w:t>
+              <w:t>Kết quả</w:t>
             </w:r>
           </w:p>
         </w:tc>
         <w:tc>
           <w:tcPr>
-            <w:tcW w:type="dxa" w:w="6803"/>
+            <w:tcW w:type="dxa" w:w="4844"/>
             <w:vAlign w:val="center"/>
           </w:tcPr>
           <w:p>
             <w:r>
-              <w:t>?? ??ng nh?p v? c? quy?n truy c?p menu</w:t>
-            </w:r>
-          </w:p>
-        </w:tc>
-      </w:tr>
-      <w:tr>
-        <w:tc>
-          <w:tcPr>
-            <w:tcW w:type="dxa" w:w="2835"/>
-            <w:vAlign w:val="center"/>
-          </w:tcPr>
-          <w:p>
-            <w:r>
-              <w:t>K?t qu?</w:t>
-            </w:r>
-          </w:p>
-        </w:tc>
-        <w:tc>
-          <w:tcPr>
-            <w:tcW w:type="dxa" w:w="6803"/>
-            <w:vAlign w:val="center"/>
-          </w:tcPr>
-          <w:p>
-            <w:r>
-              <w:t>?i?n v?n ???c l?u nh?p ho?c chuy?n sang Ch? duy?t</w:t>
+              <w:t>Điện văn được lưu nháp hoặc chuyển sang Chờ duyệt</w:t>
             </w:r>
           </w:p>
         </w:tc>
@@ -980,23 +931,12 @@
         <w:pStyle w:val="Heading2"/>
       </w:pPr>
       <w:r>
-        <w:t>5.2. Tra c?u ?i?n v?n</w:t>
+        <w:t>5.2. Tra cứu điện văn</w:t>
       </w:r>
     </w:p>
     <w:p>
-      <w:pPr>
-        <w:spacing w:after="120"/>
-      </w:pPr>
       <w:r>
-        <w:t>Cho ph?p t?m ki?m theo T? ng?y, ??n ng?y, tr?ng th?i Nh?p/T? ch?i, t? kh?a v? s? d?ng m?i trang (20, 50 ho?c 100). T? kh?a ?p d?ng cho m? ?i?n v?n, ti?u ??, ??a ?i?m ho?c ng??i nh?p. H? th?ng kh?ng th?c hi?n t?m ki?m n?u T? ng?y l?n h?n ??n ng?y.</w:t>
-      </w:r>
-    </w:p>
-    <w:p>
-      <w:pPr>
-        <w:spacing w:after="120"/>
-      </w:pPr>
-      <w:r>
-        <w:t>Danh s?ch hi?n th?: s? th? t?, ng?y ?i?n v?n, m?, ti?u ??, ??a ?i?m b?n, tr?ng th?i, ng??i nh?p, ng??i duy?t v? thao t?c xem.</w:t>
+        <w:t>Cho phép tìm kiếm theo Từ ngày, Đến ngày, trạng thái Nháp/Từ chối, từ khóa và số dòng mỗi trang (20, 50 hoặc 100). Từ khóa áp dụng cho mã điện văn, tiêu đề, địa điểm hoặc người nhập. Không tìm kiếm nếu Từ ngày lớn hơn Đến ngày.</w:t>
       </w:r>
     </w:p>
     <w:p>
@@ -1004,7 +944,7 @@
         <w:pStyle w:val="Heading2"/>
       </w:pPr>
       <w:r>
-        <w:t>5.3. D? li?u ?i?n v?n</w:t>
+        <w:t>5.3. Dữ liệu điện văn</w:t>
       </w:r>
     </w:p>
     <w:tbl>
@@ -1025,46 +965,43 @@
         </w:trPr>
         <w:tc>
           <w:tcPr>
-            <w:tcW w:type="dxa" w:w="2268"/>
+            <w:tcW w:type="dxa" w:w="3230"/>
             <w:shd w:fill="D9EAF7"/>
-            <w:vAlign w:val="center"/>
           </w:tcPr>
           <w:p>
             <w:r>
               <w:rPr>
                 <w:b/>
               </w:rPr>
-              <w:t>Nh?m</w:t>
+              <w:t>Nhóm</w:t>
             </w:r>
           </w:p>
         </w:tc>
         <w:tc>
           <w:tcPr>
-            <w:tcW w:type="dxa" w:w="3969"/>
+            <w:tcW w:type="dxa" w:w="3230"/>
             <w:shd w:fill="D9EAF7"/>
-            <w:vAlign w:val="center"/>
           </w:tcPr>
           <w:p>
             <w:r>
               <w:rPr>
                 <w:b/>
               </w:rPr>
-              <w:t>Tr??ng d? li?u</w:t>
+              <w:t>Trường dữ liệu</w:t>
             </w:r>
           </w:p>
         </w:tc>
         <w:tc>
           <w:tcPr>
-            <w:tcW w:type="dxa" w:w="3402"/>
+            <w:tcW w:type="dxa" w:w="3230"/>
             <w:shd w:fill="D9EAF7"/>
-            <w:vAlign w:val="center"/>
           </w:tcPr>
           <w:p>
             <w:r>
               <w:rPr>
                 <w:b/>
               </w:rPr>
-              <w:t>B?t bu?c/Gi?i h?n</w:t>
+              <w:t>Yêu cầu</w:t>
             </w:r>
           </w:p>
         </w:tc>
@@ -1072,34 +1009,34 @@
       <w:tr>
         <w:tc>
           <w:tcPr>
-            <w:tcW w:type="dxa" w:w="2268"/>
+            <w:tcW w:type="dxa" w:w="3230"/>
             <w:vAlign w:val="center"/>
           </w:tcPr>
           <w:p>
             <w:r>
-              <w:t>Th?ng tin chung</w:t>
+              <w:t>Thông tin chung</w:t>
             </w:r>
           </w:p>
         </w:tc>
         <w:tc>
           <w:tcPr>
-            <w:tcW w:type="dxa" w:w="3969"/>
+            <w:tcW w:type="dxa" w:w="3230"/>
             <w:vAlign w:val="center"/>
           </w:tcPr>
           <w:p>
             <w:r>
-              <w:t>Ng?y ?i?n v?n</w:t>
+              <w:t>Ngày điện văn</w:t>
             </w:r>
           </w:p>
         </w:tc>
         <w:tc>
           <w:tcPr>
-            <w:tcW w:type="dxa" w:w="3402"/>
+            <w:tcW w:type="dxa" w:w="3230"/>
             <w:vAlign w:val="center"/>
           </w:tcPr>
           <w:p>
             <w:r>
-              <w:t>B?t bu?c; ??nh d?ng ng?y</w:t>
+              <w:t>Bắt buộc; định dạng ngày</w:t>
             </w:r>
           </w:p>
         </w:tc>
@@ -1107,34 +1044,34 @@
       <w:tr>
         <w:tc>
           <w:tcPr>
-            <w:tcW w:type="dxa" w:w="2268"/>
+            <w:tcW w:type="dxa" w:w="3230"/>
             <w:vAlign w:val="center"/>
           </w:tcPr>
           <w:p>
             <w:r>
-              <w:t>Th?ng tin chung</w:t>
+              <w:t>Thông tin chung</w:t>
             </w:r>
           </w:p>
         </w:tc>
         <w:tc>
           <w:tcPr>
-            <w:tcW w:type="dxa" w:w="3969"/>
+            <w:tcW w:type="dxa" w:w="3230"/>
             <w:vAlign w:val="center"/>
           </w:tcPr>
           <w:p>
             <w:r>
-              <w:t>M? ?i?n v?n</w:t>
+              <w:t>Mã điện văn</w:t>
             </w:r>
           </w:p>
         </w:tc>
         <w:tc>
           <w:tcPr>
-            <w:tcW w:type="dxa" w:w="3402"/>
+            <w:tcW w:type="dxa" w:w="3230"/>
             <w:vAlign w:val="center"/>
           </w:tcPr>
           <w:p>
             <w:r>
-              <w:t>Kh?ng b?t bu?c; t?i ?a 100 k? t?</w:t>
+              <w:t>Không bắt buộc; tối đa 100 ký tự</w:t>
             </w:r>
           </w:p>
         </w:tc>
@@ -1142,34 +1079,34 @@
       <w:tr>
         <w:tc>
           <w:tcPr>
-            <w:tcW w:type="dxa" w:w="2268"/>
+            <w:tcW w:type="dxa" w:w="3230"/>
             <w:vAlign w:val="center"/>
           </w:tcPr>
           <w:p>
             <w:r>
-              <w:t>Th?ng tin chung</w:t>
+              <w:t>Thông tin chung</w:t>
             </w:r>
           </w:p>
         </w:tc>
         <w:tc>
           <w:tcPr>
-            <w:tcW w:type="dxa" w:w="3969"/>
+            <w:tcW w:type="dxa" w:w="3230"/>
             <w:vAlign w:val="center"/>
           </w:tcPr>
           <w:p>
             <w:r>
-              <w:t>Ti?u ??</w:t>
+              <w:t>Tiêu đề</w:t>
             </w:r>
           </w:p>
         </w:tc>
         <w:tc>
           <w:tcPr>
-            <w:tcW w:type="dxa" w:w="3402"/>
+            <w:tcW w:type="dxa" w:w="3230"/>
             <w:vAlign w:val="center"/>
           </w:tcPr>
           <w:p>
             <w:r>
-              <w:t>B?t bu?c; t?i ?a 300 k? t?</w:t>
+              <w:t>Bắt buộc; tối đa 300 ký tự</w:t>
             </w:r>
           </w:p>
         </w:tc>
@@ -1177,34 +1114,34 @@
       <w:tr>
         <w:tc>
           <w:tcPr>
-            <w:tcW w:type="dxa" w:w="2268"/>
+            <w:tcW w:type="dxa" w:w="3230"/>
             <w:vAlign w:val="center"/>
           </w:tcPr>
           <w:p>
             <w:r>
-              <w:t>Th?ng tin chung</w:t>
+              <w:t>Thông tin chung</w:t>
             </w:r>
           </w:p>
         </w:tc>
         <w:tc>
           <w:tcPr>
-            <w:tcW w:type="dxa" w:w="3969"/>
+            <w:tcW w:type="dxa" w:w="3230"/>
             <w:vAlign w:val="center"/>
           </w:tcPr>
           <w:p>
             <w:r>
-              <w:t>N?i dung m? ??u</w:t>
+              <w:t>Nội dung mở đầu</w:t>
             </w:r>
           </w:p>
         </w:tc>
         <w:tc>
           <w:tcPr>
-            <w:tcW w:type="dxa" w:w="3402"/>
+            <w:tcW w:type="dxa" w:w="3230"/>
             <w:vAlign w:val="center"/>
           </w:tcPr>
           <w:p>
             <w:r>
-              <w:t>Kh?ng b?t bu?c; t?i ?a 2.000 k? t?</w:t>
+              <w:t>Không bắt buộc; tối đa 2.000 ký tự</w:t>
             </w:r>
           </w:p>
         </w:tc>
@@ -1212,34 +1149,34 @@
       <w:tr>
         <w:tc>
           <w:tcPr>
-            <w:tcW w:type="dxa" w:w="2268"/>
+            <w:tcW w:type="dxa" w:w="3230"/>
             <w:vAlign w:val="center"/>
           </w:tcPr>
           <w:p>
             <w:r>
-              <w:t>Th?ng tin chung</w:t>
+              <w:t>Thông tin chung</w:t>
             </w:r>
           </w:p>
         </w:tc>
         <w:tc>
           <w:tcPr>
-            <w:tcW w:type="dxa" w:w="3969"/>
+            <w:tcW w:type="dxa" w:w="3230"/>
             <w:vAlign w:val="center"/>
           </w:tcPr>
           <w:p>
             <w:r>
-              <w:t>??a ?i?m b?n</w:t>
+              <w:t>Địa điểm bắn</w:t>
             </w:r>
           </w:p>
         </w:tc>
         <w:tc>
           <w:tcPr>
-            <w:tcW w:type="dxa" w:w="3402"/>
+            <w:tcW w:type="dxa" w:w="3230"/>
             <w:vAlign w:val="center"/>
           </w:tcPr>
           <w:p>
             <w:r>
-              <w:t>B?t bu?c; t?i ?a 1.000 k? t?</w:t>
+              <w:t>Bắt buộc; tối đa 1.000 ký tự</w:t>
             </w:r>
           </w:p>
         </w:tc>
@@ -1247,34 +1184,34 @@
       <w:tr>
         <w:tc>
           <w:tcPr>
-            <w:tcW w:type="dxa" w:w="2268"/>
+            <w:tcW w:type="dxa" w:w="3230"/>
             <w:vAlign w:val="center"/>
           </w:tcPr>
           <w:p>
             <w:r>
-              <w:t>T?a ??</w:t>
+              <w:t>Tọa độ</w:t>
             </w:r>
           </w:p>
         </w:tc>
         <w:tc>
           <w:tcPr>
-            <w:tcW w:type="dxa" w:w="3969"/>
+            <w:tcW w:type="dxa" w:w="3230"/>
             <w:vAlign w:val="center"/>
           </w:tcPr>
           <w:p>
             <w:r>
-              <w:t>T?n ?i?m, v? ??, kinh ??</w:t>
+              <w:t>Tên điểm, vĩ độ, kinh độ</w:t>
             </w:r>
           </w:p>
         </w:tc>
         <w:tc>
           <w:tcPr>
-            <w:tcW w:type="dxa" w:w="3402"/>
+            <w:tcW w:type="dxa" w:w="3230"/>
             <w:vAlign w:val="center"/>
           </w:tcPr>
           <w:p>
             <w:r>
-              <w:t>Cho ph?p nhi?u d?ng; th?m/x?a</w:t>
+              <w:t>Cho phép nhiều dòng; thêm hoặc xóa</w:t>
             </w:r>
           </w:p>
         </w:tc>
@@ -1282,34 +1219,34 @@
       <w:tr>
         <w:tc>
           <w:tcPr>
-            <w:tcW w:type="dxa" w:w="2268"/>
+            <w:tcW w:type="dxa" w:w="3230"/>
             <w:vAlign w:val="center"/>
           </w:tcPr>
           <w:p>
             <w:r>
-              <w:t>Th?ng s? b?n</w:t>
+              <w:t>Thông số bắn</w:t>
             </w:r>
           </w:p>
         </w:tc>
         <w:tc>
           <w:tcPr>
-            <w:tcW w:type="dxa" w:w="3969"/>
+            <w:tcW w:type="dxa" w:w="3230"/>
             <w:vAlign w:val="center"/>
           </w:tcPr>
           <w:p>
             <w:r>
-              <w:t>Ph??ng v?, ?? cao, c? ly ???ng ??n</w:t>
+              <w:t>Phương vị, độ cao, cự ly</w:t>
             </w:r>
           </w:p>
         </w:tc>
         <w:tc>
           <w:tcPr>
-            <w:tcW w:type="dxa" w:w="3402"/>
+            <w:tcW w:type="dxa" w:w="3230"/>
             <w:vAlign w:val="center"/>
           </w:tcPr>
           <w:p>
             <w:r>
-              <w:t>Kh?ng b?t bu?c</w:t>
+              <w:t>Không bắt buộc</w:t>
             </w:r>
           </w:p>
         </w:tc>
@@ -1317,34 +1254,34 @@
       <w:tr>
         <w:tc>
           <w:tcPr>
-            <w:tcW w:type="dxa" w:w="2268"/>
+            <w:tcW w:type="dxa" w:w="3230"/>
             <w:vAlign w:val="center"/>
           </w:tcPr>
           <w:p>
             <w:r>
-              <w:t>Th?i gian b?n</w:t>
+              <w:t>Thời gian bắn</w:t>
             </w:r>
           </w:p>
         </w:tc>
         <w:tc>
           <w:tcPr>
-            <w:tcW w:type="dxa" w:w="3969"/>
+            <w:tcW w:type="dxa" w:w="3230"/>
             <w:vAlign w:val="center"/>
           </w:tcPr>
           <w:p>
             <w:r>
-              <w:t>T? gi?, ??n gi?, ng?y, ?? cao</w:t>
+              <w:t>Từ giờ, đến giờ, ngày, độ cao</w:t>
             </w:r>
           </w:p>
         </w:tc>
         <w:tc>
           <w:tcPr>
-            <w:tcW w:type="dxa" w:w="3402"/>
+            <w:tcW w:type="dxa" w:w="3230"/>
             <w:vAlign w:val="center"/>
           </w:tcPr>
           <w:p>
             <w:r>
-              <w:t>Cho ph?p nhi?u d?ng; gi? HH:mm</w:t>
+              <w:t>Nhiều dòng; giờ HH:mm</w:t>
             </w:r>
           </w:p>
         </w:tc>
@@ -1352,34 +1289,34 @@
       <w:tr>
         <w:tc>
           <w:tcPr>
-            <w:tcW w:type="dxa" w:w="2268"/>
+            <w:tcW w:type="dxa" w:w="3230"/>
             <w:vAlign w:val="center"/>
           </w:tcPr>
           <w:p>
             <w:r>
-              <w:t>Ch? huy</w:t>
+              <w:t>Chỉ huy</w:t>
             </w:r>
           </w:p>
         </w:tc>
         <w:tc>
           <w:tcPr>
-            <w:tcW w:type="dxa" w:w="3969"/>
+            <w:tcW w:type="dxa" w:w="3230"/>
             <w:vAlign w:val="center"/>
           </w:tcPr>
           <w:p>
             <w:r>
-              <w:t>C?p b?c, h? t?n, s? ?i?n tho?i</w:t>
+              <w:t>Cấp bậc, họ tên, số điện thoại</w:t>
             </w:r>
           </w:p>
         </w:tc>
         <w:tc>
           <w:tcPr>
-            <w:tcW w:type="dxa" w:w="3402"/>
+            <w:tcW w:type="dxa" w:w="3230"/>
             <w:vAlign w:val="center"/>
           </w:tcPr>
           <w:p>
             <w:r>
-              <w:t>Kh?ng b?t bu?c</w:t>
+              <w:t>Không bắt buộc</w:t>
             </w:r>
           </w:p>
         </w:tc>
@@ -1387,34 +1324,34 @@
       <w:tr>
         <w:tc>
           <w:tcPr>
-            <w:tcW w:type="dxa" w:w="2268"/>
+            <w:tcW w:type="dxa" w:w="3230"/>
             <w:vAlign w:val="center"/>
           </w:tcPr>
           <w:p>
             <w:r>
-              <w:t>Ng??i thay th?</w:t>
+              <w:t>Người thay thế</w:t>
             </w:r>
           </w:p>
         </w:tc>
         <w:tc>
           <w:tcPr>
-            <w:tcW w:type="dxa" w:w="3969"/>
+            <w:tcW w:type="dxa" w:w="3230"/>
             <w:vAlign w:val="center"/>
           </w:tcPr>
           <w:p>
             <w:r>
-              <w:t>C?p b?c, h? t?n, s? ?i?n tho?i</w:t>
+              <w:t>Cấp bậc, họ tên, số điện thoại</w:t>
             </w:r>
           </w:p>
         </w:tc>
         <w:tc>
           <w:tcPr>
-            <w:tcW w:type="dxa" w:w="3402"/>
+            <w:tcW w:type="dxa" w:w="3230"/>
             <w:vAlign w:val="center"/>
           </w:tcPr>
           <w:p>
             <w:r>
-              <w:t>Kh?ng b?t bu?c</w:t>
+              <w:t>Không bắt buộc</w:t>
             </w:r>
           </w:p>
         </w:tc>
@@ -1422,34 +1359,34 @@
       <w:tr>
         <w:tc>
           <w:tcPr>
-            <w:tcW w:type="dxa" w:w="2268"/>
+            <w:tcW w:type="dxa" w:w="3230"/>
             <w:vAlign w:val="center"/>
           </w:tcPr>
           <w:p>
             <w:r>
-              <w:t>Kh?c</w:t>
+              <w:t>Khác</w:t>
             </w:r>
           </w:p>
         </w:tc>
         <w:tc>
           <w:tcPr>
-            <w:tcW w:type="dxa" w:w="3969"/>
+            <w:tcW w:type="dxa" w:w="3230"/>
             <w:vAlign w:val="center"/>
           </w:tcPr>
           <w:p>
             <w:r>
-              <w:t>H?n ch?/c?m bay; ch?c danh v? h? t?n ng??i k?</w:t>
+              <w:t>Hạn chế/cấm bay; người ký</w:t>
             </w:r>
           </w:p>
         </w:tc>
         <w:tc>
           <w:tcPr>
-            <w:tcW w:type="dxa" w:w="3402"/>
+            <w:tcW w:type="dxa" w:w="3230"/>
             <w:vAlign w:val="center"/>
           </w:tcPr>
           <w:p>
             <w:r>
-              <w:t>Kh?ng b?t bu?c</w:t>
+              <w:t>Không bắt buộc</w:t>
             </w:r>
           </w:p>
         </w:tc>
@@ -1457,11 +1394,8 @@
     </w:tbl>
     <w:p/>
     <w:p>
-      <w:pPr>
-        <w:spacing w:after="120"/>
-      </w:pPr>
       <w:r>
-        <w:t>Ti?u ?? m?c ??nh khi th?m m?i l? ?THONG BAO BAN DAN THAT?. H? th?ng kh?i t?o b?n ?i?m t?a ?? D1, D2, D3, D4 v? m?t d?ng th?i gian b?n.</w:t>
+        <w:t>Tiêu đề mặc định là “THONG BAO BAN DAN THAT”. Hệ thống khởi tạo bốn điểm tọa độ D1, D2, D3, D4 và một dòng thời gian bắn.</w:t>
       </w:r>
     </w:p>
     <w:p>
@@ -1469,15 +1403,12 @@
         <w:pStyle w:val="Heading2"/>
       </w:pPr>
       <w:r>
-        <w:t>5.4. Xem tr??c n?i dung</w:t>
+        <w:t>5.4. Xem trước nội dung</w:t>
       </w:r>
     </w:p>
     <w:p>
-      <w:pPr>
-        <w:spacing w:after="120"/>
-      </w:pPr>
       <w:r>
-        <w:t>H? th?ng t? ??ng t?o n?i dung ?i?n v?n xem tr??c t? d? li?u bi?u m?u. N?i dung ???c c?p nh?t khi thay ??i th?ng tin, t?a ??, khung gi?, th?ng tin ch? huy ho?c ng??i k?. Ng??i d?ng kh?ng ???c s?a tr?c ti?p ? xem tr??c.</w:t>
+        <w:t>Hệ thống tự động tạo nội dung xem trước khi dữ liệu biểu mẫu thay đổi. Người dùng không được sửa trực tiếp ô xem trước.</w:t>
       </w:r>
     </w:p>
     <w:p>
@@ -1485,7 +1416,7 @@
         <w:pStyle w:val="Heading2"/>
       </w:pPr>
       <w:r>
-        <w:t>5.5. L?u nh?p</w:t>
+        <w:t>5.5. Lưu nháp và gửi duyệt</w:t>
       </w:r>
     </w:p>
     <w:tbl>
@@ -1505,31 +1436,29 @@
         </w:trPr>
         <w:tc>
           <w:tcPr>
-            <w:tcW w:type="dxa" w:w="2268"/>
+            <w:tcW w:type="dxa" w:w="4844"/>
             <w:shd w:fill="D9EAF7"/>
-            <w:vAlign w:val="center"/>
           </w:tcPr>
           <w:p>
             <w:r>
               <w:rPr>
                 <w:b/>
               </w:rPr>
-              <w:t>M? y?u c?u</w:t>
+              <w:t>Mã</w:t>
             </w:r>
           </w:p>
         </w:tc>
         <w:tc>
           <w:tcPr>
-            <w:tcW w:type="dxa" w:w="7370"/>
+            <w:tcW w:type="dxa" w:w="4844"/>
             <w:shd w:fill="D9EAF7"/>
-            <w:vAlign w:val="center"/>
           </w:tcPr>
           <w:p>
             <w:r>
               <w:rPr>
                 <w:b/>
               </w:rPr>
-              <w:t>?i?u ki?n v? k?t qu?</w:t>
+              <w:t>Yêu cầu</w:t>
             </w:r>
           </w:p>
         </w:tc>
@@ -1537,7 +1466,7 @@
       <w:tr>
         <w:tc>
           <w:tcPr>
-            <w:tcW w:type="dxa" w:w="2268"/>
+            <w:tcW w:type="dxa" w:w="4844"/>
             <w:vAlign w:val="center"/>
           </w:tcPr>
           <w:p>
@@ -1548,12 +1477,36 @@
         </w:tc>
         <w:tc>
           <w:tcPr>
-            <w:tcW w:type="dxa" w:w="7370"/>
+            <w:tcW w:type="dxa" w:w="4844"/>
             <w:vAlign w:val="center"/>
           </w:tcPr>
           <w:p>
             <w:r>
-              <w:t>Ng??i d?ng c? R_Add khi t?o m?i ho?c R_Edit khi c?p nh?t; ?i?n v?n ? tr?ng th?i Nh?p/T? ch?i; c? ng?y, ti?u ??, ??a ?i?m; khung gi? h?p l?. L?u th?nh c?ng ? tr?ng th?i Nh?p.</w:t>
+              <w:t>Có R_Add khi tạo hoặc R_Edit khi sửa; trạng thái Nháp/Từ chối; có ngày, tiêu đề, địa điểm và khung giờ hợp lệ. Lưu thành công ở trạng thái Nháp.</w:t>
+            </w:r>
+          </w:p>
+        </w:tc>
+      </w:tr>
+      <w:tr>
+        <w:tc>
+          <w:tcPr>
+            <w:tcW w:type="dxa" w:w="4844"/>
+            <w:vAlign w:val="center"/>
+          </w:tcPr>
+          <w:p>
+            <w:r>
+              <w:t>FR-LF-02</w:t>
+            </w:r>
+          </w:p>
+        </w:tc>
+        <w:tc>
+          <w:tcPr>
+            <w:tcW w:type="dxa" w:w="4844"/>
+            <w:vAlign w:val="center"/>
+          </w:tcPr>
+          <w:p>
+            <w:r>
+              <w:t>Có R_Edit; điện văn đã lưu, không còn thay đổi chưa lưu và đang Nháp/Từ chối. Sau xác nhận, chuyển thành Chờ duyệt và khóa chỉnh sửa.</w:t>
             </w:r>
           </w:p>
         </w:tc>
@@ -1562,10 +1515,31 @@
     <w:p/>
     <w:p>
       <w:pPr>
+        <w:pStyle w:val="Heading1"/>
+      </w:pPr>
+      <w:r>
+        <w:t>6. Chức năng Approve Live Fire Message</w:t>
+      </w:r>
+    </w:p>
+    <w:p>
+      <w:pPr>
         <w:pStyle w:val="Heading2"/>
       </w:pPr>
       <w:r>
-        <w:t>5.6. G?i duy?t</w:t>
+        <w:t>6.1. Tra cứu và xem chi tiết</w:t>
+      </w:r>
+    </w:p>
+    <w:p>
+      <w:r>
+        <w:t>Cho phép tìm theo ngày, trạng thái Chờ duyệt/Đã duyệt/Đã export/Tất cả, từ khóa và số dòng. Trạng thái mặc định là Chờ duyệt. Chi tiết điện văn tại màn hình phê duyệt chỉ được xem, không được chỉnh sửa.</w:t>
+      </w:r>
+    </w:p>
+    <w:p>
+      <w:pPr>
+        <w:pStyle w:val="Heading2"/>
+      </w:pPr>
+      <w:r>
+        <w:t>6.2. Duyệt và từ chối</w:t>
       </w:r>
     </w:p>
     <w:tbl>
@@ -1585,31 +1559,29 @@
         </w:trPr>
         <w:tc>
           <w:tcPr>
-            <w:tcW w:type="dxa" w:w="2268"/>
+            <w:tcW w:type="dxa" w:w="4844"/>
             <w:shd w:fill="D9EAF7"/>
-            <w:vAlign w:val="center"/>
           </w:tcPr>
           <w:p>
             <w:r>
               <w:rPr>
                 <w:b/>
               </w:rPr>
-              <w:t>M? y?u c?u</w:t>
+              <w:t>Mã</w:t>
             </w:r>
           </w:p>
         </w:tc>
         <w:tc>
           <w:tcPr>
-            <w:tcW w:type="dxa" w:w="7370"/>
+            <w:tcW w:type="dxa" w:w="4844"/>
             <w:shd w:fill="D9EAF7"/>
-            <w:vAlign w:val="center"/>
           </w:tcPr>
           <w:p>
             <w:r>
               <w:rPr>
                 <w:b/>
               </w:rPr>
-              <w:t>?i?u ki?n v? k?t qu?</w:t>
+              <w:t>Yêu cầu</w:t>
             </w:r>
           </w:p>
         </w:tc>
@@ -1617,23 +1589,47 @@
       <w:tr>
         <w:tc>
           <w:tcPr>
-            <w:tcW w:type="dxa" w:w="2268"/>
+            <w:tcW w:type="dxa" w:w="4844"/>
             <w:vAlign w:val="center"/>
           </w:tcPr>
           <w:p>
             <w:r>
-              <w:t>FR-LF-02</w:t>
+              <w:t>FR-LF-03</w:t>
             </w:r>
           </w:p>
         </w:tc>
         <w:tc>
           <w:tcPr>
-            <w:tcW w:type="dxa" w:w="7370"/>
+            <w:tcW w:type="dxa" w:w="4844"/>
             <w:vAlign w:val="center"/>
           </w:tcPr>
           <w:p>
             <w:r>
-              <w:t>Ng??i d?ng c? R_Edit; ?i?n v?n ?? l?u; kh?ng c?n thay ??i ch?a l?u; tr?ng th?i Nh?p/T? ch?i. Sau x?c nh?n, tr?ng th?i chuy?n th?nh Ch? duy?t v? n?i dung kh?ng c?n ???c s?a.</w:t>
+              <w:t>Chỉ người có R_Pub được duyệt điện văn Chờ duyệt. Sau xác nhận, chuyển thành Đã duyệt; ghi nhận người, thời điểm và nội dung duyệt; khóa chỉnh sửa.</w:t>
+            </w:r>
+          </w:p>
+        </w:tc>
+      </w:tr>
+      <w:tr>
+        <w:tc>
+          <w:tcPr>
+            <w:tcW w:type="dxa" w:w="4844"/>
+            <w:vAlign w:val="center"/>
+          </w:tcPr>
+          <w:p>
+            <w:r>
+              <w:t>FR-LF-04</w:t>
+            </w:r>
+          </w:p>
+        </w:tc>
+        <w:tc>
+          <w:tcPr>
+            <w:tcW w:type="dxa" w:w="4844"/>
+            <w:vAlign w:val="center"/>
+          </w:tcPr>
+          <w:p>
+            <w:r>
+              <w:t>Chỉ người có R_Pub được từ chối điện văn Chờ duyệt. Lý do là bắt buộc. Điện văn chuyển thành Từ chối để chỉnh sửa và gửi lại.</w:t>
             </w:r>
           </w:p>
         </w:tc>
@@ -1645,15 +1641,7 @@
         <w:pStyle w:val="Heading1"/>
       </w:pPr>
       <w:r>
-        <w:t>6. Ch?c n?ng Approve Live Fire Message</w:t>
-      </w:r>
-    </w:p>
-    <w:p>
-      <w:pPr>
-        <w:pStyle w:val="Heading2"/>
-      </w:pPr>
-      <w:r>
-        <w:t>6.1. Th?ng tin ch?c n?ng</w:t>
+        <w:t>7. Quy tắc nghiệp vụ</w:t>
       </w:r>
     </w:p>
     <w:tbl>
@@ -1673,31 +1661,29 @@
         </w:trPr>
         <w:tc>
           <w:tcPr>
-            <w:tcW w:type="dxa" w:w="2835"/>
+            <w:tcW w:type="dxa" w:w="4844"/>
             <w:shd w:fill="D9EAF7"/>
-            <w:vAlign w:val="center"/>
           </w:tcPr>
           <w:p>
             <w:r>
               <w:rPr>
                 <w:b/>
               </w:rPr>
-              <w:t>N?i dung</w:t>
+              <w:t>Mã</w:t>
             </w:r>
           </w:p>
         </w:tc>
         <w:tc>
           <w:tcPr>
-            <w:tcW w:type="dxa" w:w="6803"/>
+            <w:tcW w:type="dxa" w:w="4844"/>
             <w:shd w:fill="D9EAF7"/>
-            <w:vAlign w:val="center"/>
           </w:tcPr>
           <w:p>
             <w:r>
               <w:rPr>
                 <w:b/>
               </w:rPr>
-              <w:t>M? t?</w:t>
+              <w:t>Quy tắc</w:t>
             </w:r>
           </w:p>
         </w:tc>
@@ -1705,23 +1691,23 @@
       <w:tr>
         <w:tc>
           <w:tcPr>
-            <w:tcW w:type="dxa" w:w="2835"/>
+            <w:tcW w:type="dxa" w:w="4844"/>
             <w:vAlign w:val="center"/>
           </w:tcPr>
           <w:p>
             <w:r>
-              <w:t>M? ch?c n?ng</w:t>
+              <w:t>BR-LF-01</w:t>
             </w:r>
           </w:p>
         </w:tc>
         <w:tc>
           <w:tcPr>
-            <w:tcW w:type="dxa" w:w="6803"/>
+            <w:tcW w:type="dxa" w:w="4844"/>
             <w:vAlign w:val="center"/>
           </w:tcPr>
           <w:p>
             <w:r>
-              <w:t>LF-APPROVE</w:t>
+              <w:t>Chỉ điện văn Nháp hoặc Từ chối mới được chỉnh sửa.</w:t>
             </w:r>
           </w:p>
         </w:tc>
@@ -1729,23 +1715,23 @@
       <w:tr>
         <w:tc>
           <w:tcPr>
-            <w:tcW w:type="dxa" w:w="2835"/>
+            <w:tcW w:type="dxa" w:w="4844"/>
             <w:vAlign w:val="center"/>
           </w:tcPr>
           <w:p>
             <w:r>
-              <w:t>???ng d?n</w:t>
+              <w:t>BR-LF-02</w:t>
             </w:r>
           </w:p>
         </w:tc>
         <w:tc>
           <w:tcPr>
-            <w:tcW w:type="dxa" w:w="6803"/>
+            <w:tcW w:type="dxa" w:w="4844"/>
             <w:vAlign w:val="center"/>
           </w:tcPr>
           <w:p>
             <w:r>
-              <w:t>/MessManagement/LiveFireMessageAccepted.aspx?Menu_ID=990</w:t>
+              <w:t>Phải lưu các thay đổi trước khi gửi duyệt.</w:t>
             </w:r>
           </w:p>
         </w:tc>
@@ -1753,23 +1739,23 @@
       <w:tr>
         <w:tc>
           <w:tcPr>
-            <w:tcW w:type="dxa" w:w="2835"/>
+            <w:tcW w:type="dxa" w:w="4844"/>
             <w:vAlign w:val="center"/>
           </w:tcPr>
           <w:p>
             <w:r>
-              <w:t>T?c nh?n</w:t>
+              <w:t>BR-LF-03</w:t>
             </w:r>
           </w:p>
         </w:tc>
         <w:tc>
           <w:tcPr>
-            <w:tcW w:type="dxa" w:w="6803"/>
+            <w:tcW w:type="dxa" w:w="4844"/>
             <w:vAlign w:val="center"/>
           </w:tcPr>
           <w:p>
             <w:r>
-              <w:t>Ng??i ph? duy?t</w:t>
+              <w:t>Chỉ điện văn Chờ duyệt mới được duyệt hoặc từ chối.</w:t>
             </w:r>
           </w:p>
         </w:tc>
@@ -1777,23 +1763,23 @@
       <w:tr>
         <w:tc>
           <w:tcPr>
-            <w:tcW w:type="dxa" w:w="2835"/>
+            <w:tcW w:type="dxa" w:w="4844"/>
             <w:vAlign w:val="center"/>
           </w:tcPr>
           <w:p>
             <w:r>
-              <w:t>Ti?n ?i?u ki?n</w:t>
+              <w:t>BR-LF-04</w:t>
             </w:r>
           </w:p>
         </w:tc>
         <w:tc>
           <w:tcPr>
-            <w:tcW w:type="dxa" w:w="6803"/>
+            <w:tcW w:type="dxa" w:w="4844"/>
             <w:vAlign w:val="center"/>
           </w:tcPr>
           <w:p>
             <w:r>
-              <w:t>?? ??ng nh?p v? c? quy?n ph? duy?t</w:t>
+              <w:t>Từ chối điện văn bắt buộc phải có lý do.</w:t>
             </w:r>
           </w:p>
         </w:tc>
@@ -1801,23 +1787,143 @@
       <w:tr>
         <w:tc>
           <w:tcPr>
-            <w:tcW w:type="dxa" w:w="2835"/>
+            <w:tcW w:type="dxa" w:w="4844"/>
             <w:vAlign w:val="center"/>
           </w:tcPr>
           <w:p>
             <w:r>
-              <w:t>K?t qu?</w:t>
+              <w:t>BR-LF-05</w:t>
             </w:r>
           </w:p>
         </w:tc>
         <w:tc>
           <w:tcPr>
-            <w:tcW w:type="dxa" w:w="6803"/>
+            <w:tcW w:type="dxa" w:w="4844"/>
             <w:vAlign w:val="center"/>
           </w:tcPr>
           <w:p>
             <w:r>
-              <w:t>?i?n v?n ???c duy?t ho?c b? t? ch?i</w:t>
+              <w:t>Điện văn Đã duyệt không được sửa nội dung.</w:t>
+            </w:r>
+          </w:p>
+        </w:tc>
+      </w:tr>
+      <w:tr>
+        <w:tc>
+          <w:tcPr>
+            <w:tcW w:type="dxa" w:w="4844"/>
+            <w:vAlign w:val="center"/>
+          </w:tcPr>
+          <w:p>
+            <w:r>
+              <w:t>BR-LF-06</w:t>
+            </w:r>
+          </w:p>
+        </w:tc>
+        <w:tc>
+          <w:tcPr>
+            <w:tcW w:type="dxa" w:w="4844"/>
+            <w:vAlign w:val="center"/>
+          </w:tcPr>
+          <w:p>
+            <w:r>
+              <w:t>Mọi thao tác phải kiểm tra quyền ở phía máy chủ.</w:t>
+            </w:r>
+          </w:p>
+        </w:tc>
+      </w:tr>
+      <w:tr>
+        <w:tc>
+          <w:tcPr>
+            <w:tcW w:type="dxa" w:w="4844"/>
+            <w:vAlign w:val="center"/>
+          </w:tcPr>
+          <w:p>
+            <w:r>
+              <w:t>BR-LF-07</w:t>
+            </w:r>
+          </w:p>
+        </w:tc>
+        <w:tc>
+          <w:tcPr>
+            <w:tcW w:type="dxa" w:w="4844"/>
+            <w:vAlign w:val="center"/>
+          </w:tcPr>
+          <w:p>
+            <w:r>
+              <w:t>Phải kiểm tra VERSION_NO trước khi cập nhật hoặc đổi trạng thái.</w:t>
+            </w:r>
+          </w:p>
+        </w:tc>
+      </w:tr>
+      <w:tr>
+        <w:tc>
+          <w:tcPr>
+            <w:tcW w:type="dxa" w:w="4844"/>
+            <w:vAlign w:val="center"/>
+          </w:tcPr>
+          <w:p>
+            <w:r>
+              <w:t>BR-LF-08</w:t>
+            </w:r>
+          </w:p>
+        </w:tc>
+        <w:tc>
+          <w:tcPr>
+            <w:tcW w:type="dxa" w:w="4844"/>
+            <w:vAlign w:val="center"/>
+          </w:tcPr>
+          <w:p>
+            <w:r>
+              <w:t>Nếu dữ liệu đã thay đổi, từ chối thao tác trên phiên bản cũ và yêu cầu tải lại.</w:t>
+            </w:r>
+          </w:p>
+        </w:tc>
+      </w:tr>
+      <w:tr>
+        <w:tc>
+          <w:tcPr>
+            <w:tcW w:type="dxa" w:w="4844"/>
+            <w:vAlign w:val="center"/>
+          </w:tcPr>
+          <w:p>
+            <w:r>
+              <w:t>BR-LF-09</w:t>
+            </w:r>
+          </w:p>
+        </w:tc>
+        <w:tc>
+          <w:tcPr>
+            <w:tcW w:type="dxa" w:w="4844"/>
+            <w:vAlign w:val="center"/>
+          </w:tcPr>
+          <w:p>
+            <w:r>
+              <w:t>Từ ngày tìm kiếm không được lớn hơn Đến ngày.</w:t>
+            </w:r>
+          </w:p>
+        </w:tc>
+      </w:tr>
+      <w:tr>
+        <w:tc>
+          <w:tcPr>
+            <w:tcW w:type="dxa" w:w="4844"/>
+            <w:vAlign w:val="center"/>
+          </w:tcPr>
+          <w:p>
+            <w:r>
+              <w:t>BR-LF-10</w:t>
+            </w:r>
+          </w:p>
+        </w:tc>
+        <w:tc>
+          <w:tcPr>
+            <w:tcW w:type="dxa" w:w="4844"/>
+            <w:vAlign w:val="center"/>
+          </w:tcPr>
+          <w:p>
+            <w:r>
+              <w:t>Giờ bắn đúng HH:mm và giờ bắt đầu nhỏ hơn giờ kết thúc.</w:t>
             </w:r>
           </w:p>
         </w:tc>
@@ -1826,34 +1932,10 @@
     <w:p/>
     <w:p>
       <w:pPr>
-        <w:pStyle w:val="Heading2"/>
+        <w:pStyle w:val="Heading1"/>
       </w:pPr>
       <w:r>
-        <w:t>6.2. Tra c?u v? xem chi ti?t</w:t>
-      </w:r>
-    </w:p>
-    <w:p>
-      <w:pPr>
-        <w:spacing w:after="120"/>
-      </w:pPr>
-      <w:r>
-        <w:t>Cho ph?p t?m ki?m theo ng?y, tr?ng th?i Ch? duy?t/?? duy?t/?? export/T?t c?, t? kh?a v? s? d?ng m?i trang. Tr?ng th?i m?c ??nh l? Ch? duy?t.</w:t>
-      </w:r>
-    </w:p>
-    <w:p>
-      <w:pPr>
-        <w:spacing w:after="120"/>
-      </w:pPr>
-      <w:r>
-        <w:t>Chi ti?t g?m th?ng tin ?i?n v?n, t?a ??, th?ng s? b?n, th?i gian b?n, ng??i t?o, ng??i g?i duy?t, ng??i duy?t, ng??i export, n?i dung ho?n ch?nh v? l? do t? ch?i. D? li?u t?i m?n h?nh ph? duy?t ch? ??c.</w:t>
-      </w:r>
-    </w:p>
-    <w:p>
-      <w:pPr>
-        <w:pStyle w:val="Heading2"/>
-      </w:pPr>
-      <w:r>
-        <w:t>6.3. Duy?t ?i?n v?n</w:t>
+        <w:t>8. Yêu cầu phi chức năng</w:t>
       </w:r>
     </w:p>
     <w:tbl>
@@ -1873,31 +1955,29 @@
         </w:trPr>
         <w:tc>
           <w:tcPr>
-            <w:tcW w:type="dxa" w:w="2268"/>
+            <w:tcW w:type="dxa" w:w="4844"/>
             <w:shd w:fill="D9EAF7"/>
-            <w:vAlign w:val="center"/>
           </w:tcPr>
           <w:p>
             <w:r>
               <w:rPr>
                 <w:b/>
               </w:rPr>
-              <w:t>M? y?u c?u</w:t>
+              <w:t>Mã</w:t>
             </w:r>
           </w:p>
         </w:tc>
         <w:tc>
           <w:tcPr>
-            <w:tcW w:type="dxa" w:w="7370"/>
+            <w:tcW w:type="dxa" w:w="4844"/>
             <w:shd w:fill="D9EAF7"/>
-            <w:vAlign w:val="center"/>
           </w:tcPr>
           <w:p>
             <w:r>
               <w:rPr>
                 <w:b/>
               </w:rPr>
-              <w:t>?i?u ki?n v? k?t qu?</w:t>
+              <w:t>Yêu cầu</w:t>
             </w:r>
           </w:p>
         </w:tc>
@@ -1905,79 +1985,23 @@
       <w:tr>
         <w:tc>
           <w:tcPr>
-            <w:tcW w:type="dxa" w:w="2268"/>
+            <w:tcW w:type="dxa" w:w="4844"/>
             <w:vAlign w:val="center"/>
           </w:tcPr>
           <w:p>
             <w:r>
-              <w:t>FR-LF-03</w:t>
+              <w:t>NFR-LF-01</w:t>
             </w:r>
           </w:p>
         </w:tc>
         <w:tc>
           <w:tcPr>
-            <w:tcW w:type="dxa" w:w="7370"/>
+            <w:tcW w:type="dxa" w:w="4844"/>
             <w:vAlign w:val="center"/>
           </w:tcPr>
           <w:p>
             <w:r>
-              <w:t>Ch? ng??i c? R_Pub v? ?i?n v?n ? tr?ng th?i Ch? duy?t ???c thao t?c. Sau khi x?c nh?n, tr?ng th?i chuy?n th?nh ?? duy?t; ghi nh?n ng??i duy?t, th?i ?i?m v? n?i dung ???c duy?t; n?i dung b? kh?a ch?nh s?a.</w:t>
-            </w:r>
-          </w:p>
-        </w:tc>
-      </w:tr>
-    </w:tbl>
-    <w:p/>
-    <w:p>
-      <w:pPr>
-        <w:pStyle w:val="Heading2"/>
-      </w:pPr>
-      <w:r>
-        <w:t>6.4. T? ch?i ?i?n v?n</w:t>
-      </w:r>
-    </w:p>
-    <w:tbl>
-      <w:tblPr>
-        <w:tblStyle w:val="TableGrid"/>
-        <w:tblW w:type="auto" w:w="0"/>
-        <w:jc w:val="center"/>
-        <w:tblLook w:firstColumn="1" w:firstRow="1" w:lastColumn="0" w:lastRow="0" w:noHBand="0" w:noVBand="1" w:val="04A0"/>
-      </w:tblPr>
-      <w:tblGrid>
-        <w:gridCol w:w="4844"/>
-        <w:gridCol w:w="4844"/>
-      </w:tblGrid>
-      <w:tr>
-        <w:trPr>
-          <w:tblHeader w:val="true"/>
-        </w:trPr>
-        <w:tc>
-          <w:tcPr>
-            <w:tcW w:type="dxa" w:w="2268"/>
-            <w:shd w:fill="D9EAF7"/>
-            <w:vAlign w:val="center"/>
-          </w:tcPr>
-          <w:p>
-            <w:r>
-              <w:rPr>
-                <w:b/>
-              </w:rPr>
-              <w:t>M? y?u c?u</w:t>
-            </w:r>
-          </w:p>
-        </w:tc>
-        <w:tc>
-          <w:tcPr>
-            <w:tcW w:type="dxa" w:w="7370"/>
-            <w:shd w:fill="D9EAF7"/>
-            <w:vAlign w:val="center"/>
-          </w:tcPr>
-          <w:p>
-            <w:r>
-              <w:rPr>
-                <w:b/>
-              </w:rPr>
-              <w:t>?i?u ki?n v? k?t qu?</w:t>
+              <w:t>Kiểm tra đăng nhập và phân quyền khi thay đổi dữ liệu.</w:t>
             </w:r>
           </w:p>
         </w:tc>
@@ -1985,23 +2009,143 @@
       <w:tr>
         <w:tc>
           <w:tcPr>
-            <w:tcW w:type="dxa" w:w="2268"/>
+            <w:tcW w:type="dxa" w:w="4844"/>
             <w:vAlign w:val="center"/>
           </w:tcPr>
           <w:p>
             <w:r>
-              <w:t>FR-LF-04</w:t>
+              <w:t>NFR-LF-02</w:t>
             </w:r>
           </w:p>
         </w:tc>
         <w:tc>
           <w:tcPr>
-            <w:tcW w:type="dxa" w:w="7370"/>
+            <w:tcW w:type="dxa" w:w="4844"/>
             <w:vAlign w:val="center"/>
           </w:tcPr>
           <w:p>
             <w:r>
-              <w:t>Ch? ng??i c? R_Pub v? ?i?n v?n ? tr?ng th?i Ch? duy?t ???c thao t?c. L? do t? ch?i l? b?t bu?c. Sau khi x?c nh?n, tr?ng th?i chuy?n th?nh T? ch?i ?? ng??i nh?p ch?nh s?a v? g?i duy?t l?i.</w:t>
+              <w:t>Mã hóa dữ liệu hiển thị để hạn chế chèn HTML hoặc script.</w:t>
+            </w:r>
+          </w:p>
+        </w:tc>
+      </w:tr>
+      <w:tr>
+        <w:tc>
+          <w:tcPr>
+            <w:tcW w:type="dxa" w:w="4844"/>
+            <w:vAlign w:val="center"/>
+          </w:tcPr>
+          <w:p>
+            <w:r>
+              <w:t>NFR-LF-03</w:t>
+            </w:r>
+          </w:p>
+        </w:tc>
+        <w:tc>
+          <w:tcPr>
+            <w:tcW w:type="dxa" w:w="4844"/>
+            <w:vAlign w:val="center"/>
+          </w:tcPr>
+          <w:p>
+            <w:r>
+              <w:t>Ghi người thực hiện và thời điểm khi đổi trạng thái.</w:t>
+            </w:r>
+          </w:p>
+        </w:tc>
+      </w:tr>
+      <w:tr>
+        <w:tc>
+          <w:tcPr>
+            <w:tcW w:type="dxa" w:w="4844"/>
+            <w:vAlign w:val="center"/>
+          </w:tcPr>
+          <w:p>
+            <w:r>
+              <w:t>NFR-LF-04</w:t>
+            </w:r>
+          </w:p>
+        </w:tc>
+        <w:tc>
+          <w:tcPr>
+            <w:tcW w:type="dxa" w:w="4844"/>
+            <w:vAlign w:val="center"/>
+          </w:tcPr>
+          <w:p>
+            <w:r>
+              <w:t>Khi API hoặc Oracle lỗi, thông báo thất bại và không làm sai trạng thái.</w:t>
+            </w:r>
+          </w:p>
+        </w:tc>
+      </w:tr>
+      <w:tr>
+        <w:tc>
+          <w:tcPr>
+            <w:tcW w:type="dxa" w:w="4844"/>
+            <w:vAlign w:val="center"/>
+          </w:tcPr>
+          <w:p>
+            <w:r>
+              <w:t>NFR-LF-05</w:t>
+            </w:r>
+          </w:p>
+        </w:tc>
+        <w:tc>
+          <w:tcPr>
+            <w:tcW w:type="dxa" w:w="4844"/>
+            <w:vAlign w:val="center"/>
+          </w:tcPr>
+          <w:p>
+            <w:r>
+              <w:t>Danh sách hỗ trợ phân trang.</w:t>
+            </w:r>
+          </w:p>
+        </w:tc>
+      </w:tr>
+      <w:tr>
+        <w:tc>
+          <w:tcPr>
+            <w:tcW w:type="dxa" w:w="4844"/>
+            <w:vAlign w:val="center"/>
+          </w:tcPr>
+          <w:p>
+            <w:r>
+              <w:t>NFR-LF-06</w:t>
+            </w:r>
+          </w:p>
+        </w:tc>
+        <w:tc>
+          <w:tcPr>
+            <w:tcW w:type="dxa" w:w="4844"/>
+            <w:vAlign w:val="center"/>
+          </w:tcPr>
+          <w:p>
+            <w:r>
+              <w:t>Giữ nguyên nội dung đã duyệt để đối chiếu và kiểm tra.</w:t>
+            </w:r>
+          </w:p>
+        </w:tc>
+      </w:tr>
+      <w:tr>
+        <w:tc>
+          <w:tcPr>
+            <w:tcW w:type="dxa" w:w="4844"/>
+            <w:vAlign w:val="center"/>
+          </w:tcPr>
+          <w:p>
+            <w:r>
+              <w:t>NFR-LF-07</w:t>
+            </w:r>
+          </w:p>
+        </w:tc>
+        <w:tc>
+          <w:tcPr>
+            <w:tcW w:type="dxa" w:w="4844"/>
+            <w:vAlign w:val="center"/>
+          </w:tcPr>
+          <w:p>
+            <w:r>
+              <w:t>Phát hiện xung đột phiên bản khi nhiều người cùng xử lý.</w:t>
             </w:r>
           </w:p>
         </w:tc>
@@ -2013,527 +2157,7 @@
         <w:pStyle w:val="Heading1"/>
       </w:pPr>
       <w:r>
-        <w:t>7. Quy t?c nghi?p v?</w:t>
-      </w:r>
-    </w:p>
-    <w:tbl>
-      <w:tblPr>
-        <w:tblStyle w:val="TableGrid"/>
-        <w:tblW w:type="auto" w:w="0"/>
-        <w:jc w:val="center"/>
-        <w:tblLook w:firstColumn="1" w:firstRow="1" w:lastColumn="0" w:lastRow="0" w:noHBand="0" w:noVBand="1" w:val="04A0"/>
-      </w:tblPr>
-      <w:tblGrid>
-        <w:gridCol w:w="4844"/>
-        <w:gridCol w:w="4844"/>
-      </w:tblGrid>
-      <w:tr>
-        <w:trPr>
-          <w:tblHeader w:val="true"/>
-        </w:trPr>
-        <w:tc>
-          <w:tcPr>
-            <w:tcW w:type="dxa" w:w="1701"/>
-            <w:shd w:fill="D9EAF7"/>
-            <w:vAlign w:val="center"/>
-          </w:tcPr>
-          <w:p>
-            <w:r>
-              <w:rPr>
-                <w:b/>
-              </w:rPr>
-              <w:t>M?</w:t>
-            </w:r>
-          </w:p>
-        </w:tc>
-        <w:tc>
-          <w:tcPr>
-            <w:tcW w:type="dxa" w:w="7937"/>
-            <w:shd w:fill="D9EAF7"/>
-            <w:vAlign w:val="center"/>
-          </w:tcPr>
-          <w:p>
-            <w:r>
-              <w:rPr>
-                <w:b/>
-              </w:rPr>
-              <w:t>Quy t?c</w:t>
-            </w:r>
-          </w:p>
-        </w:tc>
-      </w:tr>
-      <w:tr>
-        <w:tc>
-          <w:tcPr>
-            <w:tcW w:type="dxa" w:w="1701"/>
-            <w:vAlign w:val="center"/>
-          </w:tcPr>
-          <w:p>
-            <w:r>
-              <w:t>BR-LF-01</w:t>
-            </w:r>
-          </w:p>
-        </w:tc>
-        <w:tc>
-          <w:tcPr>
-            <w:tcW w:type="dxa" w:w="7937"/>
-            <w:vAlign w:val="center"/>
-          </w:tcPr>
-          <w:p>
-            <w:r>
-              <w:t>Ch? ?i?n v?n Nh?p ho?c T? ch?i m?i ???c ch?nh s?a.</w:t>
-            </w:r>
-          </w:p>
-        </w:tc>
-      </w:tr>
-      <w:tr>
-        <w:tc>
-          <w:tcPr>
-            <w:tcW w:type="dxa" w:w="1701"/>
-            <w:vAlign w:val="center"/>
-          </w:tcPr>
-          <w:p>
-            <w:r>
-              <w:t>BR-LF-02</w:t>
-            </w:r>
-          </w:p>
-        </w:tc>
-        <w:tc>
-          <w:tcPr>
-            <w:tcW w:type="dxa" w:w="7937"/>
-            <w:vAlign w:val="center"/>
-          </w:tcPr>
-          <w:p>
-            <w:r>
-              <w:t>Ph?i l?u c?c thay ??i tr??c khi g?i duy?t.</w:t>
-            </w:r>
-          </w:p>
-        </w:tc>
-      </w:tr>
-      <w:tr>
-        <w:tc>
-          <w:tcPr>
-            <w:tcW w:type="dxa" w:w="1701"/>
-            <w:vAlign w:val="center"/>
-          </w:tcPr>
-          <w:p>
-            <w:r>
-              <w:t>BR-LF-03</w:t>
-            </w:r>
-          </w:p>
-        </w:tc>
-        <w:tc>
-          <w:tcPr>
-            <w:tcW w:type="dxa" w:w="7937"/>
-            <w:vAlign w:val="center"/>
-          </w:tcPr>
-          <w:p>
-            <w:r>
-              <w:t>Ch? ?i?n v?n Ch? duy?t m?i ???c duy?t ho?c t? ch?i.</w:t>
-            </w:r>
-          </w:p>
-        </w:tc>
-      </w:tr>
-      <w:tr>
-        <w:tc>
-          <w:tcPr>
-            <w:tcW w:type="dxa" w:w="1701"/>
-            <w:vAlign w:val="center"/>
-          </w:tcPr>
-          <w:p>
-            <w:r>
-              <w:t>BR-LF-04</w:t>
-            </w:r>
-          </w:p>
-        </w:tc>
-        <w:tc>
-          <w:tcPr>
-            <w:tcW w:type="dxa" w:w="7937"/>
-            <w:vAlign w:val="center"/>
-          </w:tcPr>
-          <w:p>
-            <w:r>
-              <w:t>T? ch?i ?i?n v?n b?t bu?c ph?i c? l? do.</w:t>
-            </w:r>
-          </w:p>
-        </w:tc>
-      </w:tr>
-      <w:tr>
-        <w:tc>
-          <w:tcPr>
-            <w:tcW w:type="dxa" w:w="1701"/>
-            <w:vAlign w:val="center"/>
-          </w:tcPr>
-          <w:p>
-            <w:r>
-              <w:t>BR-LF-05</w:t>
-            </w:r>
-          </w:p>
-        </w:tc>
-        <w:tc>
-          <w:tcPr>
-            <w:tcW w:type="dxa" w:w="7937"/>
-            <w:vAlign w:val="center"/>
-          </w:tcPr>
-          <w:p>
-            <w:r>
-              <w:t>?i?n v?n ?? duy?t kh?ng ???c s?a n?i dung.</w:t>
-            </w:r>
-          </w:p>
-        </w:tc>
-      </w:tr>
-      <w:tr>
-        <w:tc>
-          <w:tcPr>
-            <w:tcW w:type="dxa" w:w="1701"/>
-            <w:vAlign w:val="center"/>
-          </w:tcPr>
-          <w:p>
-            <w:r>
-              <w:t>BR-LF-06</w:t>
-            </w:r>
-          </w:p>
-        </w:tc>
-        <w:tc>
-          <w:tcPr>
-            <w:tcW w:type="dxa" w:w="7937"/>
-            <w:vAlign w:val="center"/>
-          </w:tcPr>
-          <w:p>
-            <w:r>
-              <w:t>M?i thao t?c ph?i ki?m tra quy?n ? ph?a m?y ch?.</w:t>
-            </w:r>
-          </w:p>
-        </w:tc>
-      </w:tr>
-      <w:tr>
-        <w:tc>
-          <w:tcPr>
-            <w:tcW w:type="dxa" w:w="1701"/>
-            <w:vAlign w:val="center"/>
-          </w:tcPr>
-          <w:p>
-            <w:r>
-              <w:t>BR-LF-07</w:t>
-            </w:r>
-          </w:p>
-        </w:tc>
-        <w:tc>
-          <w:tcPr>
-            <w:tcW w:type="dxa" w:w="7937"/>
-            <w:vAlign w:val="center"/>
-          </w:tcPr>
-          <w:p>
-            <w:r>
-              <w:t>Ph?i ki?m tra VERSION_NO tr??c khi c?p nh?t ho?c ??i tr?ng th?i.</w:t>
-            </w:r>
-          </w:p>
-        </w:tc>
-      </w:tr>
-      <w:tr>
-        <w:tc>
-          <w:tcPr>
-            <w:tcW w:type="dxa" w:w="1701"/>
-            <w:vAlign w:val="center"/>
-          </w:tcPr>
-          <w:p>
-            <w:r>
-              <w:t>BR-LF-08</w:t>
-            </w:r>
-          </w:p>
-        </w:tc>
-        <w:tc>
-          <w:tcPr>
-            <w:tcW w:type="dxa" w:w="7937"/>
-            <w:vAlign w:val="center"/>
-          </w:tcPr>
-          <w:p>
-            <w:r>
-              <w:t>N?u d? li?u ?? b? ng??i kh?c c?p nh?t, h? th?ng t? ch?i thao t?c v? y?u c?u t?i l?i.</w:t>
-            </w:r>
-          </w:p>
-        </w:tc>
-      </w:tr>
-      <w:tr>
-        <w:tc>
-          <w:tcPr>
-            <w:tcW w:type="dxa" w:w="1701"/>
-            <w:vAlign w:val="center"/>
-          </w:tcPr>
-          <w:p>
-            <w:r>
-              <w:t>BR-LF-09</w:t>
-            </w:r>
-          </w:p>
-        </w:tc>
-        <w:tc>
-          <w:tcPr>
-            <w:tcW w:type="dxa" w:w="7937"/>
-            <w:vAlign w:val="center"/>
-          </w:tcPr>
-          <w:p>
-            <w:r>
-              <w:t>T? ng?y t?m ki?m kh?ng ???c l?n h?n ??n ng?y.</w:t>
-            </w:r>
-          </w:p>
-        </w:tc>
-      </w:tr>
-      <w:tr>
-        <w:tc>
-          <w:tcPr>
-            <w:tcW w:type="dxa" w:w="1701"/>
-            <w:vAlign w:val="center"/>
-          </w:tcPr>
-          <w:p>
-            <w:r>
-              <w:t>BR-LF-10</w:t>
-            </w:r>
-          </w:p>
-        </w:tc>
-        <w:tc>
-          <w:tcPr>
-            <w:tcW w:type="dxa" w:w="7937"/>
-            <w:vAlign w:val="center"/>
-          </w:tcPr>
-          <w:p>
-            <w:r>
-              <w:t>Gi? b?n ph?i ??ng HH:mm v? gi? b?t ??u nh? h?n gi? k?t th?c.</w:t>
-            </w:r>
-          </w:p>
-        </w:tc>
-      </w:tr>
-    </w:tbl>
-    <w:p/>
-    <w:p>
-      <w:pPr>
-        <w:pStyle w:val="Heading1"/>
-      </w:pPr>
-      <w:r>
-        <w:t>8. Y?u c?u phi ch?c n?ng</w:t>
-      </w:r>
-    </w:p>
-    <w:tbl>
-      <w:tblPr>
-        <w:tblStyle w:val="TableGrid"/>
-        <w:tblW w:type="auto" w:w="0"/>
-        <w:jc w:val="center"/>
-        <w:tblLook w:firstColumn="1" w:firstRow="1" w:lastColumn="0" w:lastRow="0" w:noHBand="0" w:noVBand="1" w:val="04A0"/>
-      </w:tblPr>
-      <w:tblGrid>
-        <w:gridCol w:w="4844"/>
-        <w:gridCol w:w="4844"/>
-      </w:tblGrid>
-      <w:tr>
-        <w:trPr>
-          <w:tblHeader w:val="true"/>
-        </w:trPr>
-        <w:tc>
-          <w:tcPr>
-            <w:tcW w:type="dxa" w:w="1701"/>
-            <w:shd w:fill="D9EAF7"/>
-            <w:vAlign w:val="center"/>
-          </w:tcPr>
-          <w:p>
-            <w:r>
-              <w:rPr>
-                <w:b/>
-              </w:rPr>
-              <w:t>M?</w:t>
-            </w:r>
-          </w:p>
-        </w:tc>
-        <w:tc>
-          <w:tcPr>
-            <w:tcW w:type="dxa" w:w="7937"/>
-            <w:shd w:fill="D9EAF7"/>
-            <w:vAlign w:val="center"/>
-          </w:tcPr>
-          <w:p>
-            <w:r>
-              <w:rPr>
-                <w:b/>
-              </w:rPr>
-              <w:t>Y?u c?u</w:t>
-            </w:r>
-          </w:p>
-        </w:tc>
-      </w:tr>
-      <w:tr>
-        <w:tc>
-          <w:tcPr>
-            <w:tcW w:type="dxa" w:w="1701"/>
-            <w:vAlign w:val="center"/>
-          </w:tcPr>
-          <w:p>
-            <w:r>
-              <w:t>NFR-LF-01</w:t>
-            </w:r>
-          </w:p>
-        </w:tc>
-        <w:tc>
-          <w:tcPr>
-            <w:tcW w:type="dxa" w:w="7937"/>
-            <w:vAlign w:val="center"/>
-          </w:tcPr>
-          <w:p>
-            <w:r>
-              <w:t>Ki?m tra ??ng nh?p v? ph?n quy?n ??i v?i m?i thao t?c thay ??i d? li?u.</w:t>
-            </w:r>
-          </w:p>
-        </w:tc>
-      </w:tr>
-      <w:tr>
-        <w:tc>
-          <w:tcPr>
-            <w:tcW w:type="dxa" w:w="1701"/>
-            <w:vAlign w:val="center"/>
-          </w:tcPr>
-          <w:p>
-            <w:r>
-              <w:t>NFR-LF-02</w:t>
-            </w:r>
-          </w:p>
-        </w:tc>
-        <w:tc>
-          <w:tcPr>
-            <w:tcW w:type="dxa" w:w="7937"/>
-            <w:vAlign w:val="center"/>
-          </w:tcPr>
-          <w:p>
-            <w:r>
-              <w:t>M? h?a an to?n d? li?u hi?n th? ?? h?n ch? ch?n HTML/script.</w:t>
-            </w:r>
-          </w:p>
-        </w:tc>
-      </w:tr>
-      <w:tr>
-        <w:tc>
-          <w:tcPr>
-            <w:tcW w:type="dxa" w:w="1701"/>
-            <w:vAlign w:val="center"/>
-          </w:tcPr>
-          <w:p>
-            <w:r>
-              <w:t>NFR-LF-03</w:t>
-            </w:r>
-          </w:p>
-        </w:tc>
-        <w:tc>
-          <w:tcPr>
-            <w:tcW w:type="dxa" w:w="7937"/>
-            <w:vAlign w:val="center"/>
-          </w:tcPr>
-          <w:p>
-            <w:r>
-              <w:t>Ghi nh?n ng??i th?c hi?n v? th?i ?i?m ??i v?i thao t?c thay ??i tr?ng th?i.</w:t>
-            </w:r>
-          </w:p>
-        </w:tc>
-      </w:tr>
-      <w:tr>
-        <w:tc>
-          <w:tcPr>
-            <w:tcW w:type="dxa" w:w="1701"/>
-            <w:vAlign w:val="center"/>
-          </w:tcPr>
-          <w:p>
-            <w:r>
-              <w:t>NFR-LF-04</w:t>
-            </w:r>
-          </w:p>
-        </w:tc>
-        <w:tc>
-          <w:tcPr>
-            <w:tcW w:type="dxa" w:w="7937"/>
-            <w:vAlign w:val="center"/>
-          </w:tcPr>
-          <w:p>
-            <w:r>
-              <w:t>Khi API/Oracle l?i, th?ng b?o th?t b?i v? kh?ng l?m sai tr?ng th?i d? li?u.</w:t>
-            </w:r>
-          </w:p>
-        </w:tc>
-      </w:tr>
-      <w:tr>
-        <w:tc>
-          <w:tcPr>
-            <w:tcW w:type="dxa" w:w="1701"/>
-            <w:vAlign w:val="center"/>
-          </w:tcPr>
-          <w:p>
-            <w:r>
-              <w:t>NFR-LF-05</w:t>
-            </w:r>
-          </w:p>
-        </w:tc>
-        <w:tc>
-          <w:tcPr>
-            <w:tcW w:type="dxa" w:w="7937"/>
-            <w:vAlign w:val="center"/>
-          </w:tcPr>
-          <w:p>
-            <w:r>
-              <w:t>Danh s?ch h? tr? ph?n trang ?? gi?i h?n s? b?n ghi t?i ??ng th?i.</w:t>
-            </w:r>
-          </w:p>
-        </w:tc>
-      </w:tr>
-      <w:tr>
-        <w:tc>
-          <w:tcPr>
-            <w:tcW w:type="dxa" w:w="1701"/>
-            <w:vAlign w:val="center"/>
-          </w:tcPr>
-          <w:p>
-            <w:r>
-              <w:t>NFR-LF-06</w:t>
-            </w:r>
-          </w:p>
-        </w:tc>
-        <w:tc>
-          <w:tcPr>
-            <w:tcW w:type="dxa" w:w="7937"/>
-            <w:vAlign w:val="center"/>
-          </w:tcPr>
-          <w:p>
-            <w:r>
-              <w:t>Gi? nguy?n n?i dung ?? duy?t ?? ph?c v? ??i chi?u, ki?m tra.</w:t>
-            </w:r>
-          </w:p>
-        </w:tc>
-      </w:tr>
-      <w:tr>
-        <w:tc>
-          <w:tcPr>
-            <w:tcW w:type="dxa" w:w="1701"/>
-            <w:vAlign w:val="center"/>
-          </w:tcPr>
-          <w:p>
-            <w:r>
-              <w:t>NFR-LF-07</w:t>
-            </w:r>
-          </w:p>
-        </w:tc>
-        <w:tc>
-          <w:tcPr>
-            <w:tcW w:type="dxa" w:w="7937"/>
-            <w:vAlign w:val="center"/>
-          </w:tcPr>
-          <w:p>
-            <w:r>
-              <w:t>Ph?t hi?n xung ??t phi?n b?n khi nhi?u ng??i c?ng x? l?.</w:t>
-            </w:r>
-          </w:p>
-        </w:tc>
-      </w:tr>
-    </w:tbl>
-    <w:p/>
-    <w:p>
-      <w:pPr>
-        <w:pStyle w:val="Heading1"/>
-      </w:pPr>
-      <w:r>
-        <w:t>9. Ti?u ch? nghi?m thu</w:t>
+        <w:t>9. Tiêu chí nghiệm thu</w:t>
       </w:r>
     </w:p>
     <w:tbl>
@@ -2554,46 +2178,43 @@
         </w:trPr>
         <w:tc>
           <w:tcPr>
-            <w:tcW w:type="dxa" w:w="1701"/>
+            <w:tcW w:type="dxa" w:w="3230"/>
             <w:shd w:fill="D9EAF7"/>
-            <w:vAlign w:val="center"/>
           </w:tcPr>
           <w:p>
             <w:r>
               <w:rPr>
                 <w:b/>
               </w:rPr>
-              <w:t>M? ki?m th?</w:t>
+              <w:t>Mã kiểm thử</w:t>
             </w:r>
           </w:p>
         </w:tc>
         <w:tc>
           <w:tcPr>
-            <w:tcW w:type="dxa" w:w="3969"/>
+            <w:tcW w:type="dxa" w:w="3230"/>
             <w:shd w:fill="D9EAF7"/>
-            <w:vAlign w:val="center"/>
           </w:tcPr>
           <w:p>
             <w:r>
               <w:rPr>
                 <w:b/>
               </w:rPr>
-              <w:t>N?i dung</w:t>
+              <w:t>Nội dung</w:t>
             </w:r>
           </w:p>
         </w:tc>
         <w:tc>
           <w:tcPr>
-            <w:tcW w:type="dxa" w:w="3969"/>
+            <w:tcW w:type="dxa" w:w="3230"/>
             <w:shd w:fill="D9EAF7"/>
-            <w:vAlign w:val="center"/>
           </w:tcPr>
           <w:p>
             <w:r>
               <w:rPr>
                 <w:b/>
               </w:rPr>
-              <w:t>K?t qu? mong ??i</w:t>
+              <w:t>Kết quả mong đợi</w:t>
             </w:r>
           </w:p>
         </w:tc>
@@ -2601,7 +2222,7 @@
       <w:tr>
         <w:tc>
           <w:tcPr>
-            <w:tcW w:type="dxa" w:w="1701"/>
+            <w:tcW w:type="dxa" w:w="3230"/>
             <w:vAlign w:val="center"/>
           </w:tcPr>
           <w:p>
@@ -2612,23 +2233,23 @@
         </w:tc>
         <w:tc>
           <w:tcPr>
-            <w:tcW w:type="dxa" w:w="3969"/>
+            <w:tcW w:type="dxa" w:w="3230"/>
             <w:vAlign w:val="center"/>
           </w:tcPr>
           <w:p>
             <w:r>
-              <w:t>T?o ?i?n v?n ?? tr??ng b?t bu?c</w:t>
+              <w:t>Tạo đủ trường bắt buộc</w:t>
             </w:r>
           </w:p>
         </w:tc>
         <w:tc>
           <w:tcPr>
-            <w:tcW w:type="dxa" w:w="3969"/>
+            <w:tcW w:type="dxa" w:w="3230"/>
             <w:vAlign w:val="center"/>
           </w:tcPr>
           <w:p>
             <w:r>
-              <w:t>L?u th?nh c?ng ? tr?ng th?i Nh?p</w:t>
+              <w:t>Lưu thành công ở trạng thái Nháp</w:t>
             </w:r>
           </w:p>
         </w:tc>
@@ -2636,7 +2257,7 @@
       <w:tr>
         <w:tc>
           <w:tcPr>
-            <w:tcW w:type="dxa" w:w="1701"/>
+            <w:tcW w:type="dxa" w:w="3230"/>
             <w:vAlign w:val="center"/>
           </w:tcPr>
           <w:p>
@@ -2647,23 +2268,23 @@
         </w:tc>
         <w:tc>
           <w:tcPr>
-            <w:tcW w:type="dxa" w:w="3969"/>
+            <w:tcW w:type="dxa" w:w="3230"/>
             <w:vAlign w:val="center"/>
           </w:tcPr>
           <w:p>
             <w:r>
-              <w:t>B? tr?ng ng?y, ti?u ?? ho?c ??a ?i?m</w:t>
+              <w:t>Bỏ trống ngày, tiêu đề hoặc địa điểm</w:t>
             </w:r>
           </w:p>
         </w:tc>
         <w:tc>
           <w:tcPr>
-            <w:tcW w:type="dxa" w:w="3969"/>
+            <w:tcW w:type="dxa" w:w="3230"/>
             <w:vAlign w:val="center"/>
           </w:tcPr>
           <w:p>
             <w:r>
-              <w:t>Kh?ng cho l?u; hi?n th? c?nh b?o</w:t>
+              <w:t>Không cho lưu; cảnh báo</w:t>
             </w:r>
           </w:p>
         </w:tc>
@@ -2671,7 +2292,7 @@
       <w:tr>
         <w:tc>
           <w:tcPr>
-            <w:tcW w:type="dxa" w:w="1701"/>
+            <w:tcW w:type="dxa" w:w="3230"/>
             <w:vAlign w:val="center"/>
           </w:tcPr>
           <w:p>
@@ -2682,23 +2303,23 @@
         </w:tc>
         <w:tc>
           <w:tcPr>
-            <w:tcW w:type="dxa" w:w="3969"/>
+            <w:tcW w:type="dxa" w:w="3230"/>
             <w:vAlign w:val="center"/>
           </w:tcPr>
           <w:p>
             <w:r>
-              <w:t>Nh?p gi? kh?ng ??ng HH:mm</w:t>
+              <w:t>Nhập giờ không đúng HH:mm</w:t>
             </w:r>
           </w:p>
         </w:tc>
         <w:tc>
           <w:tcPr>
-            <w:tcW w:type="dxa" w:w="3969"/>
+            <w:tcW w:type="dxa" w:w="3230"/>
             <w:vAlign w:val="center"/>
           </w:tcPr>
           <w:p>
             <w:r>
-              <w:t>Kh?ng cho l?u</w:t>
+              <w:t>Không cho lưu</w:t>
             </w:r>
           </w:p>
         </w:tc>
@@ -2706,7 +2327,7 @@
       <w:tr>
         <w:tc>
           <w:tcPr>
-            <w:tcW w:type="dxa" w:w="1701"/>
+            <w:tcW w:type="dxa" w:w="3230"/>
             <w:vAlign w:val="center"/>
           </w:tcPr>
           <w:p>
@@ -2717,23 +2338,23 @@
         </w:tc>
         <w:tc>
           <w:tcPr>
-            <w:tcW w:type="dxa" w:w="3969"/>
+            <w:tcW w:type="dxa" w:w="3230"/>
             <w:vAlign w:val="center"/>
           </w:tcPr>
           <w:p>
             <w:r>
-              <w:t>T? gi? l?n h?n ho?c b?ng ??n gi?</w:t>
+              <w:t>Từ giờ lớn hơn hoặc bằng Đến giờ</w:t>
             </w:r>
           </w:p>
         </w:tc>
         <w:tc>
           <w:tcPr>
-            <w:tcW w:type="dxa" w:w="3969"/>
+            <w:tcW w:type="dxa" w:w="3230"/>
             <w:vAlign w:val="center"/>
           </w:tcPr>
           <w:p>
             <w:r>
-              <w:t>Kh?ng cho l?u</w:t>
+              <w:t>Không cho lưu</w:t>
             </w:r>
           </w:p>
         </w:tc>
@@ -2741,7 +2362,7 @@
       <w:tr>
         <w:tc>
           <w:tcPr>
-            <w:tcW w:type="dxa" w:w="1701"/>
+            <w:tcW w:type="dxa" w:w="3230"/>
             <w:vAlign w:val="center"/>
           </w:tcPr>
           <w:p>
@@ -2752,23 +2373,23 @@
         </w:tc>
         <w:tc>
           <w:tcPr>
-            <w:tcW w:type="dxa" w:w="3969"/>
+            <w:tcW w:type="dxa" w:w="3230"/>
             <w:vAlign w:val="center"/>
           </w:tcPr>
           <w:p>
             <w:r>
-              <w:t>Thay ??i d? li?u ch?a l?u r?i G?i duy?t</w:t>
+              <w:t>Có thay đổi chưa lưu rồi Gửi duyệt</w:t>
             </w:r>
           </w:p>
         </w:tc>
         <w:tc>
           <w:tcPr>
-            <w:tcW w:type="dxa" w:w="3969"/>
+            <w:tcW w:type="dxa" w:w="3230"/>
             <w:vAlign w:val="center"/>
           </w:tcPr>
           <w:p>
             <w:r>
-              <w:t>Y?u c?u l?u nh?p tr??c</w:t>
+              <w:t>Yêu cầu lưu nháp trước</w:t>
             </w:r>
           </w:p>
         </w:tc>
@@ -2776,7 +2397,7 @@
       <w:tr>
         <w:tc>
           <w:tcPr>
-            <w:tcW w:type="dxa" w:w="1701"/>
+            <w:tcW w:type="dxa" w:w="3230"/>
             <w:vAlign w:val="center"/>
           </w:tcPr>
           <w:p>
@@ -2787,23 +2408,23 @@
         </w:tc>
         <w:tc>
           <w:tcPr>
-            <w:tcW w:type="dxa" w:w="3969"/>
+            <w:tcW w:type="dxa" w:w="3230"/>
             <w:vAlign w:val="center"/>
           </w:tcPr>
           <w:p>
             <w:r>
-              <w:t>G?i ?i?n v?n Nh?p ?? duy?t</w:t>
+              <w:t>Gửi điện văn Nháp</w:t>
             </w:r>
           </w:p>
         </w:tc>
         <w:tc>
           <w:tcPr>
-            <w:tcW w:type="dxa" w:w="3969"/>
+            <w:tcW w:type="dxa" w:w="3230"/>
             <w:vAlign w:val="center"/>
           </w:tcPr>
           <w:p>
             <w:r>
-              <w:t>Chuy?n sang Ch? duy?t</w:t>
+              <w:t>Chuyển sang Chờ duyệt</w:t>
             </w:r>
           </w:p>
         </w:tc>
@@ -2811,7 +2432,7 @@
       <w:tr>
         <w:tc>
           <w:tcPr>
-            <w:tcW w:type="dxa" w:w="1701"/>
+            <w:tcW w:type="dxa" w:w="3230"/>
             <w:vAlign w:val="center"/>
           </w:tcPr>
           <w:p>
@@ -2822,23 +2443,23 @@
         </w:tc>
         <w:tc>
           <w:tcPr>
-            <w:tcW w:type="dxa" w:w="3969"/>
+            <w:tcW w:type="dxa" w:w="3230"/>
             <w:vAlign w:val="center"/>
           </w:tcPr>
           <w:p>
             <w:r>
-              <w:t>Ng??i kh?ng c? R_Add th?m m?i</w:t>
+              <w:t>Không có R_Add nhưng thêm mới</w:t>
             </w:r>
           </w:p>
         </w:tc>
         <w:tc>
           <w:tcPr>
-            <w:tcW w:type="dxa" w:w="3969"/>
+            <w:tcW w:type="dxa" w:w="3230"/>
             <w:vAlign w:val="center"/>
           </w:tcPr>
           <w:p>
             <w:r>
-              <w:t>H? th?ng t? ch?i</w:t>
+              <w:t>Hệ thống từ chối</w:t>
             </w:r>
           </w:p>
         </w:tc>
@@ -2846,7 +2467,7 @@
       <w:tr>
         <w:tc>
           <w:tcPr>
-            <w:tcW w:type="dxa" w:w="1701"/>
+            <w:tcW w:type="dxa" w:w="3230"/>
             <w:vAlign w:val="center"/>
           </w:tcPr>
           <w:p>
@@ -2857,23 +2478,23 @@
         </w:tc>
         <w:tc>
           <w:tcPr>
-            <w:tcW w:type="dxa" w:w="3969"/>
+            <w:tcW w:type="dxa" w:w="3230"/>
             <w:vAlign w:val="center"/>
           </w:tcPr>
           <w:p>
             <w:r>
-              <w:t>Ng??i kh?ng c? R_Edit s?a/g?i duy?t</w:t>
+              <w:t>Không có R_Edit nhưng sửa/gửi duyệt</w:t>
             </w:r>
           </w:p>
         </w:tc>
         <w:tc>
           <w:tcPr>
-            <w:tcW w:type="dxa" w:w="3969"/>
+            <w:tcW w:type="dxa" w:w="3230"/>
             <w:vAlign w:val="center"/>
           </w:tcPr>
           <w:p>
             <w:r>
-              <w:t>H? th?ng t? ch?i</w:t>
+              <w:t>Hệ thống từ chối</w:t>
             </w:r>
           </w:p>
         </w:tc>
@@ -2881,7 +2502,7 @@
       <w:tr>
         <w:tc>
           <w:tcPr>
-            <w:tcW w:type="dxa" w:w="1701"/>
+            <w:tcW w:type="dxa" w:w="3230"/>
             <w:vAlign w:val="center"/>
           </w:tcPr>
           <w:p>
@@ -2892,23 +2513,23 @@
         </w:tc>
         <w:tc>
           <w:tcPr>
-            <w:tcW w:type="dxa" w:w="3969"/>
+            <w:tcW w:type="dxa" w:w="3230"/>
             <w:vAlign w:val="center"/>
           </w:tcPr>
           <w:p>
             <w:r>
-              <w:t>Ng??i c? R_Pub duy?t ?i?n v?n Ch? duy?t</w:t>
+              <w:t>Có R_Pub duyệt điện văn Chờ duyệt</w:t>
             </w:r>
           </w:p>
         </w:tc>
         <w:tc>
           <w:tcPr>
-            <w:tcW w:type="dxa" w:w="3969"/>
+            <w:tcW w:type="dxa" w:w="3230"/>
             <w:vAlign w:val="center"/>
           </w:tcPr>
           <w:p>
             <w:r>
-              <w:t>Chuy?n sang ?? duy?t</w:t>
+              <w:t>Chuyển sang Đã duyệt</w:t>
             </w:r>
           </w:p>
         </w:tc>
@@ -2916,7 +2537,7 @@
       <w:tr>
         <w:tc>
           <w:tcPr>
-            <w:tcW w:type="dxa" w:w="1701"/>
+            <w:tcW w:type="dxa" w:w="3230"/>
             <w:vAlign w:val="center"/>
           </w:tcPr>
           <w:p>
@@ -2927,23 +2548,23 @@
         </w:tc>
         <w:tc>
           <w:tcPr>
-            <w:tcW w:type="dxa" w:w="3969"/>
+            <w:tcW w:type="dxa" w:w="3230"/>
             <w:vAlign w:val="center"/>
           </w:tcPr>
           <w:p>
             <w:r>
-              <w:t>Ng??i kh?ng c? R_Pub th?c hi?n duy?t</w:t>
+              <w:t>Không có R_Pub nhưng thực hiện duyệt</w:t>
             </w:r>
           </w:p>
         </w:tc>
         <w:tc>
           <w:tcPr>
-            <w:tcW w:type="dxa" w:w="3969"/>
+            <w:tcW w:type="dxa" w:w="3230"/>
             <w:vAlign w:val="center"/>
           </w:tcPr>
           <w:p>
             <w:r>
-              <w:t>H? th?ng t? ch?i</w:t>
+              <w:t>Hệ thống từ chối</w:t>
             </w:r>
           </w:p>
         </w:tc>
@@ -2951,7 +2572,7 @@
       <w:tr>
         <w:tc>
           <w:tcPr>
-            <w:tcW w:type="dxa" w:w="1701"/>
+            <w:tcW w:type="dxa" w:w="3230"/>
             <w:vAlign w:val="center"/>
           </w:tcPr>
           <w:p>
@@ -2962,23 +2583,23 @@
         </w:tc>
         <w:tc>
           <w:tcPr>
-            <w:tcW w:type="dxa" w:w="3969"/>
+            <w:tcW w:type="dxa" w:w="3230"/>
             <w:vAlign w:val="center"/>
           </w:tcPr>
           <w:p>
             <w:r>
-              <w:t>T? ch?i nh?ng kh?ng nh?p l? do</w:t>
+              <w:t>Từ chối không nhập lý do</w:t>
             </w:r>
           </w:p>
         </w:tc>
         <w:tc>
           <w:tcPr>
-            <w:tcW w:type="dxa" w:w="3969"/>
+            <w:tcW w:type="dxa" w:w="3230"/>
             <w:vAlign w:val="center"/>
           </w:tcPr>
           <w:p>
             <w:r>
-              <w:t>Kh?ng cho th?c hi?n</w:t>
+              <w:t>Không cho thực hiện</w:t>
             </w:r>
           </w:p>
         </w:tc>
@@ -2986,7 +2607,7 @@
       <w:tr>
         <w:tc>
           <w:tcPr>
-            <w:tcW w:type="dxa" w:w="1701"/>
+            <w:tcW w:type="dxa" w:w="3230"/>
             <w:vAlign w:val="center"/>
           </w:tcPr>
           <w:p>
@@ -2997,23 +2618,23 @@
         </w:tc>
         <w:tc>
           <w:tcPr>
-            <w:tcW w:type="dxa" w:w="3969"/>
+            <w:tcW w:type="dxa" w:w="3230"/>
             <w:vAlign w:val="center"/>
           </w:tcPr>
           <w:p>
             <w:r>
-              <w:t>T? ch?i v?i l? do h?p l?</w:t>
+              <w:t>Từ chối với lý do hợp lệ</w:t>
             </w:r>
           </w:p>
         </w:tc>
         <w:tc>
           <w:tcPr>
-            <w:tcW w:type="dxa" w:w="3969"/>
+            <w:tcW w:type="dxa" w:w="3230"/>
             <w:vAlign w:val="center"/>
           </w:tcPr>
           <w:p>
             <w:r>
-              <w:t>Chuy?n sang T? ch?i v? l?u l? do</w:t>
+              <w:t>Chuyển sang Từ chối và lưu lý do</w:t>
             </w:r>
           </w:p>
         </w:tc>
@@ -3021,7 +2642,7 @@
       <w:tr>
         <w:tc>
           <w:tcPr>
-            <w:tcW w:type="dxa" w:w="1701"/>
+            <w:tcW w:type="dxa" w:w="3230"/>
             <w:vAlign w:val="center"/>
           </w:tcPr>
           <w:p>
@@ -3032,23 +2653,23 @@
         </w:tc>
         <w:tc>
           <w:tcPr>
-            <w:tcW w:type="dxa" w:w="3969"/>
+            <w:tcW w:type="dxa" w:w="3230"/>
             <w:vAlign w:val="center"/>
           </w:tcPr>
           <w:p>
             <w:r>
-              <w:t>S?a ?i?n v?n b? t? ch?i v? g?i l?i</w:t>
+              <w:t>Sửa điện văn bị từ chối và gửi lại</w:t>
             </w:r>
           </w:p>
         </w:tc>
         <w:tc>
           <w:tcPr>
-            <w:tcW w:type="dxa" w:w="3969"/>
+            <w:tcW w:type="dxa" w:w="3230"/>
             <w:vAlign w:val="center"/>
           </w:tcPr>
           <w:p>
             <w:r>
-              <w:t>Chuy?n l?i Ch? duy?t</w:t>
+              <w:t>Chuyển lại Chờ duyệt</w:t>
             </w:r>
           </w:p>
         </w:tc>
@@ -3056,7 +2677,7 @@
       <w:tr>
         <w:tc>
           <w:tcPr>
-            <w:tcW w:type="dxa" w:w="1701"/>
+            <w:tcW w:type="dxa" w:w="3230"/>
             <w:vAlign w:val="center"/>
           </w:tcPr>
           <w:p>
@@ -3067,23 +2688,23 @@
         </w:tc>
         <w:tc>
           <w:tcPr>
-            <w:tcW w:type="dxa" w:w="3969"/>
+            <w:tcW w:type="dxa" w:w="3230"/>
             <w:vAlign w:val="center"/>
           </w:tcPr>
           <w:p>
             <w:r>
-              <w:t>S?a ?i?n v?n ?? duy?t</w:t>
+              <w:t>Sửa điện văn đã duyệt</w:t>
             </w:r>
           </w:p>
         </w:tc>
         <w:tc>
           <w:tcPr>
-            <w:tcW w:type="dxa" w:w="3969"/>
+            <w:tcW w:type="dxa" w:w="3230"/>
             <w:vAlign w:val="center"/>
           </w:tcPr>
           <w:p>
             <w:r>
-              <w:t>Kh?ng cho ph?p</w:t>
+              <w:t>Không cho phép</w:t>
             </w:r>
           </w:p>
         </w:tc>
@@ -3091,7 +2712,7 @@
       <w:tr>
         <w:tc>
           <w:tcPr>
-            <w:tcW w:type="dxa" w:w="1701"/>
+            <w:tcW w:type="dxa" w:w="3230"/>
             <w:vAlign w:val="center"/>
           </w:tcPr>
           <w:p>
@@ -3102,23 +2723,23 @@
         </w:tc>
         <w:tc>
           <w:tcPr>
-            <w:tcW w:type="dxa" w:w="3969"/>
+            <w:tcW w:type="dxa" w:w="3230"/>
             <w:vAlign w:val="center"/>
           </w:tcPr>
           <w:p>
             <w:r>
-              <w:t>Hai ng??i x? l? c?ng phi?n b?n</w:t>
+              <w:t>Hai người xử lý cùng phiên bản</w:t>
             </w:r>
           </w:p>
         </w:tc>
         <w:tc>
           <w:tcPr>
-            <w:tcW w:type="dxa" w:w="3969"/>
+            <w:tcW w:type="dxa" w:w="3230"/>
             <w:vAlign w:val="center"/>
           </w:tcPr>
           <w:p>
             <w:r>
-              <w:t>Thao t?c tr?n phi?n b?n c? b? t? ch?i</w:t>
+              <w:t>Từ chối thao tác trên phiên bản cũ</w:t>
             </w:r>
           </w:p>
         </w:tc>
@@ -3126,7 +2747,7 @@
       <w:tr>
         <w:tc>
           <w:tcPr>
-            <w:tcW w:type="dxa" w:w="1701"/>
+            <w:tcW w:type="dxa" w:w="3230"/>
             <w:vAlign w:val="center"/>
           </w:tcPr>
           <w:p>
@@ -3137,23 +2758,23 @@
         </w:tc>
         <w:tc>
           <w:tcPr>
-            <w:tcW w:type="dxa" w:w="3969"/>
+            <w:tcW w:type="dxa" w:w="3230"/>
             <w:vAlign w:val="center"/>
           </w:tcPr>
           <w:p>
             <w:r>
-              <w:t>T? ng?y l?n h?n ??n ng?y</w:t>
+              <w:t>Từ ngày lớn hơn Đến ngày</w:t>
             </w:r>
           </w:p>
         </w:tc>
         <w:tc>
           <w:tcPr>
-            <w:tcW w:type="dxa" w:w="3969"/>
+            <w:tcW w:type="dxa" w:w="3230"/>
             <w:vAlign w:val="center"/>
           </w:tcPr>
           <w:p>
             <w:r>
-              <w:t>Kh?ng t?m ki?m; hi?n th? c?nh b?o</w:t>
+              <w:t>Không tìm kiếm; cảnh báo</w:t>
             </w:r>
           </w:p>
         </w:tc>
@@ -3161,7 +2782,7 @@
       <w:tr>
         <w:tc>
           <w:tcPr>
-            <w:tcW w:type="dxa" w:w="1701"/>
+            <w:tcW w:type="dxa" w:w="3230"/>
             <w:vAlign w:val="center"/>
           </w:tcPr>
           <w:p>
@@ -3172,23 +2793,23 @@
         </w:tc>
         <w:tc>
           <w:tcPr>
-            <w:tcW w:type="dxa" w:w="3969"/>
+            <w:tcW w:type="dxa" w:w="3230"/>
             <w:vAlign w:val="center"/>
           </w:tcPr>
           <w:p>
             <w:r>
-              <w:t>API ho?c Oracle l?i khi duy?t</w:t>
+              <w:t>API hoặc Oracle lỗi khi duyệt</w:t>
             </w:r>
           </w:p>
         </w:tc>
         <w:tc>
           <w:tcPr>
-            <w:tcW w:type="dxa" w:w="3969"/>
+            <w:tcW w:type="dxa" w:w="3230"/>
             <w:vAlign w:val="center"/>
           </w:tcPr>
           <w:p>
             <w:r>
-              <w:t>Kh?ng ??i tr?ng th?i; th?ng b?o l?i</w:t>
+              <w:t>Không đổi trạng thái; báo lỗi</w:t>
             </w:r>
           </w:p>
         </w:tc>
@@ -3196,7 +2817,7 @@
       <w:tr>
         <w:tc>
           <w:tcPr>
-            <w:tcW w:type="dxa" w:w="1701"/>
+            <w:tcW w:type="dxa" w:w="3230"/>
             <w:vAlign w:val="center"/>
           </w:tcPr>
           <w:p>
@@ -3207,23 +2828,23 @@
         </w:tc>
         <w:tc>
           <w:tcPr>
-            <w:tcW w:type="dxa" w:w="3969"/>
+            <w:tcW w:type="dxa" w:w="3230"/>
             <w:vAlign w:val="center"/>
           </w:tcPr>
           <w:p>
             <w:r>
-              <w:t>Xem l?i ?i?n v?n ?? duy?t</w:t>
+              <w:t>Xem lại điện văn đã duyệt</w:t>
             </w:r>
           </w:p>
         </w:tc>
         <w:tc>
           <w:tcPr>
-            <w:tcW w:type="dxa" w:w="3969"/>
+            <w:tcW w:type="dxa" w:w="3230"/>
             <w:vAlign w:val="center"/>
           </w:tcPr>
           <w:p>
             <w:r>
-              <w:t>Hi?n th? ??ng n?i dung, ng??i v? th?i ?i?m duy?t</w:t>
+              <w:t>Đúng nội dung, người và thời điểm duyệt</w:t>
             </w:r>
           </w:p>
         </w:tc>
@@ -3235,7 +2856,7 @@
         <w:pStyle w:val="Heading1"/>
       </w:pPr>
       <w:r>
-        <w:t>10. Ma tr?n truy v?t</w:t>
+        <w:t>10. Ma trận truy vết</w:t>
       </w:r>
     </w:p>
     <w:tbl>
@@ -3256,46 +2877,43 @@
         </w:trPr>
         <w:tc>
           <w:tcPr>
-            <w:tcW w:type="dxa" w:w="2268"/>
+            <w:tcW w:type="dxa" w:w="3230"/>
             <w:shd w:fill="D9EAF7"/>
-            <w:vAlign w:val="center"/>
           </w:tcPr>
           <w:p>
             <w:r>
               <w:rPr>
                 <w:b/>
               </w:rPr>
-              <w:t>M? y?u c?u</w:t>
+              <w:t>Mã yêu cầu</w:t>
             </w:r>
           </w:p>
         </w:tc>
         <w:tc>
           <w:tcPr>
-            <w:tcW w:type="dxa" w:w="3969"/>
+            <w:tcW w:type="dxa" w:w="3230"/>
             <w:shd w:fill="D9EAF7"/>
-            <w:vAlign w:val="center"/>
           </w:tcPr>
           <w:p>
             <w:r>
               <w:rPr>
                 <w:b/>
               </w:rPr>
-              <w:t>N?i dung</w:t>
+              <w:t>Nội dung</w:t>
             </w:r>
           </w:p>
         </w:tc>
         <w:tc>
           <w:tcPr>
-            <w:tcW w:type="dxa" w:w="3402"/>
+            <w:tcW w:type="dxa" w:w="3230"/>
             <w:shd w:fill="D9EAF7"/>
-            <w:vAlign w:val="center"/>
           </w:tcPr>
           <w:p>
             <w:r>
               <w:rPr>
                 <w:b/>
               </w:rPr>
-              <w:t>Ki?m th?</w:t>
+              <w:t>Kiểm thử</w:t>
             </w:r>
           </w:p>
         </w:tc>
@@ -3303,7 +2921,7 @@
       <w:tr>
         <w:tc>
           <w:tcPr>
-            <w:tcW w:type="dxa" w:w="2268"/>
+            <w:tcW w:type="dxa" w:w="3230"/>
             <w:vAlign w:val="center"/>
           </w:tcPr>
           <w:p>
@@ -3314,23 +2932,23 @@
         </w:tc>
         <w:tc>
           <w:tcPr>
-            <w:tcW w:type="dxa" w:w="3969"/>
+            <w:tcW w:type="dxa" w:w="3230"/>
             <w:vAlign w:val="center"/>
           </w:tcPr>
           <w:p>
             <w:r>
-              <w:t>T?o v? l?u nh?p</w:t>
+              <w:t>Tạo và lưu nháp</w:t>
             </w:r>
           </w:p>
         </w:tc>
         <w:tc>
           <w:tcPr>
-            <w:tcW w:type="dxa" w:w="3402"/>
+            <w:tcW w:type="dxa" w:w="3230"/>
             <w:vAlign w:val="center"/>
           </w:tcPr>
           <w:p>
             <w:r>
-              <w:t>TC-LF-01 ??n TC-LF-04</w:t>
+              <w:t>TC-LF-01 đến TC-LF-04</w:t>
             </w:r>
           </w:p>
         </w:tc>
@@ -3338,7 +2956,7 @@
       <w:tr>
         <w:tc>
           <w:tcPr>
-            <w:tcW w:type="dxa" w:w="2268"/>
+            <w:tcW w:type="dxa" w:w="3230"/>
             <w:vAlign w:val="center"/>
           </w:tcPr>
           <w:p>
@@ -3349,23 +2967,23 @@
         </w:tc>
         <w:tc>
           <w:tcPr>
-            <w:tcW w:type="dxa" w:w="3969"/>
+            <w:tcW w:type="dxa" w:w="3230"/>
             <w:vAlign w:val="center"/>
           </w:tcPr>
           <w:p>
             <w:r>
-              <w:t>G?i duy?t</w:t>
+              <w:t>Gửi duyệt</w:t>
             </w:r>
           </w:p>
         </w:tc>
         <w:tc>
           <w:tcPr>
-            <w:tcW w:type="dxa" w:w="3402"/>
+            <w:tcW w:type="dxa" w:w="3230"/>
             <w:vAlign w:val="center"/>
           </w:tcPr>
           <w:p>
             <w:r>
-              <w:t>TC-LF-05 ??n TC-LF-08</w:t>
+              <w:t>TC-LF-05 đến TC-LF-08</w:t>
             </w:r>
           </w:p>
         </w:tc>
@@ -3373,7 +2991,7 @@
       <w:tr>
         <w:tc>
           <w:tcPr>
-            <w:tcW w:type="dxa" w:w="2268"/>
+            <w:tcW w:type="dxa" w:w="3230"/>
             <w:vAlign w:val="center"/>
           </w:tcPr>
           <w:p>
@@ -3384,18 +3002,18 @@
         </w:tc>
         <w:tc>
           <w:tcPr>
-            <w:tcW w:type="dxa" w:w="3969"/>
+            <w:tcW w:type="dxa" w:w="3230"/>
             <w:vAlign w:val="center"/>
           </w:tcPr>
           <w:p>
             <w:r>
-              <w:t>Duy?t ?i?n v?n</w:t>
+              <w:t>Duyệt điện văn</w:t>
             </w:r>
           </w:p>
         </w:tc>
         <w:tc>
           <w:tcPr>
-            <w:tcW w:type="dxa" w:w="3402"/>
+            <w:tcW w:type="dxa" w:w="3230"/>
             <w:vAlign w:val="center"/>
           </w:tcPr>
           <w:p>
@@ -3408,7 +3026,7 @@
       <w:tr>
         <w:tc>
           <w:tcPr>
-            <w:tcW w:type="dxa" w:w="2268"/>
+            <w:tcW w:type="dxa" w:w="3230"/>
             <w:vAlign w:val="center"/>
           </w:tcPr>
           <w:p>
@@ -3419,23 +3037,23 @@
         </w:tc>
         <w:tc>
           <w:tcPr>
-            <w:tcW w:type="dxa" w:w="3969"/>
+            <w:tcW w:type="dxa" w:w="3230"/>
             <w:vAlign w:val="center"/>
           </w:tcPr>
           <w:p>
             <w:r>
-              <w:t>T? ch?i ?i?n v?n</w:t>
+              <w:t>Từ chối điện văn</w:t>
             </w:r>
           </w:p>
         </w:tc>
         <w:tc>
           <w:tcPr>
-            <w:tcW w:type="dxa" w:w="3402"/>
+            <w:tcW w:type="dxa" w:w="3230"/>
             <w:vAlign w:val="center"/>
           </w:tcPr>
           <w:p>
             <w:r>
-              <w:t>TC-LF-11 ??n TC-LF-13</w:t>
+              <w:t>TC-LF-11 đến TC-LF-13</w:t>
             </w:r>
           </w:p>
         </w:tc>
@@ -3443,7 +3061,7 @@
       <w:tr>
         <w:tc>
           <w:tcPr>
-            <w:tcW w:type="dxa" w:w="2268"/>
+            <w:tcW w:type="dxa" w:w="3230"/>
             <w:vAlign w:val="center"/>
           </w:tcPr>
           <w:p>
@@ -3454,18 +3072,18 @@
         </w:tc>
         <w:tc>
           <w:tcPr>
-            <w:tcW w:type="dxa" w:w="3969"/>
+            <w:tcW w:type="dxa" w:w="3230"/>
             <w:vAlign w:val="center"/>
           </w:tcPr>
           <w:p>
             <w:r>
-              <w:t>Ki?m so?t phi?n b?n</w:t>
+              <w:t>Kiểm soát phiên bản</w:t>
             </w:r>
           </w:p>
         </w:tc>
         <w:tc>
           <w:tcPr>
-            <w:tcW w:type="dxa" w:w="3402"/>
+            <w:tcW w:type="dxa" w:w="3230"/>
             <w:vAlign w:val="center"/>
           </w:tcPr>
           <w:p>
@@ -3478,7 +3096,7 @@
       <w:tr>
         <w:tc>
           <w:tcPr>
-            <w:tcW w:type="dxa" w:w="2268"/>
+            <w:tcW w:type="dxa" w:w="3230"/>
             <w:vAlign w:val="center"/>
           </w:tcPr>
           <w:p>
@@ -3489,18 +3107,18 @@
         </w:tc>
         <w:tc>
           <w:tcPr>
-            <w:tcW w:type="dxa" w:w="3969"/>
+            <w:tcW w:type="dxa" w:w="3230"/>
             <w:vAlign w:val="center"/>
           </w:tcPr>
           <w:p>
             <w:r>
-              <w:t>X? l? l?i API/Oracle</w:t>
+              <w:t>Xử lý lỗi API/Oracle</w:t>
             </w:r>
           </w:p>
         </w:tc>
         <w:tc>
           <w:tcPr>
-            <w:tcW w:type="dxa" w:w="3402"/>
+            <w:tcW w:type="dxa" w:w="3230"/>
             <w:vAlign w:val="center"/>
           </w:tcPr>
           <w:p>
@@ -3513,7 +3131,7 @@
       <w:tr>
         <w:tc>
           <w:tcPr>
-            <w:tcW w:type="dxa" w:w="2268"/>
+            <w:tcW w:type="dxa" w:w="3230"/>
             <w:vAlign w:val="center"/>
           </w:tcPr>
           <w:p>
@@ -3524,18 +3142,18 @@
         </w:tc>
         <w:tc>
           <w:tcPr>
-            <w:tcW w:type="dxa" w:w="3969"/>
+            <w:tcW w:type="dxa" w:w="3230"/>
             <w:vAlign w:val="center"/>
           </w:tcPr>
           <w:p>
             <w:r>
-              <w:t>L?u n?i dung ?? duy?t</w:t>
+              <w:t>Lưu nội dung đã duyệt</w:t>
             </w:r>
           </w:p>
         </w:tc>
         <w:tc>
           <w:tcPr>
-            <w:tcW w:type="dxa" w:w="3402"/>
+            <w:tcW w:type="dxa" w:w="3230"/>
             <w:vAlign w:val="center"/>
           </w:tcPr>
           <w:p>
@@ -3940,6 +3558,7 @@
     <w:rsid w:val="00FC693F"/>
     <w:rPr>
       <w:rFonts w:ascii="Times New Roman" w:hAnsi="Times New Roman" w:eastAsia="Times New Roman"/>
+      <w:b w:val="0"/>
       <w:sz w:val="24"/>
     </w:rPr>
   </w:style>
@@ -4050,11 +3669,10 @@
       <w:outlineLvl w:val="2"/>
     </w:pPr>
     <w:rPr>
-      <w:rFonts w:asciiTheme="majorHAnsi" w:eastAsiaTheme="majorEastAsia" w:hAnsiTheme="majorHAnsi" w:cstheme="majorBidi" w:ascii="Times New Roman" w:hAnsi="Times New Roman" w:eastAsia="Times New Roman"/>
+      <w:rFonts w:asciiTheme="majorHAnsi" w:eastAsiaTheme="majorEastAsia" w:hAnsiTheme="majorHAnsi" w:cstheme="majorBidi"/>
       <w:b/>
       <w:bCs/>
       <w:color w:val="4F81BD" w:themeColor="accent1"/>
-      <w:sz w:val="24"/>
     </w:rPr>
   </w:style>
   <w:style w:type="paragraph" w:styleId="Heading4">

</xml_diff>

<commit_message>
docs: add Daily Statistic workflow to SRS
</commit_message>
<xml_diff>
--- a/TaiLieu/SRS_Live_Fire_Message.docx
+++ b/TaiLieu/SRS_Live_Fire_Message.docx
@@ -3159,6 +3159,2271 @@
           <w:p>
             <w:r>
               <w:t>TC-LF-18</w:t>
+            </w:r>
+          </w:p>
+        </w:tc>
+      </w:tr>
+    </w:tbl>
+    <w:p/>
+    <w:p>
+      <w:r>
+        <w:br w:type="page"/>
+      </w:r>
+    </w:p>
+    <w:p>
+      <w:pPr>
+        <w:pStyle w:val="Heading1"/>
+      </w:pPr>
+      <w:r>
+        <w:t>PHẦN II. DAILY STATISTIC VÀ PHÊ DUYỆT DAILY STATISTIC</w:t>
+      </w:r>
+    </w:p>
+    <w:p>
+      <w:pPr>
+        <w:pStyle w:val="Heading1"/>
+      </w:pPr>
+      <w:r>
+        <w:t>11. Thông tin chung và phạm vi</w:t>
+      </w:r>
+    </w:p>
+    <w:tbl>
+      <w:tblPr>
+        <w:tblStyle w:val="TableGrid"/>
+        <w:tblW w:type="auto" w:w="0"/>
+        <w:jc w:val="center"/>
+        <w:tblLook w:firstColumn="1" w:firstRow="1" w:lastColumn="0" w:lastRow="0" w:noHBand="0" w:noVBand="1" w:val="04A0"/>
+      </w:tblPr>
+      <w:tblGrid>
+        <w:gridCol w:w="4844"/>
+        <w:gridCol w:w="4844"/>
+      </w:tblGrid>
+      <w:tr>
+        <w:trPr>
+          <w:tblHeader w:val="true"/>
+        </w:trPr>
+        <w:tc>
+          <w:tcPr>
+            <w:tcW w:type="dxa" w:w="4844"/>
+            <w:shd w:fill="D9EAF7"/>
+          </w:tcPr>
+          <w:p>
+            <w:r>
+              <w:rPr>
+                <w:b/>
+              </w:rPr>
+              <w:t>Nội dung</w:t>
+            </w:r>
+          </w:p>
+        </w:tc>
+        <w:tc>
+          <w:tcPr>
+            <w:tcW w:type="dxa" w:w="4844"/>
+            <w:shd w:fill="D9EAF7"/>
+          </w:tcPr>
+          <w:p>
+            <w:r>
+              <w:rPr>
+                <w:b/>
+              </w:rPr>
+              <w:t>Giá trị</w:t>
+            </w:r>
+          </w:p>
+        </w:tc>
+      </w:tr>
+      <w:tr>
+        <w:tc>
+          <w:tcPr>
+            <w:tcW w:type="dxa" w:w="4844"/>
+            <w:vAlign w:val="center"/>
+          </w:tcPr>
+          <w:p>
+            <w:r>
+              <w:t>Tính năng nguồn</w:t>
+            </w:r>
+          </w:p>
+        </w:tc>
+        <w:tc>
+          <w:tcPr>
+            <w:tcW w:type="dxa" w:w="4844"/>
+            <w:vAlign w:val="center"/>
+          </w:tcPr>
+          <w:p>
+            <w:r>
+              <w:t>Export Flight Finished</w:t>
+            </w:r>
+          </w:p>
+        </w:tc>
+      </w:tr>
+      <w:tr>
+        <w:tc>
+          <w:tcPr>
+            <w:tcW w:type="dxa" w:w="4844"/>
+            <w:vAlign w:val="center"/>
+          </w:tcPr>
+          <w:p>
+            <w:r>
+              <w:t>Màn hình nguồn</w:t>
+            </w:r>
+          </w:p>
+        </w:tc>
+        <w:tc>
+          <w:tcPr>
+            <w:tcW w:type="dxa" w:w="4844"/>
+            <w:vAlign w:val="center"/>
+          </w:tcPr>
+          <w:p>
+            <w:r>
+              <w:t>/Day_Flights/DaylyFlight.aspx?Menu_ID=89</w:t>
+            </w:r>
+          </w:p>
+        </w:tc>
+      </w:tr>
+      <w:tr>
+        <w:tc>
+          <w:tcPr>
+            <w:tcW w:type="dxa" w:w="4844"/>
+            <w:vAlign w:val="center"/>
+          </w:tcPr>
+          <w:p>
+            <w:r>
+              <w:t>Tính năng thống kê</w:t>
+            </w:r>
+          </w:p>
+        </w:tc>
+        <w:tc>
+          <w:tcPr>
+            <w:tcW w:type="dxa" w:w="4844"/>
+            <w:vAlign w:val="center"/>
+          </w:tcPr>
+          <w:p>
+            <w:r>
+              <w:t>Daily Statistic</w:t>
+            </w:r>
+          </w:p>
+        </w:tc>
+      </w:tr>
+      <w:tr>
+        <w:tc>
+          <w:tcPr>
+            <w:tcW w:type="dxa" w:w="4844"/>
+            <w:vAlign w:val="center"/>
+          </w:tcPr>
+          <w:p>
+            <w:r>
+              <w:t>Màn hình thống kê</w:t>
+            </w:r>
+          </w:p>
+        </w:tc>
+        <w:tc>
+          <w:tcPr>
+            <w:tcW w:type="dxa" w:w="4844"/>
+            <w:vAlign w:val="center"/>
+          </w:tcPr>
+          <w:p>
+            <w:r>
+              <w:t>/FinishFlights/ListFinishedFlights.aspx?Menu_ID=71</w:t>
+            </w:r>
+          </w:p>
+        </w:tc>
+      </w:tr>
+      <w:tr>
+        <w:tc>
+          <w:tcPr>
+            <w:tcW w:type="dxa" w:w="4844"/>
+            <w:vAlign w:val="center"/>
+          </w:tcPr>
+          <w:p>
+            <w:r>
+              <w:t>Tính năng tra cứu đã duyệt</w:t>
+            </w:r>
+          </w:p>
+        </w:tc>
+        <w:tc>
+          <w:tcPr>
+            <w:tcW w:type="dxa" w:w="4844"/>
+            <w:vAlign w:val="center"/>
+          </w:tcPr>
+          <w:p>
+            <w:r>
+              <w:t>Daily Statistic Accept</w:t>
+            </w:r>
+          </w:p>
+        </w:tc>
+      </w:tr>
+      <w:tr>
+        <w:tc>
+          <w:tcPr>
+            <w:tcW w:type="dxa" w:w="4844"/>
+            <w:vAlign w:val="center"/>
+          </w:tcPr>
+          <w:p>
+            <w:r>
+              <w:t>Màn hình đã duyệt</w:t>
+            </w:r>
+          </w:p>
+        </w:tc>
+        <w:tc>
+          <w:tcPr>
+            <w:tcW w:type="dxa" w:w="4844"/>
+            <w:vAlign w:val="center"/>
+          </w:tcPr>
+          <w:p>
+            <w:r>
+              <w:t>/FinishFlights/ListFinishedFlightAccepts.aspx?Menu_ID=905</w:t>
+            </w:r>
+          </w:p>
+        </w:tc>
+      </w:tr>
+      <w:tr>
+        <w:tc>
+          <w:tcPr>
+            <w:tcW w:type="dxa" w:w="4844"/>
+            <w:vAlign w:val="center"/>
+          </w:tcPr>
+          <w:p>
+            <w:r>
+              <w:t>Gói dữ liệu chính</w:t>
+            </w:r>
+          </w:p>
+        </w:tc>
+        <w:tc>
+          <w:tcPr>
+            <w:tcW w:type="dxa" w:w="4844"/>
+            <w:vAlign w:val="center"/>
+          </w:tcPr>
+          <w:p>
+            <w:r>
+              <w:t>FINISHED_STATUS_PKG; CANCELED_STATUS_PKG; MAKE_FINISHED</w:t>
+            </w:r>
+          </w:p>
+        </w:tc>
+      </w:tr>
+    </w:tbl>
+    <w:p/>
+    <w:p>
+      <w:r>
+        <w:t>Quy trình tiếp nhận các chuyến bay đã hoàn thành từ danh sách chuyến bay ngày, cho phép kiểm tra và hiệu chỉnh dữ liệu thống kê, xác nhận theo lô, sau đó tra cứu riêng dữ liệu đã được xác nhận. Phạm vi bao gồm chuyến bay hoàn thành và danh sách chuyến bay hủy có cùng cơ chế Accepted.</w:t>
+      </w:r>
+    </w:p>
+    <w:p>
+      <w:pPr>
+        <w:pStyle w:val="Heading1"/>
+      </w:pPr>
+      <w:r>
+        <w:t>12. Vai trò và luồng xử lý</w:t>
+      </w:r>
+    </w:p>
+    <w:tbl>
+      <w:tblPr>
+        <w:tblStyle w:val="TableGrid"/>
+        <w:tblW w:type="auto" w:w="0"/>
+        <w:jc w:val="center"/>
+        <w:tblLook w:firstColumn="1" w:firstRow="1" w:lastColumn="0" w:lastRow="0" w:noHBand="0" w:noVBand="1" w:val="04A0"/>
+      </w:tblPr>
+      <w:tblGrid>
+        <w:gridCol w:w="4844"/>
+        <w:gridCol w:w="4844"/>
+      </w:tblGrid>
+      <w:tr>
+        <w:trPr>
+          <w:tblHeader w:val="true"/>
+        </w:trPr>
+        <w:tc>
+          <w:tcPr>
+            <w:tcW w:type="dxa" w:w="4844"/>
+            <w:shd w:fill="D9EAF7"/>
+          </w:tcPr>
+          <w:p>
+            <w:r>
+              <w:rPr>
+                <w:b/>
+              </w:rPr>
+              <w:t>Vai trò</w:t>
+            </w:r>
+          </w:p>
+        </w:tc>
+        <w:tc>
+          <w:tcPr>
+            <w:tcW w:type="dxa" w:w="4844"/>
+            <w:shd w:fill="D9EAF7"/>
+          </w:tcPr>
+          <w:p>
+            <w:r>
+              <w:rPr>
+                <w:b/>
+              </w:rPr>
+              <w:t>Trách nhiệm</w:t>
+            </w:r>
+          </w:p>
+        </w:tc>
+      </w:tr>
+      <w:tr>
+        <w:tc>
+          <w:tcPr>
+            <w:tcW w:type="dxa" w:w="4844"/>
+            <w:vAlign w:val="center"/>
+          </w:tcPr>
+          <w:p>
+            <w:r>
+              <w:t>Người khai thác chuyến bay ngày</w:t>
+            </w:r>
+          </w:p>
+        </w:tc>
+        <w:tc>
+          <w:tcPr>
+            <w:tcW w:type="dxa" w:w="4844"/>
+            <w:vAlign w:val="center"/>
+          </w:tcPr>
+          <w:p>
+            <w:r>
+              <w:t>Kiểm tra danh sách và thực hiện Export Flight Finished.</w:t>
+            </w:r>
+          </w:p>
+        </w:tc>
+      </w:tr>
+      <w:tr>
+        <w:tc>
+          <w:tcPr>
+            <w:tcW w:type="dxa" w:w="4844"/>
+            <w:vAlign w:val="center"/>
+          </w:tcPr>
+          <w:p>
+            <w:r>
+              <w:t>Người lập thống kê</w:t>
+            </w:r>
+          </w:p>
+        </w:tc>
+        <w:tc>
+          <w:tcPr>
+            <w:tcW w:type="dxa" w:w="4844"/>
+            <w:vAlign w:val="center"/>
+          </w:tcPr>
+          <w:p>
+            <w:r>
+              <w:t>Tra cứu dữ liệu chưa Accepted, bổ sung, sửa, xóa, xuất Excel và gửi Accepted.</w:t>
+            </w:r>
+          </w:p>
+        </w:tc>
+      </w:tr>
+      <w:tr>
+        <w:tc>
+          <w:tcPr>
+            <w:tcW w:type="dxa" w:w="4844"/>
+            <w:vAlign w:val="center"/>
+          </w:tcPr>
+          <w:p>
+            <w:r>
+              <w:t>Người kiểm tra/khai thác</w:t>
+            </w:r>
+          </w:p>
+        </w:tc>
+        <w:tc>
+          <w:tcPr>
+            <w:tcW w:type="dxa" w:w="4844"/>
+            <w:vAlign w:val="center"/>
+          </w:tcPr>
+          <w:p>
+            <w:r>
+              <w:t>Tra cứu và xuất dữ liệu đã Accepted tại màn hình Daily Statistic Accept.</w:t>
+            </w:r>
+          </w:p>
+        </w:tc>
+      </w:tr>
+    </w:tbl>
+    <w:p/>
+    <w:p>
+      <w:r>
+        <w:t>Luồng chính: DaylyFlight → Export Flight Finished → Daily Statistic (chưa Accepted) → kiểm tra/hiệu chỉnh → Accepted → Daily Statistic Accept (đã Accepted).</w:t>
+      </w:r>
+    </w:p>
+    <w:tbl>
+      <w:tblPr>
+        <w:tblStyle w:val="TableGrid"/>
+        <w:tblW w:type="auto" w:w="0"/>
+        <w:jc w:val="center"/>
+        <w:tblLook w:firstColumn="1" w:firstRow="1" w:lastColumn="0" w:lastRow="0" w:noHBand="0" w:noVBand="1" w:val="04A0"/>
+      </w:tblPr>
+      <w:tblGrid>
+        <w:gridCol w:w="3230"/>
+        <w:gridCol w:w="3230"/>
+        <w:gridCol w:w="3230"/>
+      </w:tblGrid>
+      <w:tr>
+        <w:trPr>
+          <w:tblHeader w:val="true"/>
+        </w:trPr>
+        <w:tc>
+          <w:tcPr>
+            <w:tcW w:type="dxa" w:w="3230"/>
+            <w:shd w:fill="D9EAF7"/>
+          </w:tcPr>
+          <w:p>
+            <w:r>
+              <w:rPr>
+                <w:b/>
+              </w:rPr>
+              <w:t>Trạng thái</w:t>
+            </w:r>
+          </w:p>
+        </w:tc>
+        <w:tc>
+          <w:tcPr>
+            <w:tcW w:type="dxa" w:w="3230"/>
+            <w:shd w:fill="D9EAF7"/>
+          </w:tcPr>
+          <w:p>
+            <w:r>
+              <w:rPr>
+                <w:b/>
+              </w:rPr>
+              <w:t>Giá trị</w:t>
+            </w:r>
+          </w:p>
+        </w:tc>
+        <w:tc>
+          <w:tcPr>
+            <w:tcW w:type="dxa" w:w="3230"/>
+            <w:shd w:fill="D9EAF7"/>
+          </w:tcPr>
+          <w:p>
+            <w:r>
+              <w:rPr>
+                <w:b/>
+              </w:rPr>
+              <w:t>Màn hình hiển thị</w:t>
+            </w:r>
+          </w:p>
+        </w:tc>
+      </w:tr>
+      <w:tr>
+        <w:tc>
+          <w:tcPr>
+            <w:tcW w:type="dxa" w:w="3230"/>
+            <w:vAlign w:val="center"/>
+          </w:tcPr>
+          <w:p>
+            <w:r>
+              <w:t>Chưa Accepted</w:t>
+            </w:r>
+          </w:p>
+        </w:tc>
+        <w:tc>
+          <w:tcPr>
+            <w:tcW w:type="dxa" w:w="3230"/>
+            <w:vAlign w:val="center"/>
+          </w:tcPr>
+          <w:p>
+            <w:r>
+              <w:t>ISACCEPTED = 0</w:t>
+            </w:r>
+          </w:p>
+        </w:tc>
+        <w:tc>
+          <w:tcPr>
+            <w:tcW w:type="dxa" w:w="3230"/>
+            <w:vAlign w:val="center"/>
+          </w:tcPr>
+          <w:p>
+            <w:r>
+              <w:t>Daily Statistic - Menu_ID=71</w:t>
+            </w:r>
+          </w:p>
+        </w:tc>
+      </w:tr>
+      <w:tr>
+        <w:tc>
+          <w:tcPr>
+            <w:tcW w:type="dxa" w:w="3230"/>
+            <w:vAlign w:val="center"/>
+          </w:tcPr>
+          <w:p>
+            <w:r>
+              <w:t>Đã Accepted</w:t>
+            </w:r>
+          </w:p>
+        </w:tc>
+        <w:tc>
+          <w:tcPr>
+            <w:tcW w:type="dxa" w:w="3230"/>
+            <w:vAlign w:val="center"/>
+          </w:tcPr>
+          <w:p>
+            <w:r>
+              <w:t>ISACCEPTED = 1</w:t>
+            </w:r>
+          </w:p>
+        </w:tc>
+        <w:tc>
+          <w:tcPr>
+            <w:tcW w:type="dxa" w:w="3230"/>
+            <w:vAlign w:val="center"/>
+          </w:tcPr>
+          <w:p>
+            <w:r>
+              <w:t>Daily Statistic Accept - Menu_ID=905</w:t>
+            </w:r>
+          </w:p>
+        </w:tc>
+      </w:tr>
+    </w:tbl>
+    <w:p/>
+    <w:p>
+      <w:pPr>
+        <w:pStyle w:val="Heading1"/>
+      </w:pPr>
+      <w:r>
+        <w:t>13. Chức năng Export Flight Finished</w:t>
+      </w:r>
+    </w:p>
+    <w:tbl>
+      <w:tblPr>
+        <w:tblStyle w:val="TableGrid"/>
+        <w:tblW w:type="auto" w:w="0"/>
+        <w:jc w:val="center"/>
+        <w:tblLook w:firstColumn="1" w:firstRow="1" w:lastColumn="0" w:lastRow="0" w:noHBand="0" w:noVBand="1" w:val="04A0"/>
+      </w:tblPr>
+      <w:tblGrid>
+        <w:gridCol w:w="4844"/>
+        <w:gridCol w:w="4844"/>
+      </w:tblGrid>
+      <w:tr>
+        <w:trPr>
+          <w:tblHeader w:val="true"/>
+        </w:trPr>
+        <w:tc>
+          <w:tcPr>
+            <w:tcW w:type="dxa" w:w="4844"/>
+            <w:shd w:fill="D9EAF7"/>
+          </w:tcPr>
+          <w:p>
+            <w:r>
+              <w:rPr>
+                <w:b/>
+              </w:rPr>
+              <w:t>Mã</w:t>
+            </w:r>
+          </w:p>
+        </w:tc>
+        <w:tc>
+          <w:tcPr>
+            <w:tcW w:type="dxa" w:w="4844"/>
+            <w:shd w:fill="D9EAF7"/>
+          </w:tcPr>
+          <w:p>
+            <w:r>
+              <w:rPr>
+                <w:b/>
+              </w:rPr>
+              <w:t>Yêu cầu</w:t>
+            </w:r>
+          </w:p>
+        </w:tc>
+      </w:tr>
+      <w:tr>
+        <w:tc>
+          <w:tcPr>
+            <w:tcW w:type="dxa" w:w="4844"/>
+            <w:vAlign w:val="center"/>
+          </w:tcPr>
+          <w:p>
+            <w:r>
+              <w:t>FR-DS-01</w:t>
+            </w:r>
+          </w:p>
+        </w:tc>
+        <w:tc>
+          <w:tcPr>
+            <w:tcW w:type="dxa" w:w="4844"/>
+            <w:vAlign w:val="center"/>
+          </w:tcPr>
+          <w:p>
+            <w:r>
+              <w:t>Người dùng chọn Export Flight Finished từ màn hình DaylyFlight; hệ thống yêu cầu xác nhận trước khi xử lý.</w:t>
+            </w:r>
+          </w:p>
+        </w:tc>
+      </w:tr>
+      <w:tr>
+        <w:tc>
+          <w:tcPr>
+            <w:tcW w:type="dxa" w:w="4844"/>
+            <w:vAlign w:val="center"/>
+          </w:tcPr>
+          <w:p>
+            <w:r>
+              <w:t>FR-DS-02</w:t>
+            </w:r>
+          </w:p>
+        </w:tc>
+        <w:tc>
+          <w:tcPr>
+            <w:tcW w:type="dxa" w:w="4844"/>
+            <w:vAlign w:val="center"/>
+          </w:tcPr>
+          <w:p>
+            <w:r>
+              <w:t>Hệ thống thực hiện bước MAKE_FINISHED để chuyển các chuyến đủ điều kiện sang kho dữ liệu chuyến bay hoàn thành.</w:t>
+            </w:r>
+          </w:p>
+        </w:tc>
+      </w:tr>
+      <w:tr>
+        <w:tc>
+          <w:tcPr>
+            <w:tcW w:type="dxa" w:w="4844"/>
+            <w:vAlign w:val="center"/>
+          </w:tcPr>
+          <w:p>
+            <w:r>
+              <w:t>FR-DS-03</w:t>
+            </w:r>
+          </w:p>
+        </w:tc>
+        <w:tc>
+          <w:tcPr>
+            <w:tcW w:type="dxa" w:w="4844"/>
+            <w:vAlign w:val="center"/>
+          </w:tcPr>
+          <w:p>
+            <w:r>
+              <w:t>Sau khi chuyển thành công, hệ thống tải lại dữ liệu liên quan và phản ánh kết quả trên Daily Statistic.</w:t>
+            </w:r>
+          </w:p>
+        </w:tc>
+      </w:tr>
+      <w:tr>
+        <w:tc>
+          <w:tcPr>
+            <w:tcW w:type="dxa" w:w="4844"/>
+            <w:vAlign w:val="center"/>
+          </w:tcPr>
+          <w:p>
+            <w:r>
+              <w:t>FR-DS-04</w:t>
+            </w:r>
+          </w:p>
+        </w:tc>
+        <w:tc>
+          <w:tcPr>
+            <w:tcW w:type="dxa" w:w="4844"/>
+            <w:vAlign w:val="center"/>
+          </w:tcPr>
+          <w:p>
+            <w:r>
+              <w:t>Nếu có lỗi ở bước tạo dữ liệu hoàn thành hoặc lấy dữ liệu export, hệ thống dừng quy trình và thông báo lỗi.</w:t>
+            </w:r>
+          </w:p>
+        </w:tc>
+      </w:tr>
+    </w:tbl>
+    <w:p/>
+    <w:p>
+      <w:r>
+        <w:t>Dữ liệu được chuyển phải giữ được các thông tin nhận dạng và khai thác chính như số phép, hãng khai thác, callsign, đăng ký, loại tàu bay, mục đích, sân bay đi/đến, ngày bay, ETD/ETA, ATD/ATA, đường bay và ghi chú.</w:t>
+      </w:r>
+    </w:p>
+    <w:p>
+      <w:pPr>
+        <w:pStyle w:val="Heading1"/>
+      </w:pPr>
+      <w:r>
+        <w:t>14. Chức năng Daily Statistic</w:t>
+      </w:r>
+    </w:p>
+    <w:p>
+      <w:pPr>
+        <w:pStyle w:val="Heading2"/>
+      </w:pPr>
+      <w:r>
+        <w:t>14.1. Tra cứu</w:t>
+      </w:r>
+    </w:p>
+    <w:p>
+      <w:r>
+        <w:t>Màn hình mặc định truy vấn dữ liệu chưa Accepted (P_ISACCEPTED = 0). Bộ lọc gồm: số phép, đăng ký, sân bay đi/đến, mục đích, hãng khai thác, loại phép, loại tàu bay, callsign, VIA/FPL VIA, remark, ETD/ETA, ATD/ATA, khoảng ngày, khung giờ, FIR và các nhóm loại chuyến bay. Danh sách hỗ trợ phân trang.</w:t>
+      </w:r>
+    </w:p>
+    <w:p>
+      <w:pPr>
+        <w:pStyle w:val="Heading2"/>
+      </w:pPr>
+      <w:r>
+        <w:t>14.2. Quản lý dữ liệu</w:t>
+      </w:r>
+    </w:p>
+    <w:tbl>
+      <w:tblPr>
+        <w:tblStyle w:val="TableGrid"/>
+        <w:tblW w:type="auto" w:w="0"/>
+        <w:jc w:val="center"/>
+        <w:tblLook w:firstColumn="1" w:firstRow="1" w:lastColumn="0" w:lastRow="0" w:noHBand="0" w:noVBand="1" w:val="04A0"/>
+      </w:tblPr>
+      <w:tblGrid>
+        <w:gridCol w:w="4844"/>
+        <w:gridCol w:w="4844"/>
+      </w:tblGrid>
+      <w:tr>
+        <w:trPr>
+          <w:tblHeader w:val="true"/>
+        </w:trPr>
+        <w:tc>
+          <w:tcPr>
+            <w:tcW w:type="dxa" w:w="4844"/>
+            <w:shd w:fill="D9EAF7"/>
+          </w:tcPr>
+          <w:p>
+            <w:r>
+              <w:rPr>
+                <w:b/>
+              </w:rPr>
+              <w:t>Mã</w:t>
+            </w:r>
+          </w:p>
+        </w:tc>
+        <w:tc>
+          <w:tcPr>
+            <w:tcW w:type="dxa" w:w="4844"/>
+            <w:shd w:fill="D9EAF7"/>
+          </w:tcPr>
+          <w:p>
+            <w:r>
+              <w:rPr>
+                <w:b/>
+              </w:rPr>
+              <w:t>Yêu cầu</w:t>
+            </w:r>
+          </w:p>
+        </w:tc>
+      </w:tr>
+      <w:tr>
+        <w:tc>
+          <w:tcPr>
+            <w:tcW w:type="dxa" w:w="4844"/>
+            <w:vAlign w:val="center"/>
+          </w:tcPr>
+          <w:p>
+            <w:r>
+              <w:t>FR-DS-05</w:t>
+            </w:r>
+          </w:p>
+        </w:tc>
+        <w:tc>
+          <w:tcPr>
+            <w:tcW w:type="dxa" w:w="4844"/>
+            <w:vAlign w:val="center"/>
+          </w:tcPr>
+          <w:p>
+            <w:r>
+              <w:t>Hiển thị tổng số bản ghi và danh sách chuyến bay hoàn thành theo bộ lọc.</w:t>
+            </w:r>
+          </w:p>
+        </w:tc>
+      </w:tr>
+      <w:tr>
+        <w:tc>
+          <w:tcPr>
+            <w:tcW w:type="dxa" w:w="4844"/>
+            <w:vAlign w:val="center"/>
+          </w:tcPr>
+          <w:p>
+            <w:r>
+              <w:t>FR-DS-06</w:t>
+            </w:r>
+          </w:p>
+        </w:tc>
+        <w:tc>
+          <w:tcPr>
+            <w:tcW w:type="dxa" w:w="4844"/>
+            <w:vAlign w:val="center"/>
+          </w:tcPr>
+          <w:p>
+            <w:r>
+              <w:t>Cho phép thêm, sửa, lưu hoặc xóa dữ liệu theo quyền được cấp; các dòng đang sửa phải được lưu trước khi Accepted.</w:t>
+            </w:r>
+          </w:p>
+        </w:tc>
+      </w:tr>
+      <w:tr>
+        <w:tc>
+          <w:tcPr>
+            <w:tcW w:type="dxa" w:w="4844"/>
+            <w:vAlign w:val="center"/>
+          </w:tcPr>
+          <w:p>
+            <w:r>
+              <w:t>FR-DS-07</w:t>
+            </w:r>
+          </w:p>
+        </w:tc>
+        <w:tc>
+          <w:tcPr>
+            <w:tcW w:type="dxa" w:w="4844"/>
+            <w:vAlign w:val="center"/>
+          </w:tcPr>
+          <w:p>
+            <w:r>
+              <w:t>Cho phép xuất Excel theo bộ lọc và các cột người dùng lựa chọn; dữ liệu export không bị giới hạn bởi trang hiện tại.</w:t>
+            </w:r>
+          </w:p>
+        </w:tc>
+      </w:tr>
+      <w:tr>
+        <w:tc>
+          <w:tcPr>
+            <w:tcW w:type="dxa" w:w="4844"/>
+            <w:vAlign w:val="center"/>
+          </w:tcPr>
+          <w:p>
+            <w:r>
+              <w:t>FR-DS-08</w:t>
+            </w:r>
+          </w:p>
+        </w:tc>
+        <w:tc>
+          <w:tcPr>
+            <w:tcW w:type="dxa" w:w="4844"/>
+            <w:vAlign w:val="center"/>
+          </w:tcPr>
+          <w:p>
+            <w:r>
+              <w:t>Hỗ trợ các danh sách nghiệp vụ: Hoàn thành, Cancel, bay quá nội, quốc tế về và chốt số liệu theo cấu hình màn hình.</w:t>
+            </w:r>
+          </w:p>
+        </w:tc>
+      </w:tr>
+    </w:tbl>
+    <w:p/>
+    <w:p>
+      <w:pPr>
+        <w:pStyle w:val="Heading2"/>
+      </w:pPr>
+      <w:r>
+        <w:t>14.3. Accepted dữ liệu</w:t>
+      </w:r>
+    </w:p>
+    <w:tbl>
+      <w:tblPr>
+        <w:tblStyle w:val="TableGrid"/>
+        <w:tblW w:type="auto" w:w="0"/>
+        <w:jc w:val="center"/>
+        <w:tblLook w:firstColumn="1" w:firstRow="1" w:lastColumn="0" w:lastRow="0" w:noHBand="0" w:noVBand="1" w:val="04A0"/>
+      </w:tblPr>
+      <w:tblGrid>
+        <w:gridCol w:w="4844"/>
+        <w:gridCol w:w="4844"/>
+      </w:tblGrid>
+      <w:tr>
+        <w:trPr>
+          <w:tblHeader w:val="true"/>
+        </w:trPr>
+        <w:tc>
+          <w:tcPr>
+            <w:tcW w:type="dxa" w:w="4844"/>
+            <w:shd w:fill="D9EAF7"/>
+          </w:tcPr>
+          <w:p>
+            <w:r>
+              <w:rPr>
+                <w:b/>
+              </w:rPr>
+              <w:t>Mã</w:t>
+            </w:r>
+          </w:p>
+        </w:tc>
+        <w:tc>
+          <w:tcPr>
+            <w:tcW w:type="dxa" w:w="4844"/>
+            <w:shd w:fill="D9EAF7"/>
+          </w:tcPr>
+          <w:p>
+            <w:r>
+              <w:rPr>
+                <w:b/>
+              </w:rPr>
+              <w:t>Yêu cầu</w:t>
+            </w:r>
+          </w:p>
+        </w:tc>
+      </w:tr>
+      <w:tr>
+        <w:tc>
+          <w:tcPr>
+            <w:tcW w:type="dxa" w:w="4844"/>
+            <w:vAlign w:val="center"/>
+          </w:tcPr>
+          <w:p>
+            <w:r>
+              <w:t>FR-DS-09</w:t>
+            </w:r>
+          </w:p>
+        </w:tc>
+        <w:tc>
+          <w:tcPr>
+            <w:tcW w:type="dxa" w:w="4844"/>
+            <w:vAlign w:val="center"/>
+          </w:tcPr>
+          <w:p>
+            <w:r>
+              <w:t>Nút Accepted chỉ áp dụng cho danh sách Hoàn thành hoặc Cancel tương ứng.</w:t>
+            </w:r>
+          </w:p>
+        </w:tc>
+      </w:tr>
+      <w:tr>
+        <w:tc>
+          <w:tcPr>
+            <w:tcW w:type="dxa" w:w="4844"/>
+            <w:vAlign w:val="center"/>
+          </w:tcPr>
+          <w:p>
+            <w:r>
+              <w:t>FR-DS-10</w:t>
+            </w:r>
+          </w:p>
+        </w:tc>
+        <w:tc>
+          <w:tcPr>
+            <w:tcW w:type="dxa" w:w="4844"/>
+            <w:vAlign w:val="center"/>
+          </w:tcPr>
+          <w:p>
+            <w:r>
+              <w:t>Hệ thống lấy các ID hợp lệ đang hiển thị trong kết quả, loại trùng và yêu cầu người dùng xác nhận số lượng.</w:t>
+            </w:r>
+          </w:p>
+        </w:tc>
+      </w:tr>
+      <w:tr>
+        <w:tc>
+          <w:tcPr>
+            <w:tcW w:type="dxa" w:w="4844"/>
+            <w:vAlign w:val="center"/>
+          </w:tcPr>
+          <w:p>
+            <w:r>
+              <w:t>FR-DS-11</w:t>
+            </w:r>
+          </w:p>
+        </w:tc>
+        <w:tc>
+          <w:tcPr>
+            <w:tcW w:type="dxa" w:w="4844"/>
+            <w:vAlign w:val="center"/>
+          </w:tcPr>
+          <w:p>
+            <w:r>
+              <w:t>Danh sách ID được chia thành nhiều lô để không vượt giới hạn dữ liệu yêu cầu; mỗi lô gửi kèm tài khoản thực hiện.</w:t>
+            </w:r>
+          </w:p>
+        </w:tc>
+      </w:tr>
+      <w:tr>
+        <w:tc>
+          <w:tcPr>
+            <w:tcW w:type="dxa" w:w="4844"/>
+            <w:vAlign w:val="center"/>
+          </w:tcPr>
+          <w:p>
+            <w:r>
+              <w:t>FR-DS-12</w:t>
+            </w:r>
+          </w:p>
+        </w:tc>
+        <w:tc>
+          <w:tcPr>
+            <w:tcW w:type="dxa" w:w="4844"/>
+            <w:vAlign w:val="center"/>
+          </w:tcPr>
+          <w:p>
+            <w:r>
+              <w:t>FINISHED_STATUS_PKG.ACCEPT_FINISHED_FLIGHTS xử lý chuyến hoàn thành; CANCELED_STATUS_PKG.ACCEPT_CANCELED_FLIGHTS xử lý chuyến hủy.</w:t>
+            </w:r>
+          </w:p>
+        </w:tc>
+      </w:tr>
+      <w:tr>
+        <w:tc>
+          <w:tcPr>
+            <w:tcW w:type="dxa" w:w="4844"/>
+            <w:vAlign w:val="center"/>
+          </w:tcPr>
+          <w:p>
+            <w:r>
+              <w:t>FR-DS-13</w:t>
+            </w:r>
+          </w:p>
+        </w:tc>
+        <w:tc>
+          <w:tcPr>
+            <w:tcW w:type="dxa" w:w="4844"/>
+            <w:vAlign w:val="center"/>
+          </w:tcPr>
+          <w:p>
+            <w:r>
+              <w:t>Sau khi thành công, ISACCEPTED chuyển từ 0 sang 1, danh sách chưa Accepted được tải lại và thông báo tổng số bản ghi đã xử lý.</w:t>
+            </w:r>
+          </w:p>
+        </w:tc>
+      </w:tr>
+      <w:tr>
+        <w:tc>
+          <w:tcPr>
+            <w:tcW w:type="dxa" w:w="4844"/>
+            <w:vAlign w:val="center"/>
+          </w:tcPr>
+          <w:p>
+            <w:r>
+              <w:t>FR-DS-14</w:t>
+            </w:r>
+          </w:p>
+        </w:tc>
+        <w:tc>
+          <w:tcPr>
+            <w:tcW w:type="dxa" w:w="4844"/>
+            <w:vAlign w:val="center"/>
+          </w:tcPr>
+          <w:p>
+            <w:r>
+              <w:t>Nếu một lô lỗi, dừng các lô còn lại và thông báo số bản ghi đã cập nhật trước khi lỗi.</w:t>
+            </w:r>
+          </w:p>
+        </w:tc>
+      </w:tr>
+    </w:tbl>
+    <w:p/>
+    <w:p>
+      <w:pPr>
+        <w:pStyle w:val="Heading1"/>
+      </w:pPr>
+      <w:r>
+        <w:t>15. Chức năng Daily Statistic Accept</w:t>
+      </w:r>
+    </w:p>
+    <w:tbl>
+      <w:tblPr>
+        <w:tblStyle w:val="TableGrid"/>
+        <w:tblW w:type="auto" w:w="0"/>
+        <w:jc w:val="center"/>
+        <w:tblLook w:firstColumn="1" w:firstRow="1" w:lastColumn="0" w:lastRow="0" w:noHBand="0" w:noVBand="1" w:val="04A0"/>
+      </w:tblPr>
+      <w:tblGrid>
+        <w:gridCol w:w="4844"/>
+        <w:gridCol w:w="4844"/>
+      </w:tblGrid>
+      <w:tr>
+        <w:trPr>
+          <w:tblHeader w:val="true"/>
+        </w:trPr>
+        <w:tc>
+          <w:tcPr>
+            <w:tcW w:type="dxa" w:w="4844"/>
+            <w:shd w:fill="D9EAF7"/>
+          </w:tcPr>
+          <w:p>
+            <w:r>
+              <w:rPr>
+                <w:b/>
+              </w:rPr>
+              <w:t>Mã</w:t>
+            </w:r>
+          </w:p>
+        </w:tc>
+        <w:tc>
+          <w:tcPr>
+            <w:tcW w:type="dxa" w:w="4844"/>
+            <w:shd w:fill="D9EAF7"/>
+          </w:tcPr>
+          <w:p>
+            <w:r>
+              <w:rPr>
+                <w:b/>
+              </w:rPr>
+              <w:t>Yêu cầu</w:t>
+            </w:r>
+          </w:p>
+        </w:tc>
+      </w:tr>
+      <w:tr>
+        <w:tc>
+          <w:tcPr>
+            <w:tcW w:type="dxa" w:w="4844"/>
+            <w:vAlign w:val="center"/>
+          </w:tcPr>
+          <w:p>
+            <w:r>
+              <w:t>FR-DS-15</w:t>
+            </w:r>
+          </w:p>
+        </w:tc>
+        <w:tc>
+          <w:tcPr>
+            <w:tcW w:type="dxa" w:w="4844"/>
+            <w:vAlign w:val="center"/>
+          </w:tcPr>
+          <w:p>
+            <w:r>
+              <w:t>Màn hình chỉ truy vấn dữ liệu đã Accepted (P_ISACCEPTED = 1) cho danh sách Hoàn thành và Cancel.</w:t>
+            </w:r>
+          </w:p>
+        </w:tc>
+      </w:tr>
+      <w:tr>
+        <w:tc>
+          <w:tcPr>
+            <w:tcW w:type="dxa" w:w="4844"/>
+            <w:vAlign w:val="center"/>
+          </w:tcPr>
+          <w:p>
+            <w:r>
+              <w:t>FR-DS-16</w:t>
+            </w:r>
+          </w:p>
+        </w:tc>
+        <w:tc>
+          <w:tcPr>
+            <w:tcW w:type="dxa" w:w="4844"/>
+            <w:vAlign w:val="center"/>
+          </w:tcPr>
+          <w:p>
+            <w:r>
+              <w:t>Cho phép tra cứu theo cùng nhóm tiêu chí nghiệp vụ của Daily Statistic và hiển thị tổng số bản ghi.</w:t>
+            </w:r>
+          </w:p>
+        </w:tc>
+      </w:tr>
+      <w:tr>
+        <w:tc>
+          <w:tcPr>
+            <w:tcW w:type="dxa" w:w="4844"/>
+            <w:vAlign w:val="center"/>
+          </w:tcPr>
+          <w:p>
+            <w:r>
+              <w:t>FR-DS-17</w:t>
+            </w:r>
+          </w:p>
+        </w:tc>
+        <w:tc>
+          <w:tcPr>
+            <w:tcW w:type="dxa" w:w="4844"/>
+            <w:vAlign w:val="center"/>
+          </w:tcPr>
+          <w:p>
+            <w:r>
+              <w:t>Cho phép phân trang và xuất Excel toàn bộ kết quả đã Accepted theo bộ lọc.</w:t>
+            </w:r>
+          </w:p>
+        </w:tc>
+      </w:tr>
+      <w:tr>
+        <w:tc>
+          <w:tcPr>
+            <w:tcW w:type="dxa" w:w="4844"/>
+            <w:vAlign w:val="center"/>
+          </w:tcPr>
+          <w:p>
+            <w:r>
+              <w:t>FR-DS-18</w:t>
+            </w:r>
+          </w:p>
+        </w:tc>
+        <w:tc>
+          <w:tcPr>
+            <w:tcW w:type="dxa" w:w="4844"/>
+            <w:vAlign w:val="center"/>
+          </w:tcPr>
+          <w:p>
+            <w:r>
+              <w:t>Màn hình đã Accepted không hiển thị thao tác Accepted lần nữa; dữ liệu phải tách biệt với danh sách chưa Accepted.</w:t>
+            </w:r>
+          </w:p>
+        </w:tc>
+      </w:tr>
+    </w:tbl>
+    <w:p/>
+    <w:p>
+      <w:pPr>
+        <w:pStyle w:val="Heading1"/>
+      </w:pPr>
+      <w:r>
+        <w:t>16. Quy tắc nghiệp vụ và phi chức năng</w:t>
+      </w:r>
+    </w:p>
+    <w:tbl>
+      <w:tblPr>
+        <w:tblStyle w:val="TableGrid"/>
+        <w:tblW w:type="auto" w:w="0"/>
+        <w:jc w:val="center"/>
+        <w:tblLook w:firstColumn="1" w:firstRow="1" w:lastColumn="0" w:lastRow="0" w:noHBand="0" w:noVBand="1" w:val="04A0"/>
+      </w:tblPr>
+      <w:tblGrid>
+        <w:gridCol w:w="4844"/>
+        <w:gridCol w:w="4844"/>
+      </w:tblGrid>
+      <w:tr>
+        <w:trPr>
+          <w:tblHeader w:val="true"/>
+        </w:trPr>
+        <w:tc>
+          <w:tcPr>
+            <w:tcW w:type="dxa" w:w="4844"/>
+            <w:shd w:fill="D9EAF7"/>
+          </w:tcPr>
+          <w:p>
+            <w:r>
+              <w:rPr>
+                <w:b/>
+              </w:rPr>
+              <w:t>Mã</w:t>
+            </w:r>
+          </w:p>
+        </w:tc>
+        <w:tc>
+          <w:tcPr>
+            <w:tcW w:type="dxa" w:w="4844"/>
+            <w:shd w:fill="D9EAF7"/>
+          </w:tcPr>
+          <w:p>
+            <w:r>
+              <w:rPr>
+                <w:b/>
+              </w:rPr>
+              <w:t>Quy tắc/yêu cầu</w:t>
+            </w:r>
+          </w:p>
+        </w:tc>
+      </w:tr>
+      <w:tr>
+        <w:tc>
+          <w:tcPr>
+            <w:tcW w:type="dxa" w:w="4844"/>
+            <w:vAlign w:val="center"/>
+          </w:tcPr>
+          <w:p>
+            <w:r>
+              <w:t>BR-DS-01</w:t>
+            </w:r>
+          </w:p>
+        </w:tc>
+        <w:tc>
+          <w:tcPr>
+            <w:tcW w:type="dxa" w:w="4844"/>
+            <w:vAlign w:val="center"/>
+          </w:tcPr>
+          <w:p>
+            <w:r>
+              <w:t>Chỉ các chuyến đủ điều kiện kết thúc mới được chuyển sang dữ liệu Finished.</w:t>
+            </w:r>
+          </w:p>
+        </w:tc>
+      </w:tr>
+      <w:tr>
+        <w:tc>
+          <w:tcPr>
+            <w:tcW w:type="dxa" w:w="4844"/>
+            <w:vAlign w:val="center"/>
+          </w:tcPr>
+          <w:p>
+            <w:r>
+              <w:t>BR-DS-02</w:t>
+            </w:r>
+          </w:p>
+        </w:tc>
+        <w:tc>
+          <w:tcPr>
+            <w:tcW w:type="dxa" w:w="4844"/>
+            <w:vAlign w:val="center"/>
+          </w:tcPr>
+          <w:p>
+            <w:r>
+              <w:t>Bản ghi ISACCEPTED = 0 thuộc Daily Statistic; ISACCEPTED = 1 thuộc Daily Statistic Accept.</w:t>
+            </w:r>
+          </w:p>
+        </w:tc>
+      </w:tr>
+      <w:tr>
+        <w:tc>
+          <w:tcPr>
+            <w:tcW w:type="dxa" w:w="4844"/>
+            <w:vAlign w:val="center"/>
+          </w:tcPr>
+          <w:p>
+            <w:r>
+              <w:t>BR-DS-03</w:t>
+            </w:r>
+          </w:p>
+        </w:tc>
+        <w:tc>
+          <w:tcPr>
+            <w:tcW w:type="dxa" w:w="4844"/>
+            <w:vAlign w:val="center"/>
+          </w:tcPr>
+          <w:p>
+            <w:r>
+              <w:t>Không Accepted khi còn dòng đã sửa nhưng chưa lưu.</w:t>
+            </w:r>
+          </w:p>
+        </w:tc>
+      </w:tr>
+      <w:tr>
+        <w:tc>
+          <w:tcPr>
+            <w:tcW w:type="dxa" w:w="4844"/>
+            <w:vAlign w:val="center"/>
+          </w:tcPr>
+          <w:p>
+            <w:r>
+              <w:t>BR-DS-04</w:t>
+            </w:r>
+          </w:p>
+        </w:tc>
+        <w:tc>
+          <w:tcPr>
+            <w:tcW w:type="dxa" w:w="4844"/>
+            <w:vAlign w:val="center"/>
+          </w:tcPr>
+          <w:p>
+            <w:r>
+              <w:t>Accepted chỉ xử lý các ID hợp lệ đang hiển thị trong kết quả người dùng đã xác nhận.</w:t>
+            </w:r>
+          </w:p>
+        </w:tc>
+      </w:tr>
+      <w:tr>
+        <w:tc>
+          <w:tcPr>
+            <w:tcW w:type="dxa" w:w="4844"/>
+            <w:vAlign w:val="center"/>
+          </w:tcPr>
+          <w:p>
+            <w:r>
+              <w:t>BR-DS-05</w:t>
+            </w:r>
+          </w:p>
+        </w:tc>
+        <w:tc>
+          <w:tcPr>
+            <w:tcW w:type="dxa" w:w="4844"/>
+            <w:vAlign w:val="center"/>
+          </w:tcPr>
+          <w:p>
+            <w:r>
+              <w:t>Phải ghi tài khoản thực hiện Accepted và nhật ký hành động tại cơ sở dữ liệu.</w:t>
+            </w:r>
+          </w:p>
+        </w:tc>
+      </w:tr>
+      <w:tr>
+        <w:tc>
+          <w:tcPr>
+            <w:tcW w:type="dxa" w:w="4844"/>
+            <w:vAlign w:val="center"/>
+          </w:tcPr>
+          <w:p>
+            <w:r>
+              <w:t>BR-DS-06</w:t>
+            </w:r>
+          </w:p>
+        </w:tc>
+        <w:tc>
+          <w:tcPr>
+            <w:tcW w:type="dxa" w:w="4844"/>
+            <w:vAlign w:val="center"/>
+          </w:tcPr>
+          <w:p>
+            <w:r>
+              <w:t>Không tự động Accepted bản ghi mới khi danh sách thay đổi sau lúc hiển thị.</w:t>
+            </w:r>
+          </w:p>
+        </w:tc>
+      </w:tr>
+      <w:tr>
+        <w:tc>
+          <w:tcPr>
+            <w:tcW w:type="dxa" w:w="4844"/>
+            <w:vAlign w:val="center"/>
+          </w:tcPr>
+          <w:p>
+            <w:r>
+              <w:t>NFR-DS-01</w:t>
+            </w:r>
+          </w:p>
+        </w:tc>
+        <w:tc>
+          <w:tcPr>
+            <w:tcW w:type="dxa" w:w="4844"/>
+            <w:vAlign w:val="center"/>
+          </w:tcPr>
+          <w:p>
+            <w:r>
+              <w:t>Kiểm tra đăng nhập, quyền menu và quyền thao tác ở cả giao diện và máy chủ.</w:t>
+            </w:r>
+          </w:p>
+        </w:tc>
+      </w:tr>
+      <w:tr>
+        <w:tc>
+          <w:tcPr>
+            <w:tcW w:type="dxa" w:w="4844"/>
+            <w:vAlign w:val="center"/>
+          </w:tcPr>
+          <w:p>
+            <w:r>
+              <w:t>NFR-DS-02</w:t>
+            </w:r>
+          </w:p>
+        </w:tc>
+        <w:tc>
+          <w:tcPr>
+            <w:tcW w:type="dxa" w:w="4844"/>
+            <w:vAlign w:val="center"/>
+          </w:tcPr>
+          <w:p>
+            <w:r>
+              <w:t>Phân trang danh sách; export dùng truy vấn riêng để lấy đủ kết quả.</w:t>
+            </w:r>
+          </w:p>
+        </w:tc>
+      </w:tr>
+      <w:tr>
+        <w:tc>
+          <w:tcPr>
+            <w:tcW w:type="dxa" w:w="4844"/>
+            <w:vAlign w:val="center"/>
+          </w:tcPr>
+          <w:p>
+            <w:r>
+              <w:t>NFR-DS-03</w:t>
+            </w:r>
+          </w:p>
+        </w:tc>
+        <w:tc>
+          <w:tcPr>
+            <w:tcW w:type="dxa" w:w="4844"/>
+            <w:vAlign w:val="center"/>
+          </w:tcPr>
+          <w:p>
+            <w:r>
+              <w:t>Khi API/Oracle lỗi, không báo thành công sai và phải cho phép người dùng thử lại.</w:t>
+            </w:r>
+          </w:p>
+        </w:tc>
+      </w:tr>
+      <w:tr>
+        <w:tc>
+          <w:tcPr>
+            <w:tcW w:type="dxa" w:w="4844"/>
+            <w:vAlign w:val="center"/>
+          </w:tcPr>
+          <w:p>
+            <w:r>
+              <w:t>NFR-DS-04</w:t>
+            </w:r>
+          </w:p>
+        </w:tc>
+        <w:tc>
+          <w:tcPr>
+            <w:tcW w:type="dxa" w:w="4844"/>
+            <w:vAlign w:val="center"/>
+          </w:tcPr>
+          <w:p>
+            <w:r>
+              <w:t>Thao tác lô phải thông báo chính xác tổng số bản ghi thành công trước khi gặp lỗi.</w:t>
+            </w:r>
+          </w:p>
+        </w:tc>
+      </w:tr>
+    </w:tbl>
+    <w:p/>
+    <w:p>
+      <w:pPr>
+        <w:pStyle w:val="Heading1"/>
+      </w:pPr>
+      <w:r>
+        <w:t>17. Tiêu chí nghiệm thu và truy vết</w:t>
+      </w:r>
+    </w:p>
+    <w:tbl>
+      <w:tblPr>
+        <w:tblStyle w:val="TableGrid"/>
+        <w:tblW w:type="auto" w:w="0"/>
+        <w:jc w:val="center"/>
+        <w:tblLook w:firstColumn="1" w:firstRow="1" w:lastColumn="0" w:lastRow="0" w:noHBand="0" w:noVBand="1" w:val="04A0"/>
+      </w:tblPr>
+      <w:tblGrid>
+        <w:gridCol w:w="3230"/>
+        <w:gridCol w:w="3230"/>
+        <w:gridCol w:w="3230"/>
+      </w:tblGrid>
+      <w:tr>
+        <w:trPr>
+          <w:tblHeader w:val="true"/>
+        </w:trPr>
+        <w:tc>
+          <w:tcPr>
+            <w:tcW w:type="dxa" w:w="3230"/>
+            <w:shd w:fill="D9EAF7"/>
+          </w:tcPr>
+          <w:p>
+            <w:r>
+              <w:rPr>
+                <w:b/>
+              </w:rPr>
+              <w:t>Mã kiểm thử</w:t>
+            </w:r>
+          </w:p>
+        </w:tc>
+        <w:tc>
+          <w:tcPr>
+            <w:tcW w:type="dxa" w:w="3230"/>
+            <w:shd w:fill="D9EAF7"/>
+          </w:tcPr>
+          <w:p>
+            <w:r>
+              <w:rPr>
+                <w:b/>
+              </w:rPr>
+              <w:t>Nội dung</w:t>
+            </w:r>
+          </w:p>
+        </w:tc>
+        <w:tc>
+          <w:tcPr>
+            <w:tcW w:type="dxa" w:w="3230"/>
+            <w:shd w:fill="D9EAF7"/>
+          </w:tcPr>
+          <w:p>
+            <w:r>
+              <w:rPr>
+                <w:b/>
+              </w:rPr>
+              <w:t>Kết quả mong đợi</w:t>
+            </w:r>
+          </w:p>
+        </w:tc>
+      </w:tr>
+      <w:tr>
+        <w:tc>
+          <w:tcPr>
+            <w:tcW w:type="dxa" w:w="3230"/>
+            <w:vAlign w:val="center"/>
+          </w:tcPr>
+          <w:p>
+            <w:r>
+              <w:t>TC-DS-01</w:t>
+            </w:r>
+          </w:p>
+        </w:tc>
+        <w:tc>
+          <w:tcPr>
+            <w:tcW w:type="dxa" w:w="3230"/>
+            <w:vAlign w:val="center"/>
+          </w:tcPr>
+          <w:p>
+            <w:r>
+              <w:t>Export Flight Finished sau khi xác nhận</w:t>
+            </w:r>
+          </w:p>
+        </w:tc>
+        <w:tc>
+          <w:tcPr>
+            <w:tcW w:type="dxa" w:w="3230"/>
+            <w:vAlign w:val="center"/>
+          </w:tcPr>
+          <w:p>
+            <w:r>
+              <w:t>Dữ liệu đủ điều kiện xuất hiện tại Daily Statistic</w:t>
+            </w:r>
+          </w:p>
+        </w:tc>
+      </w:tr>
+      <w:tr>
+        <w:tc>
+          <w:tcPr>
+            <w:tcW w:type="dxa" w:w="3230"/>
+            <w:vAlign w:val="center"/>
+          </w:tcPr>
+          <w:p>
+            <w:r>
+              <w:t>TC-DS-02</w:t>
+            </w:r>
+          </w:p>
+        </w:tc>
+        <w:tc>
+          <w:tcPr>
+            <w:tcW w:type="dxa" w:w="3230"/>
+            <w:vAlign w:val="center"/>
+          </w:tcPr>
+          <w:p>
+            <w:r>
+              <w:t>Hủy xác nhận Export Flight Finished</w:t>
+            </w:r>
+          </w:p>
+        </w:tc>
+        <w:tc>
+          <w:tcPr>
+            <w:tcW w:type="dxa" w:w="3230"/>
+            <w:vAlign w:val="center"/>
+          </w:tcPr>
+          <w:p>
+            <w:r>
+              <w:t>Không chuyển dữ liệu</w:t>
+            </w:r>
+          </w:p>
+        </w:tc>
+      </w:tr>
+      <w:tr>
+        <w:tc>
+          <w:tcPr>
+            <w:tcW w:type="dxa" w:w="3230"/>
+            <w:vAlign w:val="center"/>
+          </w:tcPr>
+          <w:p>
+            <w:r>
+              <w:t>TC-DS-03</w:t>
+            </w:r>
+          </w:p>
+        </w:tc>
+        <w:tc>
+          <w:tcPr>
+            <w:tcW w:type="dxa" w:w="3230"/>
+            <w:vAlign w:val="center"/>
+          </w:tcPr>
+          <w:p>
+            <w:r>
+              <w:t>MAKE_FINISHED hoặc API lỗi</w:t>
+            </w:r>
+          </w:p>
+        </w:tc>
+        <w:tc>
+          <w:tcPr>
+            <w:tcW w:type="dxa" w:w="3230"/>
+            <w:vAlign w:val="center"/>
+          </w:tcPr>
+          <w:p>
+            <w:r>
+              <w:t>Dừng xử lý và hiển thị lỗi</w:t>
+            </w:r>
+          </w:p>
+        </w:tc>
+      </w:tr>
+      <w:tr>
+        <w:tc>
+          <w:tcPr>
+            <w:tcW w:type="dxa" w:w="3230"/>
+            <w:vAlign w:val="center"/>
+          </w:tcPr>
+          <w:p>
+            <w:r>
+              <w:t>TC-DS-04</w:t>
+            </w:r>
+          </w:p>
+        </w:tc>
+        <w:tc>
+          <w:tcPr>
+            <w:tcW w:type="dxa" w:w="3230"/>
+            <w:vAlign w:val="center"/>
+          </w:tcPr>
+          <w:p>
+            <w:r>
+              <w:t>Tra cứu Daily Statistic</w:t>
+            </w:r>
+          </w:p>
+        </w:tc>
+        <w:tc>
+          <w:tcPr>
+            <w:tcW w:type="dxa" w:w="3230"/>
+            <w:vAlign w:val="center"/>
+          </w:tcPr>
+          <w:p>
+            <w:r>
+              <w:t>Chỉ trả bản ghi ISACCEPTED = 0 phù hợp bộ lọc</w:t>
+            </w:r>
+          </w:p>
+        </w:tc>
+      </w:tr>
+      <w:tr>
+        <w:tc>
+          <w:tcPr>
+            <w:tcW w:type="dxa" w:w="3230"/>
+            <w:vAlign w:val="center"/>
+          </w:tcPr>
+          <w:p>
+            <w:r>
+              <w:t>TC-DS-05</w:t>
+            </w:r>
+          </w:p>
+        </w:tc>
+        <w:tc>
+          <w:tcPr>
+            <w:tcW w:type="dxa" w:w="3230"/>
+            <w:vAlign w:val="center"/>
+          </w:tcPr>
+          <w:p>
+            <w:r>
+              <w:t>Thêm/sửa/lưu dữ liệu hợp lệ</w:t>
+            </w:r>
+          </w:p>
+        </w:tc>
+        <w:tc>
+          <w:tcPr>
+            <w:tcW w:type="dxa" w:w="3230"/>
+            <w:vAlign w:val="center"/>
+          </w:tcPr>
+          <w:p>
+            <w:r>
+              <w:t>Dữ liệu cập nhật và danh sách hiển thị đúng</w:t>
+            </w:r>
+          </w:p>
+        </w:tc>
+      </w:tr>
+      <w:tr>
+        <w:tc>
+          <w:tcPr>
+            <w:tcW w:type="dxa" w:w="3230"/>
+            <w:vAlign w:val="center"/>
+          </w:tcPr>
+          <w:p>
+            <w:r>
+              <w:t>TC-DS-06</w:t>
+            </w:r>
+          </w:p>
+        </w:tc>
+        <w:tc>
+          <w:tcPr>
+            <w:tcW w:type="dxa" w:w="3230"/>
+            <w:vAlign w:val="center"/>
+          </w:tcPr>
+          <w:p>
+            <w:r>
+              <w:t>Accepted khi còn dòng chưa lưu</w:t>
+            </w:r>
+          </w:p>
+        </w:tc>
+        <w:tc>
+          <w:tcPr>
+            <w:tcW w:type="dxa" w:w="3230"/>
+            <w:vAlign w:val="center"/>
+          </w:tcPr>
+          <w:p>
+            <w:r>
+              <w:t>Hệ thống từ chối và yêu cầu lưu trước</w:t>
+            </w:r>
+          </w:p>
+        </w:tc>
+      </w:tr>
+      <w:tr>
+        <w:tc>
+          <w:tcPr>
+            <w:tcW w:type="dxa" w:w="3230"/>
+            <w:vAlign w:val="center"/>
+          </w:tcPr>
+          <w:p>
+            <w:r>
+              <w:t>TC-DS-07</w:t>
+            </w:r>
+          </w:p>
+        </w:tc>
+        <w:tc>
+          <w:tcPr>
+            <w:tcW w:type="dxa" w:w="3230"/>
+            <w:vAlign w:val="center"/>
+          </w:tcPr>
+          <w:p>
+            <w:r>
+              <w:t>Accepted danh sách rỗng</w:t>
+            </w:r>
+          </w:p>
+        </w:tc>
+        <w:tc>
+          <w:tcPr>
+            <w:tcW w:type="dxa" w:w="3230"/>
+            <w:vAlign w:val="center"/>
+          </w:tcPr>
+          <w:p>
+            <w:r>
+              <w:t>Hệ thống không gửi yêu cầu</w:t>
+            </w:r>
+          </w:p>
+        </w:tc>
+      </w:tr>
+      <w:tr>
+        <w:tc>
+          <w:tcPr>
+            <w:tcW w:type="dxa" w:w="3230"/>
+            <w:vAlign w:val="center"/>
+          </w:tcPr>
+          <w:p>
+            <w:r>
+              <w:t>TC-DS-08</w:t>
+            </w:r>
+          </w:p>
+        </w:tc>
+        <w:tc>
+          <w:tcPr>
+            <w:tcW w:type="dxa" w:w="3230"/>
+            <w:vAlign w:val="center"/>
+          </w:tcPr>
+          <w:p>
+            <w:r>
+              <w:t>Accepted nhiều chuyến hoàn thành</w:t>
+            </w:r>
+          </w:p>
+        </w:tc>
+        <w:tc>
+          <w:tcPr>
+            <w:tcW w:type="dxa" w:w="3230"/>
+            <w:vAlign w:val="center"/>
+          </w:tcPr>
+          <w:p>
+            <w:r>
+              <w:t>Chia lô, cập nhật ISACCEPTED = 1 và báo đúng số lượng</w:t>
+            </w:r>
+          </w:p>
+        </w:tc>
+      </w:tr>
+      <w:tr>
+        <w:tc>
+          <w:tcPr>
+            <w:tcW w:type="dxa" w:w="3230"/>
+            <w:vAlign w:val="center"/>
+          </w:tcPr>
+          <w:p>
+            <w:r>
+              <w:t>TC-DS-09</w:t>
+            </w:r>
+          </w:p>
+        </w:tc>
+        <w:tc>
+          <w:tcPr>
+            <w:tcW w:type="dxa" w:w="3230"/>
+            <w:vAlign w:val="center"/>
+          </w:tcPr>
+          <w:p>
+            <w:r>
+              <w:t>Accepted nhiều chuyến hủy</w:t>
+            </w:r>
+          </w:p>
+        </w:tc>
+        <w:tc>
+          <w:tcPr>
+            <w:tcW w:type="dxa" w:w="3230"/>
+            <w:vAlign w:val="center"/>
+          </w:tcPr>
+          <w:p>
+            <w:r>
+              <w:t>Gọi đúng CANCELED_STATUS_PKG và cập nhật thành công</w:t>
+            </w:r>
+          </w:p>
+        </w:tc>
+      </w:tr>
+      <w:tr>
+        <w:tc>
+          <w:tcPr>
+            <w:tcW w:type="dxa" w:w="3230"/>
+            <w:vAlign w:val="center"/>
+          </w:tcPr>
+          <w:p>
+            <w:r>
+              <w:t>TC-DS-10</w:t>
+            </w:r>
+          </w:p>
+        </w:tc>
+        <w:tc>
+          <w:tcPr>
+            <w:tcW w:type="dxa" w:w="3230"/>
+            <w:vAlign w:val="center"/>
+          </w:tcPr>
+          <w:p>
+            <w:r>
+              <w:t>Một lô Accepted bị lỗi</w:t>
+            </w:r>
+          </w:p>
+        </w:tc>
+        <w:tc>
+          <w:tcPr>
+            <w:tcW w:type="dxa" w:w="3230"/>
+            <w:vAlign w:val="center"/>
+          </w:tcPr>
+          <w:p>
+            <w:r>
+              <w:t>Dừng lô sau và báo số bản ghi đã thành công</w:t>
+            </w:r>
+          </w:p>
+        </w:tc>
+      </w:tr>
+      <w:tr>
+        <w:tc>
+          <w:tcPr>
+            <w:tcW w:type="dxa" w:w="3230"/>
+            <w:vAlign w:val="center"/>
+          </w:tcPr>
+          <w:p>
+            <w:r>
+              <w:t>TC-DS-11</w:t>
+            </w:r>
+          </w:p>
+        </w:tc>
+        <w:tc>
+          <w:tcPr>
+            <w:tcW w:type="dxa" w:w="3230"/>
+            <w:vAlign w:val="center"/>
+          </w:tcPr>
+          <w:p>
+            <w:r>
+              <w:t>Tra cứu Daily Statistic Accept</w:t>
+            </w:r>
+          </w:p>
+        </w:tc>
+        <w:tc>
+          <w:tcPr>
+            <w:tcW w:type="dxa" w:w="3230"/>
+            <w:vAlign w:val="center"/>
+          </w:tcPr>
+          <w:p>
+            <w:r>
+              <w:t>Chỉ trả bản ghi ISACCEPTED = 1</w:t>
+            </w:r>
+          </w:p>
+        </w:tc>
+      </w:tr>
+      <w:tr>
+        <w:tc>
+          <w:tcPr>
+            <w:tcW w:type="dxa" w:w="3230"/>
+            <w:vAlign w:val="center"/>
+          </w:tcPr>
+          <w:p>
+            <w:r>
+              <w:t>TC-DS-12</w:t>
+            </w:r>
+          </w:p>
+        </w:tc>
+        <w:tc>
+          <w:tcPr>
+            <w:tcW w:type="dxa" w:w="3230"/>
+            <w:vAlign w:val="center"/>
+          </w:tcPr>
+          <w:p>
+            <w:r>
+              <w:t>Bản ghi Accepted thành công</w:t>
+            </w:r>
+          </w:p>
+        </w:tc>
+        <w:tc>
+          <w:tcPr>
+            <w:tcW w:type="dxa" w:w="3230"/>
+            <w:vAlign w:val="center"/>
+          </w:tcPr>
+          <w:p>
+            <w:r>
+              <w:t>Biến mất khỏi danh sách chưa duyệt và xuất hiện tại danh sách đã duyệt</w:t>
+            </w:r>
+          </w:p>
+        </w:tc>
+      </w:tr>
+      <w:tr>
+        <w:tc>
+          <w:tcPr>
+            <w:tcW w:type="dxa" w:w="3230"/>
+            <w:vAlign w:val="center"/>
+          </w:tcPr>
+          <w:p>
+            <w:r>
+              <w:t>TC-DS-13</w:t>
+            </w:r>
+          </w:p>
+        </w:tc>
+        <w:tc>
+          <w:tcPr>
+            <w:tcW w:type="dxa" w:w="3230"/>
+            <w:vAlign w:val="center"/>
+          </w:tcPr>
+          <w:p>
+            <w:r>
+              <w:t>Export Excel theo bộ lọc</w:t>
+            </w:r>
+          </w:p>
+        </w:tc>
+        <w:tc>
+          <w:tcPr>
+            <w:tcW w:type="dxa" w:w="3230"/>
+            <w:vAlign w:val="center"/>
+          </w:tcPr>
+          <w:p>
+            <w:r>
+              <w:t>File có đủ bản ghi và đúng các cột đã chọn</w:t>
+            </w:r>
+          </w:p>
+        </w:tc>
+      </w:tr>
+      <w:tr>
+        <w:tc>
+          <w:tcPr>
+            <w:tcW w:type="dxa" w:w="3230"/>
+            <w:vAlign w:val="center"/>
+          </w:tcPr>
+          <w:p>
+            <w:r>
+              <w:t>TC-DS-14</w:t>
+            </w:r>
+          </w:p>
+        </w:tc>
+        <w:tc>
+          <w:tcPr>
+            <w:tcW w:type="dxa" w:w="3230"/>
+            <w:vAlign w:val="center"/>
+          </w:tcPr>
+          <w:p>
+            <w:r>
+              <w:t>Người không có quyền thao tác</w:t>
+            </w:r>
+          </w:p>
+        </w:tc>
+        <w:tc>
+          <w:tcPr>
+            <w:tcW w:type="dxa" w:w="3230"/>
+            <w:vAlign w:val="center"/>
+          </w:tcPr>
+          <w:p>
+            <w:r>
+              <w:t>Giao diện/máy chủ từ chối yêu cầu</w:t>
+            </w:r>
+          </w:p>
+        </w:tc>
+      </w:tr>
+    </w:tbl>
+    <w:p/>
+    <w:tbl>
+      <w:tblPr>
+        <w:tblStyle w:val="TableGrid"/>
+        <w:tblW w:type="auto" w:w="0"/>
+        <w:jc w:val="center"/>
+        <w:tblLook w:firstColumn="1" w:firstRow="1" w:lastColumn="0" w:lastRow="0" w:noHBand="0" w:noVBand="1" w:val="04A0"/>
+      </w:tblPr>
+      <w:tblGrid>
+        <w:gridCol w:w="3230"/>
+        <w:gridCol w:w="3230"/>
+        <w:gridCol w:w="3230"/>
+      </w:tblGrid>
+      <w:tr>
+        <w:trPr>
+          <w:tblHeader w:val="true"/>
+        </w:trPr>
+        <w:tc>
+          <w:tcPr>
+            <w:tcW w:type="dxa" w:w="3230"/>
+            <w:shd w:fill="D9EAF7"/>
+          </w:tcPr>
+          <w:p>
+            <w:r>
+              <w:rPr>
+                <w:b/>
+              </w:rPr>
+              <w:t>Mã yêu cầu</w:t>
+            </w:r>
+          </w:p>
+        </w:tc>
+        <w:tc>
+          <w:tcPr>
+            <w:tcW w:type="dxa" w:w="3230"/>
+            <w:shd w:fill="D9EAF7"/>
+          </w:tcPr>
+          <w:p>
+            <w:r>
+              <w:rPr>
+                <w:b/>
+              </w:rPr>
+              <w:t>Nội dung</w:t>
+            </w:r>
+          </w:p>
+        </w:tc>
+        <w:tc>
+          <w:tcPr>
+            <w:tcW w:type="dxa" w:w="3230"/>
+            <w:shd w:fill="D9EAF7"/>
+          </w:tcPr>
+          <w:p>
+            <w:r>
+              <w:rPr>
+                <w:b/>
+              </w:rPr>
+              <w:t>Kiểm thử</w:t>
+            </w:r>
+          </w:p>
+        </w:tc>
+      </w:tr>
+      <w:tr>
+        <w:tc>
+          <w:tcPr>
+            <w:tcW w:type="dxa" w:w="3230"/>
+            <w:vAlign w:val="center"/>
+          </w:tcPr>
+          <w:p>
+            <w:r>
+              <w:t>FR-DS-01…FR-DS-04</w:t>
+            </w:r>
+          </w:p>
+        </w:tc>
+        <w:tc>
+          <w:tcPr>
+            <w:tcW w:type="dxa" w:w="3230"/>
+            <w:vAlign w:val="center"/>
+          </w:tcPr>
+          <w:p>
+            <w:r>
+              <w:t>Export Flight Finished</w:t>
+            </w:r>
+          </w:p>
+        </w:tc>
+        <w:tc>
+          <w:tcPr>
+            <w:tcW w:type="dxa" w:w="3230"/>
+            <w:vAlign w:val="center"/>
+          </w:tcPr>
+          <w:p>
+            <w:r>
+              <w:t>TC-DS-01…TC-DS-03</w:t>
+            </w:r>
+          </w:p>
+        </w:tc>
+      </w:tr>
+      <w:tr>
+        <w:tc>
+          <w:tcPr>
+            <w:tcW w:type="dxa" w:w="3230"/>
+            <w:vAlign w:val="center"/>
+          </w:tcPr>
+          <w:p>
+            <w:r>
+              <w:t>FR-DS-05…FR-DS-08</w:t>
+            </w:r>
+          </w:p>
+        </w:tc>
+        <w:tc>
+          <w:tcPr>
+            <w:tcW w:type="dxa" w:w="3230"/>
+            <w:vAlign w:val="center"/>
+          </w:tcPr>
+          <w:p>
+            <w:r>
+              <w:t>Tra cứu, hiệu chỉnh và export Daily Statistic</w:t>
+            </w:r>
+          </w:p>
+        </w:tc>
+        <w:tc>
+          <w:tcPr>
+            <w:tcW w:type="dxa" w:w="3230"/>
+            <w:vAlign w:val="center"/>
+          </w:tcPr>
+          <w:p>
+            <w:r>
+              <w:t>TC-DS-04, TC-DS-05, TC-DS-13</w:t>
+            </w:r>
+          </w:p>
+        </w:tc>
+      </w:tr>
+      <w:tr>
+        <w:tc>
+          <w:tcPr>
+            <w:tcW w:type="dxa" w:w="3230"/>
+            <w:vAlign w:val="center"/>
+          </w:tcPr>
+          <w:p>
+            <w:r>
+              <w:t>FR-DS-09…FR-DS-14</w:t>
+            </w:r>
+          </w:p>
+        </w:tc>
+        <w:tc>
+          <w:tcPr>
+            <w:tcW w:type="dxa" w:w="3230"/>
+            <w:vAlign w:val="center"/>
+          </w:tcPr>
+          <w:p>
+            <w:r>
+              <w:t>Accepted dữ liệu</w:t>
+            </w:r>
+          </w:p>
+        </w:tc>
+        <w:tc>
+          <w:tcPr>
+            <w:tcW w:type="dxa" w:w="3230"/>
+            <w:vAlign w:val="center"/>
+          </w:tcPr>
+          <w:p>
+            <w:r>
+              <w:t>TC-DS-06…TC-DS-10, TC-DS-12</w:t>
+            </w:r>
+          </w:p>
+        </w:tc>
+      </w:tr>
+      <w:tr>
+        <w:tc>
+          <w:tcPr>
+            <w:tcW w:type="dxa" w:w="3230"/>
+            <w:vAlign w:val="center"/>
+          </w:tcPr>
+          <w:p>
+            <w:r>
+              <w:t>FR-DS-15…FR-DS-18</w:t>
+            </w:r>
+          </w:p>
+        </w:tc>
+        <w:tc>
+          <w:tcPr>
+            <w:tcW w:type="dxa" w:w="3230"/>
+            <w:vAlign w:val="center"/>
+          </w:tcPr>
+          <w:p>
+            <w:r>
+              <w:t>Daily Statistic Accept</w:t>
+            </w:r>
+          </w:p>
+        </w:tc>
+        <w:tc>
+          <w:tcPr>
+            <w:tcW w:type="dxa" w:w="3230"/>
+            <w:vAlign w:val="center"/>
+          </w:tcPr>
+          <w:p>
+            <w:r>
+              <w:t>TC-DS-11…TC-DS-13</w:t>
+            </w:r>
+          </w:p>
+        </w:tc>
+      </w:tr>
+      <w:tr>
+        <w:tc>
+          <w:tcPr>
+            <w:tcW w:type="dxa" w:w="3230"/>
+            <w:vAlign w:val="center"/>
+          </w:tcPr>
+          <w:p>
+            <w:r>
+              <w:t>NFR-DS-01</w:t>
+            </w:r>
+          </w:p>
+        </w:tc>
+        <w:tc>
+          <w:tcPr>
+            <w:tcW w:type="dxa" w:w="3230"/>
+            <w:vAlign w:val="center"/>
+          </w:tcPr>
+          <w:p>
+            <w:r>
+              <w:t>Phân quyền</w:t>
+            </w:r>
+          </w:p>
+        </w:tc>
+        <w:tc>
+          <w:tcPr>
+            <w:tcW w:type="dxa" w:w="3230"/>
+            <w:vAlign w:val="center"/>
+          </w:tcPr>
+          <w:p>
+            <w:r>
+              <w:t>TC-DS-14</w:t>
             </w:r>
           </w:p>
         </w:tc>

</xml_diff>

<commit_message>
docs: add military flight plan workflow to SRS
</commit_message>
<xml_diff>
--- a/TaiLieu/SRS_Live_Fire_Message.docx
+++ b/TaiLieu/SRS_Live_Fire_Message.docx
@@ -5424,6 +5424,2807 @@
           <w:p>
             <w:r>
               <w:t>TC-DS-14</w:t>
+            </w:r>
+          </w:p>
+        </w:tc>
+      </w:tr>
+    </w:tbl>
+    <w:p/>
+    <w:p>
+      <w:r>
+        <w:br w:type="page"/>
+      </w:r>
+    </w:p>
+    <w:p>
+      <w:pPr>
+        <w:pStyle w:val="Heading1"/>
+      </w:pPr>
+      <w:r>
+        <w:t>PHẦN III. QUẢN LÝ THÔNG TIN KHB QUÂN SỰ</w:t>
+      </w:r>
+    </w:p>
+    <w:p>
+      <w:pPr>
+        <w:pStyle w:val="Heading1"/>
+      </w:pPr>
+      <w:r>
+        <w:t>18. Thông tin chung và phạm vi</w:t>
+      </w:r>
+    </w:p>
+    <w:tbl>
+      <w:tblPr>
+        <w:tblStyle w:val="TableGrid"/>
+        <w:tblW w:type="auto" w:w="0"/>
+        <w:jc w:val="center"/>
+        <w:tblLook w:firstColumn="1" w:firstRow="1" w:lastColumn="0" w:lastRow="0" w:noHBand="0" w:noVBand="1" w:val="04A0"/>
+      </w:tblPr>
+      <w:tblGrid>
+        <w:gridCol w:w="4844"/>
+        <w:gridCol w:w="4844"/>
+      </w:tblGrid>
+      <w:tr>
+        <w:trPr>
+          <w:tblHeader w:val="true"/>
+        </w:trPr>
+        <w:tc>
+          <w:tcPr>
+            <w:tcW w:type="dxa" w:w="4844"/>
+            <w:shd w:fill="D9EAF7"/>
+          </w:tcPr>
+          <w:p>
+            <w:r>
+              <w:rPr>
+                <w:b/>
+              </w:rPr>
+              <w:t>Nội dung</w:t>
+            </w:r>
+          </w:p>
+        </w:tc>
+        <w:tc>
+          <w:tcPr>
+            <w:tcW w:type="dxa" w:w="4844"/>
+            <w:shd w:fill="D9EAF7"/>
+          </w:tcPr>
+          <w:p>
+            <w:r>
+              <w:rPr>
+                <w:b/>
+              </w:rPr>
+              <w:t>Giá trị</w:t>
+            </w:r>
+          </w:p>
+        </w:tc>
+      </w:tr>
+      <w:tr>
+        <w:tc>
+          <w:tcPr>
+            <w:tcW w:type="dxa" w:w="4844"/>
+            <w:vAlign w:val="center"/>
+          </w:tcPr>
+          <w:p>
+            <w:r>
+              <w:t>Tên chức năng</w:t>
+            </w:r>
+          </w:p>
+        </w:tc>
+        <w:tc>
+          <w:tcPr>
+            <w:tcW w:type="dxa" w:w="4844"/>
+            <w:vAlign w:val="center"/>
+          </w:tcPr>
+          <w:p>
+            <w:r>
+              <w:t>Quản lý thông tin KHB quân sự</w:t>
+            </w:r>
+          </w:p>
+        </w:tc>
+      </w:tr>
+      <w:tr>
+        <w:tc>
+          <w:tcPr>
+            <w:tcW w:type="dxa" w:w="4844"/>
+            <w:vAlign w:val="center"/>
+          </w:tcPr>
+          <w:p>
+            <w:r>
+              <w:t>Màn hình quản lý</w:t>
+            </w:r>
+          </w:p>
+        </w:tc>
+        <w:tc>
+          <w:tcPr>
+            <w:tcW w:type="dxa" w:w="4844"/>
+            <w:vAlign w:val="center"/>
+          </w:tcPr>
+          <w:p>
+            <w:r>
+              <w:t>/FinishFlights/ListFinishedFlightsMilitary.aspx?Menu_ID=843</w:t>
+            </w:r>
+          </w:p>
+        </w:tc>
+      </w:tr>
+      <w:tr>
+        <w:tc>
+          <w:tcPr>
+            <w:tcW w:type="dxa" w:w="4844"/>
+            <w:vAlign w:val="center"/>
+          </w:tcPr>
+          <w:p>
+            <w:r>
+              <w:t>Màn hình khai thác báo cáo</w:t>
+            </w:r>
+          </w:p>
+        </w:tc>
+        <w:tc>
+          <w:tcPr>
+            <w:tcW w:type="dxa" w:w="4844"/>
+            <w:vAlign w:val="center"/>
+          </w:tcPr>
+          <w:p>
+            <w:r>
+              <w:t>/FinishFlights/ListFinishedFlightsMilitaryReport.aspx?Menu_ID=863</w:t>
+            </w:r>
+          </w:p>
+        </w:tc>
+      </w:tr>
+      <w:tr>
+        <w:tc>
+          <w:tcPr>
+            <w:tcW w:type="dxa" w:w="4844"/>
+            <w:vAlign w:val="center"/>
+          </w:tcPr>
+          <w:p>
+            <w:r>
+              <w:t>Bảng dữ liệu nghiệp vụ</w:t>
+            </w:r>
+          </w:p>
+        </w:tc>
+        <w:tc>
+          <w:tcPr>
+            <w:tcW w:type="dxa" w:w="4844"/>
+            <w:vAlign w:val="center"/>
+          </w:tcPr>
+          <w:p>
+            <w:r>
+              <w:t>T_FINISHFLIGHTS_MILITARY</w:t>
+            </w:r>
+          </w:p>
+        </w:tc>
+      </w:tr>
+      <w:tr>
+        <w:tc>
+          <w:tcPr>
+            <w:tcW w:type="dxa" w:w="4844"/>
+            <w:vAlign w:val="center"/>
+          </w:tcPr>
+          <w:p>
+            <w:r>
+              <w:t>Gói xử lý</w:t>
+            </w:r>
+          </w:p>
+        </w:tc>
+        <w:tc>
+          <w:tcPr>
+            <w:tcW w:type="dxa" w:w="4844"/>
+            <w:vAlign w:val="center"/>
+          </w:tcPr>
+          <w:p>
+            <w:r>
+              <w:t>A_TEST_SEARCH</w:t>
+            </w:r>
+          </w:p>
+        </w:tc>
+      </w:tr>
+      <w:tr>
+        <w:tc>
+          <w:tcPr>
+            <w:tcW w:type="dxa" w:w="4844"/>
+            <w:vAlign w:val="center"/>
+          </w:tcPr>
+          <w:p>
+            <w:r>
+              <w:t>Loại điện văn</w:t>
+            </w:r>
+          </w:p>
+        </w:tc>
+        <w:tc>
+          <w:tcPr>
+            <w:tcW w:type="dxa" w:w="4844"/>
+            <w:vAlign w:val="center"/>
+          </w:tcPr>
+          <w:p>
+            <w:r>
+              <w:t>QS MESSAGE</w:t>
+            </w:r>
+          </w:p>
+        </w:tc>
+      </w:tr>
+      <w:tr>
+        <w:tc>
+          <w:tcPr>
+            <w:tcW w:type="dxa" w:w="4844"/>
+            <w:vAlign w:val="center"/>
+          </w:tcPr>
+          <w:p>
+            <w:r>
+              <w:t>Kho điện văn chờ phát</w:t>
+            </w:r>
+          </w:p>
+        </w:tc>
+        <w:tc>
+          <w:tcPr>
+            <w:tcW w:type="dxa" w:w="4844"/>
+            <w:vAlign w:val="center"/>
+          </w:tcPr>
+          <w:p>
+            <w:r>
+              <w:t>T_PLAN_MESSAGE</w:t>
+            </w:r>
+          </w:p>
+        </w:tc>
+      </w:tr>
+    </w:tbl>
+    <w:p/>
+    <w:p>
+      <w:r>
+        <w:t>Chức năng quản lý vòng đời thông tin kế hoạch bay (KHB) quân sự, từ khi nhập mới, kiểm tra và Accepted, tạo điện văn QS MESSAGE cho đến khi điện văn được phát đi. Sau khi Accepted, dữ liệu được cung cấp trên màn hình Military Report để người khai thác chỉ xem, tra cứu và lấy dữ liệu.</w:t>
+      </w:r>
+    </w:p>
+    <w:p>
+      <w:pPr>
+        <w:pStyle w:val="Heading1"/>
+      </w:pPr>
+      <w:r>
+        <w:t>19. Vai trò và luồng xử lý</w:t>
+      </w:r>
+    </w:p>
+    <w:tbl>
+      <w:tblPr>
+        <w:tblStyle w:val="TableGrid"/>
+        <w:tblW w:type="auto" w:w="0"/>
+        <w:jc w:val="center"/>
+        <w:tblLook w:firstColumn="1" w:firstRow="1" w:lastColumn="0" w:lastRow="0" w:noHBand="0" w:noVBand="1" w:val="04A0"/>
+      </w:tblPr>
+      <w:tblGrid>
+        <w:gridCol w:w="4844"/>
+        <w:gridCol w:w="4844"/>
+      </w:tblGrid>
+      <w:tr>
+        <w:trPr>
+          <w:tblHeader w:val="true"/>
+        </w:trPr>
+        <w:tc>
+          <w:tcPr>
+            <w:tcW w:type="dxa" w:w="4844"/>
+            <w:shd w:fill="D9EAF7"/>
+          </w:tcPr>
+          <w:p>
+            <w:r>
+              <w:rPr>
+                <w:b/>
+              </w:rPr>
+              <w:t>Vai trò</w:t>
+            </w:r>
+          </w:p>
+        </w:tc>
+        <w:tc>
+          <w:tcPr>
+            <w:tcW w:type="dxa" w:w="4844"/>
+            <w:shd w:fill="D9EAF7"/>
+          </w:tcPr>
+          <w:p>
+            <w:r>
+              <w:rPr>
+                <w:b/>
+              </w:rPr>
+              <w:t>Trách nhiệm</w:t>
+            </w:r>
+          </w:p>
+        </w:tc>
+      </w:tr>
+      <w:tr>
+        <w:tc>
+          <w:tcPr>
+            <w:tcW w:type="dxa" w:w="4844"/>
+            <w:vAlign w:val="center"/>
+          </w:tcPr>
+          <w:p>
+            <w:r>
+              <w:t>Người nhập KHB quân sự</w:t>
+            </w:r>
+          </w:p>
+        </w:tc>
+        <w:tc>
+          <w:tcPr>
+            <w:tcW w:type="dxa" w:w="4844"/>
+            <w:vAlign w:val="center"/>
+          </w:tcPr>
+          <w:p>
+            <w:r>
+              <w:t>Tạo mới, kiểm tra, sửa, lưu hoặc xóa KHB chưa Accepted.</w:t>
+            </w:r>
+          </w:p>
+        </w:tc>
+      </w:tr>
+      <w:tr>
+        <w:tc>
+          <w:tcPr>
+            <w:tcW w:type="dxa" w:w="4844"/>
+            <w:vAlign w:val="center"/>
+          </w:tcPr>
+          <w:p>
+            <w:r>
+              <w:t>Người duyệt</w:t>
+            </w:r>
+          </w:p>
+        </w:tc>
+        <w:tc>
+          <w:tcPr>
+            <w:tcW w:type="dxa" w:w="4844"/>
+            <w:vAlign w:val="center"/>
+          </w:tcPr>
+          <w:p>
+            <w:r>
+              <w:t>Kiểm tra danh sách theo khoảng ngày và thực hiện Accepted.</w:t>
+            </w:r>
+          </w:p>
+        </w:tc>
+      </w:tr>
+      <w:tr>
+        <w:tc>
+          <w:tcPr>
+            <w:tcW w:type="dxa" w:w="4844"/>
+            <w:vAlign w:val="center"/>
+          </w:tcPr>
+          <w:p>
+            <w:r>
+              <w:t>Người tạo điện văn</w:t>
+            </w:r>
+          </w:p>
+        </w:tc>
+        <w:tc>
+          <w:tcPr>
+            <w:tcW w:type="dxa" w:w="4844"/>
+            <w:vAlign w:val="center"/>
+          </w:tcPr>
+          <w:p>
+            <w:r>
+              <w:t>Chọn dữ liệu đã Accepted và Export Message thành QS MESSAGE.</w:t>
+            </w:r>
+          </w:p>
+        </w:tc>
+      </w:tr>
+      <w:tr>
+        <w:tc>
+          <w:tcPr>
+            <w:tcW w:type="dxa" w:w="4844"/>
+            <w:vAlign w:val="center"/>
+          </w:tcPr>
+          <w:p>
+            <w:r>
+              <w:t>Người phát điện văn</w:t>
+            </w:r>
+          </w:p>
+        </w:tc>
+        <w:tc>
+          <w:tcPr>
+            <w:tcW w:type="dxa" w:w="4844"/>
+            <w:vAlign w:val="center"/>
+          </w:tcPr>
+          <w:p>
+            <w:r>
+              <w:t>Kiểm tra điện văn đã tạo và thực hiện phát đi theo phân hệ điện văn.</w:t>
+            </w:r>
+          </w:p>
+        </w:tc>
+      </w:tr>
+      <w:tr>
+        <w:tc>
+          <w:tcPr>
+            <w:tcW w:type="dxa" w:w="4844"/>
+            <w:vAlign w:val="center"/>
+          </w:tcPr>
+          <w:p>
+            <w:r>
+              <w:t>Người khai thác báo cáo</w:t>
+            </w:r>
+          </w:p>
+        </w:tc>
+        <w:tc>
+          <w:tcPr>
+            <w:tcW w:type="dxa" w:w="4844"/>
+            <w:vAlign w:val="center"/>
+          </w:tcPr>
+          <w:p>
+            <w:r>
+              <w:t>Chỉ xem, tra cứu và xuất/lấy dữ liệu KHB quân sự đã Accepted.</w:t>
+            </w:r>
+          </w:p>
+        </w:tc>
+      </w:tr>
+    </w:tbl>
+    <w:p/>
+    <w:p>
+      <w:r>
+        <w:t>Luồng chính: Nhập mới KHB → Chưa Accepted → Accepted → Export Message → Tạo QS MESSAGE trong T_PLAN_MESSAGE → Phát đi. Dữ liệu sau Accepted đồng thời xuất hiện trên Military Report để khai thác theo chế độ chỉ xem.</w:t>
+      </w:r>
+    </w:p>
+    <w:tbl>
+      <w:tblPr>
+        <w:tblStyle w:val="TableGrid"/>
+        <w:tblW w:type="auto" w:w="0"/>
+        <w:jc w:val="center"/>
+        <w:tblLook w:firstColumn="1" w:firstRow="1" w:lastColumn="0" w:lastRow="0" w:noHBand="0" w:noVBand="1" w:val="04A0"/>
+      </w:tblPr>
+      <w:tblGrid>
+        <w:gridCol w:w="3230"/>
+        <w:gridCol w:w="3230"/>
+        <w:gridCol w:w="3230"/>
+      </w:tblGrid>
+      <w:tr>
+        <w:trPr>
+          <w:tblHeader w:val="true"/>
+        </w:trPr>
+        <w:tc>
+          <w:tcPr>
+            <w:tcW w:type="dxa" w:w="3230"/>
+            <w:shd w:fill="D9EAF7"/>
+          </w:tcPr>
+          <w:p>
+            <w:r>
+              <w:rPr>
+                <w:b/>
+              </w:rPr>
+              <w:t>Giai đoạn</w:t>
+            </w:r>
+          </w:p>
+        </w:tc>
+        <w:tc>
+          <w:tcPr>
+            <w:tcW w:type="dxa" w:w="3230"/>
+            <w:shd w:fill="D9EAF7"/>
+          </w:tcPr>
+          <w:p>
+            <w:r>
+              <w:rPr>
+                <w:b/>
+              </w:rPr>
+              <w:t>Trạng thái/điều kiện</w:t>
+            </w:r>
+          </w:p>
+        </w:tc>
+        <w:tc>
+          <w:tcPr>
+            <w:tcW w:type="dxa" w:w="3230"/>
+            <w:shd w:fill="D9EAF7"/>
+          </w:tcPr>
+          <w:p>
+            <w:r>
+              <w:rPr>
+                <w:b/>
+              </w:rPr>
+              <w:t>Kết quả</w:t>
+            </w:r>
+          </w:p>
+        </w:tc>
+      </w:tr>
+      <w:tr>
+        <w:tc>
+          <w:tcPr>
+            <w:tcW w:type="dxa" w:w="3230"/>
+            <w:vAlign w:val="center"/>
+          </w:tcPr>
+          <w:p>
+            <w:r>
+              <w:t>Nhập mới</w:t>
+            </w:r>
+          </w:p>
+        </w:tc>
+        <w:tc>
+          <w:tcPr>
+            <w:tcW w:type="dxa" w:w="3230"/>
+            <w:vAlign w:val="center"/>
+          </w:tcPr>
+          <w:p>
+            <w:r>
+              <w:t>ISACCEPTED = 0</w:t>
+            </w:r>
+          </w:p>
+        </w:tc>
+        <w:tc>
+          <w:tcPr>
+            <w:tcW w:type="dxa" w:w="3230"/>
+            <w:vAlign w:val="center"/>
+          </w:tcPr>
+          <w:p>
+            <w:r>
+              <w:t>KHB được phép hiệu chỉnh trước duyệt</w:t>
+            </w:r>
+          </w:p>
+        </w:tc>
+      </w:tr>
+      <w:tr>
+        <w:tc>
+          <w:tcPr>
+            <w:tcW w:type="dxa" w:w="3230"/>
+            <w:vAlign w:val="center"/>
+          </w:tcPr>
+          <w:p>
+            <w:r>
+              <w:t>Accepted</w:t>
+            </w:r>
+          </w:p>
+        </w:tc>
+        <w:tc>
+          <w:tcPr>
+            <w:tcW w:type="dxa" w:w="3230"/>
+            <w:vAlign w:val="center"/>
+          </w:tcPr>
+          <w:p>
+            <w:r>
+              <w:t>ISACCEPTED = 1</w:t>
+            </w:r>
+          </w:p>
+        </w:tc>
+        <w:tc>
+          <w:tcPr>
+            <w:tcW w:type="dxa" w:w="3230"/>
+            <w:vAlign w:val="center"/>
+          </w:tcPr>
+          <w:p>
+            <w:r>
+              <w:t>KHB được chốt và hiển thị trên Military Report</w:t>
+            </w:r>
+          </w:p>
+        </w:tc>
+      </w:tr>
+      <w:tr>
+        <w:tc>
+          <w:tcPr>
+            <w:tcW w:type="dxa" w:w="3230"/>
+            <w:vAlign w:val="center"/>
+          </w:tcPr>
+          <w:p>
+            <w:r>
+              <w:t>Export Message</w:t>
+            </w:r>
+          </w:p>
+        </w:tc>
+        <w:tc>
+          <w:tcPr>
+            <w:tcW w:type="dxa" w:w="3230"/>
+            <w:vAlign w:val="center"/>
+          </w:tcPr>
+          <w:p>
+            <w:r>
+              <w:t>Chỉ lấy KHB ISACCEPTED = 1</w:t>
+            </w:r>
+          </w:p>
+        </w:tc>
+        <w:tc>
+          <w:tcPr>
+            <w:tcW w:type="dxa" w:w="3230"/>
+            <w:vAlign w:val="center"/>
+          </w:tcPr>
+          <w:p>
+            <w:r>
+              <w:t>Tạo QS MESSAGE trong T_PLAN_MESSAGE</w:t>
+            </w:r>
+          </w:p>
+        </w:tc>
+      </w:tr>
+      <w:tr>
+        <w:tc>
+          <w:tcPr>
+            <w:tcW w:type="dxa" w:w="3230"/>
+            <w:vAlign w:val="center"/>
+          </w:tcPr>
+          <w:p>
+            <w:r>
+              <w:t>Phát đi</w:t>
+            </w:r>
+          </w:p>
+        </w:tc>
+        <w:tc>
+          <w:tcPr>
+            <w:tcW w:type="dxa" w:w="3230"/>
+            <w:vAlign w:val="center"/>
+          </w:tcPr>
+          <w:p>
+            <w:r>
+              <w:t>QS MESSAGE hợp lệ và chờ phát</w:t>
+            </w:r>
+          </w:p>
+        </w:tc>
+        <w:tc>
+          <w:tcPr>
+            <w:tcW w:type="dxa" w:w="3230"/>
+            <w:vAlign w:val="center"/>
+          </w:tcPr>
+          <w:p>
+            <w:r>
+              <w:t>Điện văn được chuyển qua quy trình phát</w:t>
+            </w:r>
+          </w:p>
+        </w:tc>
+      </w:tr>
+    </w:tbl>
+    <w:p/>
+    <w:p>
+      <w:pPr>
+        <w:pStyle w:val="Heading1"/>
+      </w:pPr>
+      <w:r>
+        <w:t>20. Chức năng nhập và quản lý KHB quân sự</w:t>
+      </w:r>
+    </w:p>
+    <w:p>
+      <w:pPr>
+        <w:pStyle w:val="Heading2"/>
+      </w:pPr>
+      <w:r>
+        <w:t>20.1. Dữ liệu KHB</w:t>
+      </w:r>
+    </w:p>
+    <w:tbl>
+      <w:tblPr>
+        <w:tblStyle w:val="TableGrid"/>
+        <w:tblW w:type="auto" w:w="0"/>
+        <w:jc w:val="center"/>
+        <w:tblLook w:firstColumn="1" w:firstRow="1" w:lastColumn="0" w:lastRow="0" w:noHBand="0" w:noVBand="1" w:val="04A0"/>
+      </w:tblPr>
+      <w:tblGrid>
+        <w:gridCol w:w="4844"/>
+        <w:gridCol w:w="4844"/>
+      </w:tblGrid>
+      <w:tr>
+        <w:trPr>
+          <w:tblHeader w:val="true"/>
+        </w:trPr>
+        <w:tc>
+          <w:tcPr>
+            <w:tcW w:type="dxa" w:w="4844"/>
+            <w:shd w:fill="D9EAF7"/>
+          </w:tcPr>
+          <w:p>
+            <w:r>
+              <w:rPr>
+                <w:b/>
+              </w:rPr>
+              <w:t>Nhóm</w:t>
+            </w:r>
+          </w:p>
+        </w:tc>
+        <w:tc>
+          <w:tcPr>
+            <w:tcW w:type="dxa" w:w="4844"/>
+            <w:shd w:fill="D9EAF7"/>
+          </w:tcPr>
+          <w:p>
+            <w:r>
+              <w:rPr>
+                <w:b/>
+              </w:rPr>
+              <w:t>Trường dữ liệu chính</w:t>
+            </w:r>
+          </w:p>
+        </w:tc>
+      </w:tr>
+      <w:tr>
+        <w:tc>
+          <w:tcPr>
+            <w:tcW w:type="dxa" w:w="4844"/>
+            <w:vAlign w:val="center"/>
+          </w:tcPr>
+          <w:p>
+            <w:r>
+              <w:t>Nhận dạng chuyến bay</w:t>
+            </w:r>
+          </w:p>
+        </w:tc>
+        <w:tc>
+          <w:tcPr>
+            <w:tcW w:type="dxa" w:w="4844"/>
+            <w:vAlign w:val="center"/>
+          </w:tcPr>
+          <w:p>
+            <w:r>
+              <w:t>Hãng khai thác (OPER), ngày bay, callsign, số đăng ký</w:t>
+            </w:r>
+          </w:p>
+        </w:tc>
+      </w:tr>
+      <w:tr>
+        <w:tc>
+          <w:tcPr>
+            <w:tcW w:type="dxa" w:w="4844"/>
+            <w:vAlign w:val="center"/>
+          </w:tcPr>
+          <w:p>
+            <w:r>
+              <w:t>Tàu bay và mục đích</w:t>
+            </w:r>
+          </w:p>
+        </w:tc>
+        <w:tc>
+          <w:tcPr>
+            <w:tcW w:type="dxa" w:w="4844"/>
+            <w:vAlign w:val="center"/>
+          </w:tcPr>
+          <w:p>
+            <w:r>
+              <w:t>Loại tàu bay thực tế, loại tàu bay kế hoạch, mục đích, loại phép</w:t>
+            </w:r>
+          </w:p>
+        </w:tc>
+      </w:tr>
+      <w:tr>
+        <w:tc>
+          <w:tcPr>
+            <w:tcW w:type="dxa" w:w="4844"/>
+            <w:vAlign w:val="center"/>
+          </w:tcPr>
+          <w:p>
+            <w:r>
+              <w:t>Hành trình</w:t>
+            </w:r>
+          </w:p>
+        </w:tc>
+        <w:tc>
+          <w:tcPr>
+            <w:tcW w:type="dxa" w:w="4844"/>
+            <w:vAlign w:val="center"/>
+          </w:tcPr>
+          <w:p>
+            <w:r>
+              <w:t>Sân bay đi, sân bay đến, VIA, FPL VIA</w:t>
+            </w:r>
+          </w:p>
+        </w:tc>
+      </w:tr>
+      <w:tr>
+        <w:tc>
+          <w:tcPr>
+            <w:tcW w:type="dxa" w:w="4844"/>
+            <w:vAlign w:val="center"/>
+          </w:tcPr>
+          <w:p>
+            <w:r>
+              <w:t>Thời gian</w:t>
+            </w:r>
+          </w:p>
+        </w:tc>
+        <w:tc>
+          <w:tcPr>
+            <w:tcW w:type="dxa" w:w="4844"/>
+            <w:vAlign w:val="center"/>
+          </w:tcPr>
+          <w:p>
+            <w:r>
+              <w:t>ETD, ETA, ATD, ATA</w:t>
+            </w:r>
+          </w:p>
+        </w:tc>
+      </w:tr>
+      <w:tr>
+        <w:tc>
+          <w:tcPr>
+            <w:tcW w:type="dxa" w:w="4844"/>
+            <w:vAlign w:val="center"/>
+          </w:tcPr>
+          <w:p>
+            <w:r>
+              <w:t>Thông tin bổ sung</w:t>
+            </w:r>
+          </w:p>
+        </w:tc>
+        <w:tc>
+          <w:tcPr>
+            <w:tcW w:type="dxa" w:w="4844"/>
+            <w:vAlign w:val="center"/>
+          </w:tcPr>
+          <w:p>
+            <w:r>
+              <w:t>Remark và người tạo/cập nhật</w:t>
+            </w:r>
+          </w:p>
+        </w:tc>
+      </w:tr>
+    </w:tbl>
+    <w:p/>
+    <w:p>
+      <w:pPr>
+        <w:pStyle w:val="Heading2"/>
+      </w:pPr>
+      <w:r>
+        <w:t>20.2. Yêu cầu chức năng</w:t>
+      </w:r>
+    </w:p>
+    <w:tbl>
+      <w:tblPr>
+        <w:tblStyle w:val="TableGrid"/>
+        <w:tblW w:type="auto" w:w="0"/>
+        <w:jc w:val="center"/>
+        <w:tblLook w:firstColumn="1" w:firstRow="1" w:lastColumn="0" w:lastRow="0" w:noHBand="0" w:noVBand="1" w:val="04A0"/>
+      </w:tblPr>
+      <w:tblGrid>
+        <w:gridCol w:w="4844"/>
+        <w:gridCol w:w="4844"/>
+      </w:tblGrid>
+      <w:tr>
+        <w:trPr>
+          <w:tblHeader w:val="true"/>
+        </w:trPr>
+        <w:tc>
+          <w:tcPr>
+            <w:tcW w:type="dxa" w:w="4844"/>
+            <w:shd w:fill="D9EAF7"/>
+          </w:tcPr>
+          <w:p>
+            <w:r>
+              <w:rPr>
+                <w:b/>
+              </w:rPr>
+              <w:t>Mã</w:t>
+            </w:r>
+          </w:p>
+        </w:tc>
+        <w:tc>
+          <w:tcPr>
+            <w:tcW w:type="dxa" w:w="4844"/>
+            <w:shd w:fill="D9EAF7"/>
+          </w:tcPr>
+          <w:p>
+            <w:r>
+              <w:rPr>
+                <w:b/>
+              </w:rPr>
+              <w:t>Yêu cầu</w:t>
+            </w:r>
+          </w:p>
+        </w:tc>
+      </w:tr>
+      <w:tr>
+        <w:tc>
+          <w:tcPr>
+            <w:tcW w:type="dxa" w:w="4844"/>
+            <w:vAlign w:val="center"/>
+          </w:tcPr>
+          <w:p>
+            <w:r>
+              <w:t>FR-MIL-01</w:t>
+            </w:r>
+          </w:p>
+        </w:tc>
+        <w:tc>
+          <w:tcPr>
+            <w:tcW w:type="dxa" w:w="4844"/>
+            <w:vAlign w:val="center"/>
+          </w:tcPr>
+          <w:p>
+            <w:r>
+              <w:t>Cho phép tạo một hoặc nhiều dòng KHB quân sự mới và lưu vào dữ liệu nghiệp vụ.</w:t>
+            </w:r>
+          </w:p>
+        </w:tc>
+      </w:tr>
+      <w:tr>
+        <w:tc>
+          <w:tcPr>
+            <w:tcW w:type="dxa" w:w="4844"/>
+            <w:vAlign w:val="center"/>
+          </w:tcPr>
+          <w:p>
+            <w:r>
+              <w:t>FR-MIL-02</w:t>
+            </w:r>
+          </w:p>
+        </w:tc>
+        <w:tc>
+          <w:tcPr>
+            <w:tcW w:type="dxa" w:w="4844"/>
+            <w:vAlign w:val="center"/>
+          </w:tcPr>
+          <w:p>
+            <w:r>
+              <w:t>Kiểm tra tối thiểu các trường nhận dạng, ngày bay, callsign, sân bay và thời gian theo quy tắc của biểu mẫu.</w:t>
+            </w:r>
+          </w:p>
+        </w:tc>
+      </w:tr>
+      <w:tr>
+        <w:tc>
+          <w:tcPr>
+            <w:tcW w:type="dxa" w:w="4844"/>
+            <w:vAlign w:val="center"/>
+          </w:tcPr>
+          <w:p>
+            <w:r>
+              <w:t>FR-MIL-03</w:t>
+            </w:r>
+          </w:p>
+        </w:tc>
+        <w:tc>
+          <w:tcPr>
+            <w:tcW w:type="dxa" w:w="4844"/>
+            <w:vAlign w:val="center"/>
+          </w:tcPr>
+          <w:p>
+            <w:r>
+              <w:t>Cho phép tra cứu theo khoảng ngày, khung giờ, Accepted, callsign, đăng ký, sân bay, mục đích, tàu bay, VIA, remark và thời gian.</w:t>
+            </w:r>
+          </w:p>
+        </w:tc>
+      </w:tr>
+      <w:tr>
+        <w:tc>
+          <w:tcPr>
+            <w:tcW w:type="dxa" w:w="4844"/>
+            <w:vAlign w:val="center"/>
+          </w:tcPr>
+          <w:p>
+            <w:r>
+              <w:t>FR-MIL-04</w:t>
+            </w:r>
+          </w:p>
+        </w:tc>
+        <w:tc>
+          <w:tcPr>
+            <w:tcW w:type="dxa" w:w="4844"/>
+            <w:vAlign w:val="center"/>
+          </w:tcPr>
+          <w:p>
+            <w:r>
+              <w:t>Cho phép sửa, lưu hàng loạt hoặc xóa KHB theo quyền và trạng thái nghiệp vụ.</w:t>
+            </w:r>
+          </w:p>
+        </w:tc>
+      </w:tr>
+      <w:tr>
+        <w:tc>
+          <w:tcPr>
+            <w:tcW w:type="dxa" w:w="4844"/>
+            <w:vAlign w:val="center"/>
+          </w:tcPr>
+          <w:p>
+            <w:r>
+              <w:t>FR-MIL-05</w:t>
+            </w:r>
+          </w:p>
+        </w:tc>
+        <w:tc>
+          <w:tcPr>
+            <w:tcW w:type="dxa" w:w="4844"/>
+            <w:vAlign w:val="center"/>
+          </w:tcPr>
+          <w:p>
+            <w:r>
+              <w:t>Hiển thị tổng số bản ghi, phân trang và cho phép Export Excel theo bộ lọc.</w:t>
+            </w:r>
+          </w:p>
+        </w:tc>
+      </w:tr>
+      <w:tr>
+        <w:tc>
+          <w:tcPr>
+            <w:tcW w:type="dxa" w:w="4844"/>
+            <w:vAlign w:val="center"/>
+          </w:tcPr>
+          <w:p>
+            <w:r>
+              <w:t>FR-MIL-06</w:t>
+            </w:r>
+          </w:p>
+        </w:tc>
+        <w:tc>
+          <w:tcPr>
+            <w:tcW w:type="dxa" w:w="4844"/>
+            <w:vAlign w:val="center"/>
+          </w:tcPr>
+          <w:p>
+            <w:r>
+              <w:t>KHB mới phải có ISACCEPTED = 0 và không được đưa vào QS MESSAGE trước khi Accepted.</w:t>
+            </w:r>
+          </w:p>
+        </w:tc>
+      </w:tr>
+    </w:tbl>
+    <w:p/>
+    <w:p>
+      <w:pPr>
+        <w:pStyle w:val="Heading1"/>
+      </w:pPr>
+      <w:r>
+        <w:t>21. Chức năng Accepted KHB quân sự</w:t>
+      </w:r>
+    </w:p>
+    <w:tbl>
+      <w:tblPr>
+        <w:tblStyle w:val="TableGrid"/>
+        <w:tblW w:type="auto" w:w="0"/>
+        <w:jc w:val="center"/>
+        <w:tblLook w:firstColumn="1" w:firstRow="1" w:lastColumn="0" w:lastRow="0" w:noHBand="0" w:noVBand="1" w:val="04A0"/>
+      </w:tblPr>
+      <w:tblGrid>
+        <w:gridCol w:w="4844"/>
+        <w:gridCol w:w="4844"/>
+      </w:tblGrid>
+      <w:tr>
+        <w:trPr>
+          <w:tblHeader w:val="true"/>
+        </w:trPr>
+        <w:tc>
+          <w:tcPr>
+            <w:tcW w:type="dxa" w:w="4844"/>
+            <w:shd w:fill="D9EAF7"/>
+          </w:tcPr>
+          <w:p>
+            <w:r>
+              <w:rPr>
+                <w:b/>
+              </w:rPr>
+              <w:t>Mã</w:t>
+            </w:r>
+          </w:p>
+        </w:tc>
+        <w:tc>
+          <w:tcPr>
+            <w:tcW w:type="dxa" w:w="4844"/>
+            <w:shd w:fill="D9EAF7"/>
+          </w:tcPr>
+          <w:p>
+            <w:r>
+              <w:rPr>
+                <w:b/>
+              </w:rPr>
+              <w:t>Yêu cầu</w:t>
+            </w:r>
+          </w:p>
+        </w:tc>
+      </w:tr>
+      <w:tr>
+        <w:tc>
+          <w:tcPr>
+            <w:tcW w:type="dxa" w:w="4844"/>
+            <w:vAlign w:val="center"/>
+          </w:tcPr>
+          <w:p>
+            <w:r>
+              <w:t>FR-MIL-07</w:t>
+            </w:r>
+          </w:p>
+        </w:tc>
+        <w:tc>
+          <w:tcPr>
+            <w:tcW w:type="dxa" w:w="4844"/>
+            <w:vAlign w:val="center"/>
+          </w:tcPr>
+          <w:p>
+            <w:r>
+              <w:t>Người dùng phải chọn đủ Từ ngày và Đến ngày; Từ ngày không được lớn hơn Đến ngày.</w:t>
+            </w:r>
+          </w:p>
+        </w:tc>
+      </w:tr>
+      <w:tr>
+        <w:tc>
+          <w:tcPr>
+            <w:tcW w:type="dxa" w:w="4844"/>
+            <w:vAlign w:val="center"/>
+          </w:tcPr>
+          <w:p>
+            <w:r>
+              <w:t>FR-MIL-08</w:t>
+            </w:r>
+          </w:p>
+        </w:tc>
+        <w:tc>
+          <w:tcPr>
+            <w:tcW w:type="dxa" w:w="4844"/>
+            <w:vAlign w:val="center"/>
+          </w:tcPr>
+          <w:p>
+            <w:r>
+              <w:t>Trước khi Accepted, hệ thống hiển thị xác nhận rõ khoảng ngày sẽ xử lý.</w:t>
+            </w:r>
+          </w:p>
+        </w:tc>
+      </w:tr>
+      <w:tr>
+        <w:tc>
+          <w:tcPr>
+            <w:tcW w:type="dxa" w:w="4844"/>
+            <w:vAlign w:val="center"/>
+          </w:tcPr>
+          <w:p>
+            <w:r>
+              <w:t>FR-MIL-09</w:t>
+            </w:r>
+          </w:p>
+        </w:tc>
+        <w:tc>
+          <w:tcPr>
+            <w:tcW w:type="dxa" w:w="4844"/>
+            <w:vAlign w:val="center"/>
+          </w:tcPr>
+          <w:p>
+            <w:r>
+              <w:t>A_TEST_SEARCH.ACCEPT_FIN_FLIGHTS_MILITARY Accepted toàn bộ KHB quân sự hợp lệ chưa Accepted trong khoảng ngày và ghi nhận tài khoản thực hiện.</w:t>
+            </w:r>
+          </w:p>
+        </w:tc>
+      </w:tr>
+      <w:tr>
+        <w:tc>
+          <w:tcPr>
+            <w:tcW w:type="dxa" w:w="4844"/>
+            <w:vAlign w:val="center"/>
+          </w:tcPr>
+          <w:p>
+            <w:r>
+              <w:t>FR-MIL-10</w:t>
+            </w:r>
+          </w:p>
+        </w:tc>
+        <w:tc>
+          <w:tcPr>
+            <w:tcW w:type="dxa" w:w="4844"/>
+            <w:vAlign w:val="center"/>
+          </w:tcPr>
+          <w:p>
+            <w:r>
+              <w:t>Sau khi thành công, hệ thống thông báo số chuyến đã Accepted, chuyển bộ lọc về Chưa Accepted và tải lại danh sách.</w:t>
+            </w:r>
+          </w:p>
+        </w:tc>
+      </w:tr>
+      <w:tr>
+        <w:tc>
+          <w:tcPr>
+            <w:tcW w:type="dxa" w:w="4844"/>
+            <w:vAlign w:val="center"/>
+          </w:tcPr>
+          <w:p>
+            <w:r>
+              <w:t>FR-MIL-11</w:t>
+            </w:r>
+          </w:p>
+        </w:tc>
+        <w:tc>
+          <w:tcPr>
+            <w:tcW w:type="dxa" w:w="4844"/>
+            <w:vAlign w:val="center"/>
+          </w:tcPr>
+          <w:p>
+            <w:r>
+              <w:t>KHB đã Accepted phải hiển thị khi lọc Đã Accepted và trên Military Report.</w:t>
+            </w:r>
+          </w:p>
+        </w:tc>
+      </w:tr>
+      <w:tr>
+        <w:tc>
+          <w:tcPr>
+            <w:tcW w:type="dxa" w:w="4844"/>
+            <w:vAlign w:val="center"/>
+          </w:tcPr>
+          <w:p>
+            <w:r>
+              <w:t>FR-MIL-12</w:t>
+            </w:r>
+          </w:p>
+        </w:tc>
+        <w:tc>
+          <w:tcPr>
+            <w:tcW w:type="dxa" w:w="4844"/>
+            <w:vAlign w:val="center"/>
+          </w:tcPr>
+          <w:p>
+            <w:r>
+              <w:t>Nếu API hoặc Oracle lỗi, không hiển thị thông báo thành công; phải mở lại nút thao tác để người dùng thử lại.</w:t>
+            </w:r>
+          </w:p>
+        </w:tc>
+      </w:tr>
+    </w:tbl>
+    <w:p/>
+    <w:p>
+      <w:pPr>
+        <w:pStyle w:val="Heading1"/>
+      </w:pPr>
+      <w:r>
+        <w:t>22. Chức năng Export Message và phát đi</w:t>
+      </w:r>
+    </w:p>
+    <w:tbl>
+      <w:tblPr>
+        <w:tblStyle w:val="TableGrid"/>
+        <w:tblW w:type="auto" w:w="0"/>
+        <w:jc w:val="center"/>
+        <w:tblLook w:firstColumn="1" w:firstRow="1" w:lastColumn="0" w:lastRow="0" w:noHBand="0" w:noVBand="1" w:val="04A0"/>
+      </w:tblPr>
+      <w:tblGrid>
+        <w:gridCol w:w="4844"/>
+        <w:gridCol w:w="4844"/>
+      </w:tblGrid>
+      <w:tr>
+        <w:trPr>
+          <w:tblHeader w:val="true"/>
+        </w:trPr>
+        <w:tc>
+          <w:tcPr>
+            <w:tcW w:type="dxa" w:w="4844"/>
+            <w:shd w:fill="D9EAF7"/>
+          </w:tcPr>
+          <w:p>
+            <w:r>
+              <w:rPr>
+                <w:b/>
+              </w:rPr>
+              <w:t>Mã</w:t>
+            </w:r>
+          </w:p>
+        </w:tc>
+        <w:tc>
+          <w:tcPr>
+            <w:tcW w:type="dxa" w:w="4844"/>
+            <w:shd w:fill="D9EAF7"/>
+          </w:tcPr>
+          <w:p>
+            <w:r>
+              <w:rPr>
+                <w:b/>
+              </w:rPr>
+              <w:t>Yêu cầu</w:t>
+            </w:r>
+          </w:p>
+        </w:tc>
+      </w:tr>
+      <w:tr>
+        <w:tc>
+          <w:tcPr>
+            <w:tcW w:type="dxa" w:w="4844"/>
+            <w:vAlign w:val="center"/>
+          </w:tcPr>
+          <w:p>
+            <w:r>
+              <w:t>FR-MIL-13</w:t>
+            </w:r>
+          </w:p>
+        </w:tc>
+        <w:tc>
+          <w:tcPr>
+            <w:tcW w:type="dxa" w:w="4844"/>
+            <w:vAlign w:val="center"/>
+          </w:tcPr>
+          <w:p>
+            <w:r>
+              <w:t>Nút Export Message chỉ được bật khi người dùng đang lọc trạng thái Đã Accepted.</w:t>
+            </w:r>
+          </w:p>
+        </w:tc>
+      </w:tr>
+      <w:tr>
+        <w:tc>
+          <w:tcPr>
+            <w:tcW w:type="dxa" w:w="4844"/>
+            <w:vAlign w:val="center"/>
+          </w:tcPr>
+          <w:p>
+            <w:r>
+              <w:t>FR-MIL-14</w:t>
+            </w:r>
+          </w:p>
+        </w:tc>
+        <w:tc>
+          <w:tcPr>
+            <w:tcW w:type="dxa" w:w="4844"/>
+            <w:vAlign w:val="center"/>
+          </w:tcPr>
+          <w:p>
+            <w:r>
+              <w:t>Người dùng phải chọn khoảng ngày hợp lệ và xác nhận trước khi tạo điện văn.</w:t>
+            </w:r>
+          </w:p>
+        </w:tc>
+      </w:tr>
+      <w:tr>
+        <w:tc>
+          <w:tcPr>
+            <w:tcW w:type="dxa" w:w="4844"/>
+            <w:vAlign w:val="center"/>
+          </w:tcPr>
+          <w:p>
+            <w:r>
+              <w:t>FR-MIL-15</w:t>
+            </w:r>
+          </w:p>
+        </w:tc>
+        <w:tc>
+          <w:tcPr>
+            <w:tcW w:type="dxa" w:w="4844"/>
+            <w:vAlign w:val="center"/>
+          </w:tcPr>
+          <w:p>
+            <w:r>
+              <w:t>A_TEST_SEARCH.EXPORT_QS_PLAN_MESSAGE chỉ lấy KHB quân sự ISACCEPTED = 1 trong khoảng ngày đã chọn.</w:t>
+            </w:r>
+          </w:p>
+        </w:tc>
+      </w:tr>
+      <w:tr>
+        <w:tc>
+          <w:tcPr>
+            <w:tcW w:type="dxa" w:w="4844"/>
+            <w:vAlign w:val="center"/>
+          </w:tcPr>
+          <w:p>
+            <w:r>
+              <w:t>FR-MIL-16</w:t>
+            </w:r>
+          </w:p>
+        </w:tc>
+        <w:tc>
+          <w:tcPr>
+            <w:tcW w:type="dxa" w:w="4844"/>
+            <w:vAlign w:val="center"/>
+          </w:tcPr>
+          <w:p>
+            <w:r>
+              <w:t>Hệ thống tạo nội dung điện văn và ghi vào T_PLAN_MESSAGE với MESS_TYPE = 'QS MESSAGE', kèm danh sách chuyến bay nguồn.</w:t>
+            </w:r>
+          </w:p>
+        </w:tc>
+      </w:tr>
+      <w:tr>
+        <w:tc>
+          <w:tcPr>
+            <w:tcW w:type="dxa" w:w="4844"/>
+            <w:vAlign w:val="center"/>
+          </w:tcPr>
+          <w:p>
+            <w:r>
+              <w:t>FR-MIL-17</w:t>
+            </w:r>
+          </w:p>
+        </w:tc>
+        <w:tc>
+          <w:tcPr>
+            <w:tcW w:type="dxa" w:w="4844"/>
+            <w:vAlign w:val="center"/>
+          </w:tcPr>
+          <w:p>
+            <w:r>
+              <w:t>Sau khi export, thông báo chính xác số chuyến bay đã được tạo thành QS MESSAGE.</w:t>
+            </w:r>
+          </w:p>
+        </w:tc>
+      </w:tr>
+      <w:tr>
+        <w:tc>
+          <w:tcPr>
+            <w:tcW w:type="dxa" w:w="4844"/>
+            <w:vAlign w:val="center"/>
+          </w:tcPr>
+          <w:p>
+            <w:r>
+              <w:t>FR-MIL-18</w:t>
+            </w:r>
+          </w:p>
+        </w:tc>
+        <w:tc>
+          <w:tcPr>
+            <w:tcW w:type="dxa" w:w="4844"/>
+            <w:vAlign w:val="center"/>
+          </w:tcPr>
+          <w:p>
+            <w:r>
+              <w:t>QS MESSAGE được chuyển sang phân hệ quản lý/phát điện văn; chỉ người có quyền mới được phát đi.</w:t>
+            </w:r>
+          </w:p>
+        </w:tc>
+      </w:tr>
+      <w:tr>
+        <w:tc>
+          <w:tcPr>
+            <w:tcW w:type="dxa" w:w="4844"/>
+            <w:vAlign w:val="center"/>
+          </w:tcPr>
+          <w:p>
+            <w:r>
+              <w:t>FR-MIL-19</w:t>
+            </w:r>
+          </w:p>
+        </w:tc>
+        <w:tc>
+          <w:tcPr>
+            <w:tcW w:type="dxa" w:w="4844"/>
+            <w:vAlign w:val="center"/>
+          </w:tcPr>
+          <w:p>
+            <w:r>
+              <w:t>Khi phát thành công, hệ thống phải ghi nhận trạng thái, người thực hiện và thời điểm phát để truy vết.</w:t>
+            </w:r>
+          </w:p>
+        </w:tc>
+      </w:tr>
+      <w:tr>
+        <w:tc>
+          <w:tcPr>
+            <w:tcW w:type="dxa" w:w="4844"/>
+            <w:vAlign w:val="center"/>
+          </w:tcPr>
+          <w:p>
+            <w:r>
+              <w:t>FR-MIL-20</w:t>
+            </w:r>
+          </w:p>
+        </w:tc>
+        <w:tc>
+          <w:tcPr>
+            <w:tcW w:type="dxa" w:w="4844"/>
+            <w:vAlign w:val="center"/>
+          </w:tcPr>
+          <w:p>
+            <w:r>
+              <w:t>Không được phát điện văn khi nội dung rỗng, dữ liệu nguồn không hợp lệ hoặc người dùng không có quyền.</w:t>
+            </w:r>
+          </w:p>
+        </w:tc>
+      </w:tr>
+    </w:tbl>
+    <w:p/>
+    <w:p>
+      <w:pPr>
+        <w:pStyle w:val="Heading1"/>
+      </w:pPr>
+      <w:r>
+        <w:t>23. Chức năng Military Report</w:t>
+      </w:r>
+    </w:p>
+    <w:tbl>
+      <w:tblPr>
+        <w:tblStyle w:val="TableGrid"/>
+        <w:tblW w:type="auto" w:w="0"/>
+        <w:jc w:val="center"/>
+        <w:tblLook w:firstColumn="1" w:firstRow="1" w:lastColumn="0" w:lastRow="0" w:noHBand="0" w:noVBand="1" w:val="04A0"/>
+      </w:tblPr>
+      <w:tblGrid>
+        <w:gridCol w:w="4844"/>
+        <w:gridCol w:w="4844"/>
+      </w:tblGrid>
+      <w:tr>
+        <w:trPr>
+          <w:tblHeader w:val="true"/>
+        </w:trPr>
+        <w:tc>
+          <w:tcPr>
+            <w:tcW w:type="dxa" w:w="4844"/>
+            <w:shd w:fill="D9EAF7"/>
+          </w:tcPr>
+          <w:p>
+            <w:r>
+              <w:rPr>
+                <w:b/>
+              </w:rPr>
+              <w:t>Mã</w:t>
+            </w:r>
+          </w:p>
+        </w:tc>
+        <w:tc>
+          <w:tcPr>
+            <w:tcW w:type="dxa" w:w="4844"/>
+            <w:shd w:fill="D9EAF7"/>
+          </w:tcPr>
+          <w:p>
+            <w:r>
+              <w:rPr>
+                <w:b/>
+              </w:rPr>
+              <w:t>Yêu cầu</w:t>
+            </w:r>
+          </w:p>
+        </w:tc>
+      </w:tr>
+      <w:tr>
+        <w:tc>
+          <w:tcPr>
+            <w:tcW w:type="dxa" w:w="4844"/>
+            <w:vAlign w:val="center"/>
+          </w:tcPr>
+          <w:p>
+            <w:r>
+              <w:t>FR-MIL-21</w:t>
+            </w:r>
+          </w:p>
+        </w:tc>
+        <w:tc>
+          <w:tcPr>
+            <w:tcW w:type="dxa" w:w="4844"/>
+            <w:vAlign w:val="center"/>
+          </w:tcPr>
+          <w:p>
+            <w:r>
+              <w:t>Màn hình ListFinishedFlightsMilitaryReport chỉ truy vấn KHB quân sự đã Accepted (P_ISACCEPTED = 1).</w:t>
+            </w:r>
+          </w:p>
+        </w:tc>
+      </w:tr>
+      <w:tr>
+        <w:tc>
+          <w:tcPr>
+            <w:tcW w:type="dxa" w:w="4844"/>
+            <w:vAlign w:val="center"/>
+          </w:tcPr>
+          <w:p>
+            <w:r>
+              <w:t>FR-MIL-22</w:t>
+            </w:r>
+          </w:p>
+        </w:tc>
+        <w:tc>
+          <w:tcPr>
+            <w:tcW w:type="dxa" w:w="4844"/>
+            <w:vAlign w:val="center"/>
+          </w:tcPr>
+          <w:p>
+            <w:r>
+              <w:t>Người khai thác được tra cứu theo khoảng ngày, khung giờ và các trường KHB chính; danh sách hỗ trợ phân trang.</w:t>
+            </w:r>
+          </w:p>
+        </w:tc>
+      </w:tr>
+      <w:tr>
+        <w:tc>
+          <w:tcPr>
+            <w:tcW w:type="dxa" w:w="4844"/>
+            <w:vAlign w:val="center"/>
+          </w:tcPr>
+          <w:p>
+            <w:r>
+              <w:t>FR-MIL-23</w:t>
+            </w:r>
+          </w:p>
+        </w:tc>
+        <w:tc>
+          <w:tcPr>
+            <w:tcW w:type="dxa" w:w="4844"/>
+            <w:vAlign w:val="center"/>
+          </w:tcPr>
+          <w:p>
+            <w:r>
+              <w:t>Màn hình chỉ cho phép xem và lấy dữ liệu; không cho phép thêm, sửa, xóa, Accepted hoặc Export Message.</w:t>
+            </w:r>
+          </w:p>
+        </w:tc>
+      </w:tr>
+      <w:tr>
+        <w:tc>
+          <w:tcPr>
+            <w:tcW w:type="dxa" w:w="4844"/>
+            <w:vAlign w:val="center"/>
+          </w:tcPr>
+          <w:p>
+            <w:r>
+              <w:t>FR-MIL-24</w:t>
+            </w:r>
+          </w:p>
+        </w:tc>
+        <w:tc>
+          <w:tcPr>
+            <w:tcW w:type="dxa" w:w="4844"/>
+            <w:vAlign w:val="center"/>
+          </w:tcPr>
+          <w:p>
+            <w:r>
+              <w:t>Cho phép Export Excel toàn bộ kết quả theo bộ lọc, không chỉ các dòng của trang hiện tại.</w:t>
+            </w:r>
+          </w:p>
+        </w:tc>
+      </w:tr>
+      <w:tr>
+        <w:tc>
+          <w:tcPr>
+            <w:tcW w:type="dxa" w:w="4844"/>
+            <w:vAlign w:val="center"/>
+          </w:tcPr>
+          <w:p>
+            <w:r>
+              <w:t>FR-MIL-25</w:t>
+            </w:r>
+          </w:p>
+        </w:tc>
+        <w:tc>
+          <w:tcPr>
+            <w:tcW w:type="dxa" w:w="4844"/>
+            <w:vAlign w:val="center"/>
+          </w:tcPr>
+          <w:p>
+            <w:r>
+              <w:t>Dữ liệu hiển thị trên Report phải nhất quán với bản ghi Đã Accepted trên màn hình quản lý.</w:t>
+            </w:r>
+          </w:p>
+        </w:tc>
+      </w:tr>
+    </w:tbl>
+    <w:p/>
+    <w:p>
+      <w:pPr>
+        <w:pStyle w:val="Heading1"/>
+      </w:pPr>
+      <w:r>
+        <w:t>24. Quy tắc nghiệp vụ và phi chức năng</w:t>
+      </w:r>
+    </w:p>
+    <w:tbl>
+      <w:tblPr>
+        <w:tblStyle w:val="TableGrid"/>
+        <w:tblW w:type="auto" w:w="0"/>
+        <w:jc w:val="center"/>
+        <w:tblLook w:firstColumn="1" w:firstRow="1" w:lastColumn="0" w:lastRow="0" w:noHBand="0" w:noVBand="1" w:val="04A0"/>
+      </w:tblPr>
+      <w:tblGrid>
+        <w:gridCol w:w="4844"/>
+        <w:gridCol w:w="4844"/>
+      </w:tblGrid>
+      <w:tr>
+        <w:trPr>
+          <w:tblHeader w:val="true"/>
+        </w:trPr>
+        <w:tc>
+          <w:tcPr>
+            <w:tcW w:type="dxa" w:w="4844"/>
+            <w:shd w:fill="D9EAF7"/>
+          </w:tcPr>
+          <w:p>
+            <w:r>
+              <w:rPr>
+                <w:b/>
+              </w:rPr>
+              <w:t>Mã</w:t>
+            </w:r>
+          </w:p>
+        </w:tc>
+        <w:tc>
+          <w:tcPr>
+            <w:tcW w:type="dxa" w:w="4844"/>
+            <w:shd w:fill="D9EAF7"/>
+          </w:tcPr>
+          <w:p>
+            <w:r>
+              <w:rPr>
+                <w:b/>
+              </w:rPr>
+              <w:t>Quy tắc/yêu cầu</w:t>
+            </w:r>
+          </w:p>
+        </w:tc>
+      </w:tr>
+      <w:tr>
+        <w:tc>
+          <w:tcPr>
+            <w:tcW w:type="dxa" w:w="4844"/>
+            <w:vAlign w:val="center"/>
+          </w:tcPr>
+          <w:p>
+            <w:r>
+              <w:t>BR-MIL-01</w:t>
+            </w:r>
+          </w:p>
+        </w:tc>
+        <w:tc>
+          <w:tcPr>
+            <w:tcW w:type="dxa" w:w="4844"/>
+            <w:vAlign w:val="center"/>
+          </w:tcPr>
+          <w:p>
+            <w:r>
+              <w:t>KHB mới luôn bắt đầu ở trạng thái Chưa Accepted.</w:t>
+            </w:r>
+          </w:p>
+        </w:tc>
+      </w:tr>
+      <w:tr>
+        <w:tc>
+          <w:tcPr>
+            <w:tcW w:type="dxa" w:w="4844"/>
+            <w:vAlign w:val="center"/>
+          </w:tcPr>
+          <w:p>
+            <w:r>
+              <w:t>BR-MIL-02</w:t>
+            </w:r>
+          </w:p>
+        </w:tc>
+        <w:tc>
+          <w:tcPr>
+            <w:tcW w:type="dxa" w:w="4844"/>
+            <w:vAlign w:val="center"/>
+          </w:tcPr>
+          <w:p>
+            <w:r>
+              <w:t>Accepted áp dụng cho toàn bộ KHB hợp lệ trong khoảng ngày người dùng đã xác nhận.</w:t>
+            </w:r>
+          </w:p>
+        </w:tc>
+      </w:tr>
+      <w:tr>
+        <w:tc>
+          <w:tcPr>
+            <w:tcW w:type="dxa" w:w="4844"/>
+            <w:vAlign w:val="center"/>
+          </w:tcPr>
+          <w:p>
+            <w:r>
+              <w:t>BR-MIL-03</w:t>
+            </w:r>
+          </w:p>
+        </w:tc>
+        <w:tc>
+          <w:tcPr>
+            <w:tcW w:type="dxa" w:w="4844"/>
+            <w:vAlign w:val="center"/>
+          </w:tcPr>
+          <w:p>
+            <w:r>
+              <w:t>Chỉ KHB Đã Accepted mới được tạo QS MESSAGE và hiển thị tại Military Report.</w:t>
+            </w:r>
+          </w:p>
+        </w:tc>
+      </w:tr>
+      <w:tr>
+        <w:tc>
+          <w:tcPr>
+            <w:tcW w:type="dxa" w:w="4844"/>
+            <w:vAlign w:val="center"/>
+          </w:tcPr>
+          <w:p>
+            <w:r>
+              <w:t>BR-MIL-04</w:t>
+            </w:r>
+          </w:p>
+        </w:tc>
+        <w:tc>
+          <w:tcPr>
+            <w:tcW w:type="dxa" w:w="4844"/>
+            <w:vAlign w:val="center"/>
+          </w:tcPr>
+          <w:p>
+            <w:r>
+              <w:t>Military Report là nguồn chỉ đọc dành cho khai thác, không làm thay đổi dữ liệu gốc.</w:t>
+            </w:r>
+          </w:p>
+        </w:tc>
+      </w:tr>
+      <w:tr>
+        <w:tc>
+          <w:tcPr>
+            <w:tcW w:type="dxa" w:w="4844"/>
+            <w:vAlign w:val="center"/>
+          </w:tcPr>
+          <w:p>
+            <w:r>
+              <w:t>BR-MIL-05</w:t>
+            </w:r>
+          </w:p>
+        </w:tc>
+        <w:tc>
+          <w:tcPr>
+            <w:tcW w:type="dxa" w:w="4844"/>
+            <w:vAlign w:val="center"/>
+          </w:tcPr>
+          <w:p>
+            <w:r>
+              <w:t>Không tạo trùng QS MESSAGE chưa phát cho cùng phạm vi dữ liệu, trừ khi nghiệp vụ cho phép tạo lại.</w:t>
+            </w:r>
+          </w:p>
+        </w:tc>
+      </w:tr>
+      <w:tr>
+        <w:tc>
+          <w:tcPr>
+            <w:tcW w:type="dxa" w:w="4844"/>
+            <w:vAlign w:val="center"/>
+          </w:tcPr>
+          <w:p>
+            <w:r>
+              <w:t>BR-MIL-06</w:t>
+            </w:r>
+          </w:p>
+        </w:tc>
+        <w:tc>
+          <w:tcPr>
+            <w:tcW w:type="dxa" w:w="4844"/>
+            <w:vAlign w:val="center"/>
+          </w:tcPr>
+          <w:p>
+            <w:r>
+              <w:t>Việc phát điện văn không được làm mất liên kết với danh sách KHB nguồn.</w:t>
+            </w:r>
+          </w:p>
+        </w:tc>
+      </w:tr>
+      <w:tr>
+        <w:tc>
+          <w:tcPr>
+            <w:tcW w:type="dxa" w:w="4844"/>
+            <w:vAlign w:val="center"/>
+          </w:tcPr>
+          <w:p>
+            <w:r>
+              <w:t>NFR-MIL-01</w:t>
+            </w:r>
+          </w:p>
+        </w:tc>
+        <w:tc>
+          <w:tcPr>
+            <w:tcW w:type="dxa" w:w="4844"/>
+            <w:vAlign w:val="center"/>
+          </w:tcPr>
+          <w:p>
+            <w:r>
+              <w:t>Kiểm tra đăng nhập và phân quyền cho Nhập, Sửa, Xóa, Accepted, Export Message và Phát đi.</w:t>
+            </w:r>
+          </w:p>
+        </w:tc>
+      </w:tr>
+      <w:tr>
+        <w:tc>
+          <w:tcPr>
+            <w:tcW w:type="dxa" w:w="4844"/>
+            <w:vAlign w:val="center"/>
+          </w:tcPr>
+          <w:p>
+            <w:r>
+              <w:t>NFR-MIL-02</w:t>
+            </w:r>
+          </w:p>
+        </w:tc>
+        <w:tc>
+          <w:tcPr>
+            <w:tcW w:type="dxa" w:w="4844"/>
+            <w:vAlign w:val="center"/>
+          </w:tcPr>
+          <w:p>
+            <w:r>
+              <w:t>Ghi nhật ký ít nhất cho Accepted, Export Message và Phát đi, gồm người thực hiện, thời gian và kết quả.</w:t>
+            </w:r>
+          </w:p>
+        </w:tc>
+      </w:tr>
+      <w:tr>
+        <w:tc>
+          <w:tcPr>
+            <w:tcW w:type="dxa" w:w="4844"/>
+            <w:vAlign w:val="center"/>
+          </w:tcPr>
+          <w:p>
+            <w:r>
+              <w:t>NFR-MIL-03</w:t>
+            </w:r>
+          </w:p>
+        </w:tc>
+        <w:tc>
+          <w:tcPr>
+            <w:tcW w:type="dxa" w:w="4844"/>
+            <w:vAlign w:val="center"/>
+          </w:tcPr>
+          <w:p>
+            <w:r>
+              <w:t>Khi API/Oracle lỗi, không thay đổi sai trạng thái và phải thông báo thao tác không thành công.</w:t>
+            </w:r>
+          </w:p>
+        </w:tc>
+      </w:tr>
+      <w:tr>
+        <w:tc>
+          <w:tcPr>
+            <w:tcW w:type="dxa" w:w="4844"/>
+            <w:vAlign w:val="center"/>
+          </w:tcPr>
+          <w:p>
+            <w:r>
+              <w:t>NFR-MIL-04</w:t>
+            </w:r>
+          </w:p>
+        </w:tc>
+        <w:tc>
+          <w:tcPr>
+            <w:tcW w:type="dxa" w:w="4844"/>
+            <w:vAlign w:val="center"/>
+          </w:tcPr>
+          <w:p>
+            <w:r>
+              <w:t>Danh sách hỗ trợ phân trang; truy vấn export phải lấy đủ dữ liệu theo bộ lọc.</w:t>
+            </w:r>
+          </w:p>
+        </w:tc>
+      </w:tr>
+      <w:tr>
+        <w:tc>
+          <w:tcPr>
+            <w:tcW w:type="dxa" w:w="4844"/>
+            <w:vAlign w:val="center"/>
+          </w:tcPr>
+          <w:p>
+            <w:r>
+              <w:t>NFR-MIL-05</w:t>
+            </w:r>
+          </w:p>
+        </w:tc>
+        <w:tc>
+          <w:tcPr>
+            <w:tcW w:type="dxa" w:w="4844"/>
+            <w:vAlign w:val="center"/>
+          </w:tcPr>
+          <w:p>
+            <w:r>
+              <w:t>Dữ liệu đã Accepted và điện văn đã phát phải truy vết được khi kiểm tra/kiểm định.</w:t>
+            </w:r>
+          </w:p>
+        </w:tc>
+      </w:tr>
+    </w:tbl>
+    <w:p/>
+    <w:p>
+      <w:pPr>
+        <w:pStyle w:val="Heading1"/>
+      </w:pPr>
+      <w:r>
+        <w:t>25. Tiêu chí nghiệm thu và truy vết</w:t>
+      </w:r>
+    </w:p>
+    <w:tbl>
+      <w:tblPr>
+        <w:tblStyle w:val="TableGrid"/>
+        <w:tblW w:type="auto" w:w="0"/>
+        <w:jc w:val="center"/>
+        <w:tblLook w:firstColumn="1" w:firstRow="1" w:lastColumn="0" w:lastRow="0" w:noHBand="0" w:noVBand="1" w:val="04A0"/>
+      </w:tblPr>
+      <w:tblGrid>
+        <w:gridCol w:w="3230"/>
+        <w:gridCol w:w="3230"/>
+        <w:gridCol w:w="3230"/>
+      </w:tblGrid>
+      <w:tr>
+        <w:trPr>
+          <w:tblHeader w:val="true"/>
+        </w:trPr>
+        <w:tc>
+          <w:tcPr>
+            <w:tcW w:type="dxa" w:w="3230"/>
+            <w:shd w:fill="D9EAF7"/>
+          </w:tcPr>
+          <w:p>
+            <w:r>
+              <w:rPr>
+                <w:b/>
+              </w:rPr>
+              <w:t>Mã kiểm thử</w:t>
+            </w:r>
+          </w:p>
+        </w:tc>
+        <w:tc>
+          <w:tcPr>
+            <w:tcW w:type="dxa" w:w="3230"/>
+            <w:shd w:fill="D9EAF7"/>
+          </w:tcPr>
+          <w:p>
+            <w:r>
+              <w:rPr>
+                <w:b/>
+              </w:rPr>
+              <w:t>Nội dung</w:t>
+            </w:r>
+          </w:p>
+        </w:tc>
+        <w:tc>
+          <w:tcPr>
+            <w:tcW w:type="dxa" w:w="3230"/>
+            <w:shd w:fill="D9EAF7"/>
+          </w:tcPr>
+          <w:p>
+            <w:r>
+              <w:rPr>
+                <w:b/>
+              </w:rPr>
+              <w:t>Kết quả mong đợi</w:t>
+            </w:r>
+          </w:p>
+        </w:tc>
+      </w:tr>
+      <w:tr>
+        <w:tc>
+          <w:tcPr>
+            <w:tcW w:type="dxa" w:w="3230"/>
+            <w:vAlign w:val="center"/>
+          </w:tcPr>
+          <w:p>
+            <w:r>
+              <w:t>TC-MIL-01</w:t>
+            </w:r>
+          </w:p>
+        </w:tc>
+        <w:tc>
+          <w:tcPr>
+            <w:tcW w:type="dxa" w:w="3230"/>
+            <w:vAlign w:val="center"/>
+          </w:tcPr>
+          <w:p>
+            <w:r>
+              <w:t>Nhập mới KHB hợp lệ</w:t>
+            </w:r>
+          </w:p>
+        </w:tc>
+        <w:tc>
+          <w:tcPr>
+            <w:tcW w:type="dxa" w:w="3230"/>
+            <w:vAlign w:val="center"/>
+          </w:tcPr>
+          <w:p>
+            <w:r>
+              <w:t>Lưu thành công với ISACCEPTED = 0</w:t>
+            </w:r>
+          </w:p>
+        </w:tc>
+      </w:tr>
+      <w:tr>
+        <w:tc>
+          <w:tcPr>
+            <w:tcW w:type="dxa" w:w="3230"/>
+            <w:vAlign w:val="center"/>
+          </w:tcPr>
+          <w:p>
+            <w:r>
+              <w:t>TC-MIL-02</w:t>
+            </w:r>
+          </w:p>
+        </w:tc>
+        <w:tc>
+          <w:tcPr>
+            <w:tcW w:type="dxa" w:w="3230"/>
+            <w:vAlign w:val="center"/>
+          </w:tcPr>
+          <w:p>
+            <w:r>
+              <w:t>Thiếu trường bắt buộc hoặc ngày/giờ sai</w:t>
+            </w:r>
+          </w:p>
+        </w:tc>
+        <w:tc>
+          <w:tcPr>
+            <w:tcW w:type="dxa" w:w="3230"/>
+            <w:vAlign w:val="center"/>
+          </w:tcPr>
+          <w:p>
+            <w:r>
+              <w:t>Không lưu; hiển thị cảnh báo</w:t>
+            </w:r>
+          </w:p>
+        </w:tc>
+      </w:tr>
+      <w:tr>
+        <w:tc>
+          <w:tcPr>
+            <w:tcW w:type="dxa" w:w="3230"/>
+            <w:vAlign w:val="center"/>
+          </w:tcPr>
+          <w:p>
+            <w:r>
+              <w:t>TC-MIL-03</w:t>
+            </w:r>
+          </w:p>
+        </w:tc>
+        <w:tc>
+          <w:tcPr>
+            <w:tcW w:type="dxa" w:w="3230"/>
+            <w:vAlign w:val="center"/>
+          </w:tcPr>
+          <w:p>
+            <w:r>
+              <w:t>Sửa và lưu nhiều dòng chưa Accepted</w:t>
+            </w:r>
+          </w:p>
+        </w:tc>
+        <w:tc>
+          <w:tcPr>
+            <w:tcW w:type="dxa" w:w="3230"/>
+            <w:vAlign w:val="center"/>
+          </w:tcPr>
+          <w:p>
+            <w:r>
+              <w:t>Cập nhật đúng các dòng hợp lệ</w:t>
+            </w:r>
+          </w:p>
+        </w:tc>
+      </w:tr>
+      <w:tr>
+        <w:tc>
+          <w:tcPr>
+            <w:tcW w:type="dxa" w:w="3230"/>
+            <w:vAlign w:val="center"/>
+          </w:tcPr>
+          <w:p>
+            <w:r>
+              <w:t>TC-MIL-04</w:t>
+            </w:r>
+          </w:p>
+        </w:tc>
+        <w:tc>
+          <w:tcPr>
+            <w:tcW w:type="dxa" w:w="3230"/>
+            <w:vAlign w:val="center"/>
+          </w:tcPr>
+          <w:p>
+            <w:r>
+              <w:t>Accepted khi thiếu Từ ngày/Đến ngày</w:t>
+            </w:r>
+          </w:p>
+        </w:tc>
+        <w:tc>
+          <w:tcPr>
+            <w:tcW w:type="dxa" w:w="3230"/>
+            <w:vAlign w:val="center"/>
+          </w:tcPr>
+          <w:p>
+            <w:r>
+              <w:t>Không thực hiện; yêu cầu chọn đủ ngày</w:t>
+            </w:r>
+          </w:p>
+        </w:tc>
+      </w:tr>
+      <w:tr>
+        <w:tc>
+          <w:tcPr>
+            <w:tcW w:type="dxa" w:w="3230"/>
+            <w:vAlign w:val="center"/>
+          </w:tcPr>
+          <w:p>
+            <w:r>
+              <w:t>TC-MIL-05</w:t>
+            </w:r>
+          </w:p>
+        </w:tc>
+        <w:tc>
+          <w:tcPr>
+            <w:tcW w:type="dxa" w:w="3230"/>
+            <w:vAlign w:val="center"/>
+          </w:tcPr>
+          <w:p>
+            <w:r>
+              <w:t>Accepted với Từ ngày lớn hơn Đến ngày</w:t>
+            </w:r>
+          </w:p>
+        </w:tc>
+        <w:tc>
+          <w:tcPr>
+            <w:tcW w:type="dxa" w:w="3230"/>
+            <w:vAlign w:val="center"/>
+          </w:tcPr>
+          <w:p>
+            <w:r>
+              <w:t>Không thực hiện; cảnh báo khoảng ngày</w:t>
+            </w:r>
+          </w:p>
+        </w:tc>
+      </w:tr>
+      <w:tr>
+        <w:tc>
+          <w:tcPr>
+            <w:tcW w:type="dxa" w:w="3230"/>
+            <w:vAlign w:val="center"/>
+          </w:tcPr>
+          <w:p>
+            <w:r>
+              <w:t>TC-MIL-06</w:t>
+            </w:r>
+          </w:p>
+        </w:tc>
+        <w:tc>
+          <w:tcPr>
+            <w:tcW w:type="dxa" w:w="3230"/>
+            <w:vAlign w:val="center"/>
+          </w:tcPr>
+          <w:p>
+            <w:r>
+              <w:t>Accepted khoảng ngày hợp lệ</w:t>
+            </w:r>
+          </w:p>
+        </w:tc>
+        <w:tc>
+          <w:tcPr>
+            <w:tcW w:type="dxa" w:w="3230"/>
+            <w:vAlign w:val="center"/>
+          </w:tcPr>
+          <w:p>
+            <w:r>
+              <w:t>Chuyển KHB phù hợp sang ISACCEPTED = 1 và báo số lượng</w:t>
+            </w:r>
+          </w:p>
+        </w:tc>
+      </w:tr>
+      <w:tr>
+        <w:tc>
+          <w:tcPr>
+            <w:tcW w:type="dxa" w:w="3230"/>
+            <w:vAlign w:val="center"/>
+          </w:tcPr>
+          <w:p>
+            <w:r>
+              <w:t>TC-MIL-07</w:t>
+            </w:r>
+          </w:p>
+        </w:tc>
+        <w:tc>
+          <w:tcPr>
+            <w:tcW w:type="dxa" w:w="3230"/>
+            <w:vAlign w:val="center"/>
+          </w:tcPr>
+          <w:p>
+            <w:r>
+              <w:t>API Accepted bị lỗi</w:t>
+            </w:r>
+          </w:p>
+        </w:tc>
+        <w:tc>
+          <w:tcPr>
+            <w:tcW w:type="dxa" w:w="3230"/>
+            <w:vAlign w:val="center"/>
+          </w:tcPr>
+          <w:p>
+            <w:r>
+              <w:t>Không báo thành công; cho phép thử lại</w:t>
+            </w:r>
+          </w:p>
+        </w:tc>
+      </w:tr>
+      <w:tr>
+        <w:tc>
+          <w:tcPr>
+            <w:tcW w:type="dxa" w:w="3230"/>
+            <w:vAlign w:val="center"/>
+          </w:tcPr>
+          <w:p>
+            <w:r>
+              <w:t>TC-MIL-08</w:t>
+            </w:r>
+          </w:p>
+        </w:tc>
+        <w:tc>
+          <w:tcPr>
+            <w:tcW w:type="dxa" w:w="3230"/>
+            <w:vAlign w:val="center"/>
+          </w:tcPr>
+          <w:p>
+            <w:r>
+              <w:t>Export Message khi đang lọc Chưa Accepted</w:t>
+            </w:r>
+          </w:p>
+        </w:tc>
+        <w:tc>
+          <w:tcPr>
+            <w:tcW w:type="dxa" w:w="3230"/>
+            <w:vAlign w:val="center"/>
+          </w:tcPr>
+          <w:p>
+            <w:r>
+              <w:t>Nút bị khóa hoặc thao tác bị từ chối</w:t>
+            </w:r>
+          </w:p>
+        </w:tc>
+      </w:tr>
+      <w:tr>
+        <w:tc>
+          <w:tcPr>
+            <w:tcW w:type="dxa" w:w="3230"/>
+            <w:vAlign w:val="center"/>
+          </w:tcPr>
+          <w:p>
+            <w:r>
+              <w:t>TC-MIL-09</w:t>
+            </w:r>
+          </w:p>
+        </w:tc>
+        <w:tc>
+          <w:tcPr>
+            <w:tcW w:type="dxa" w:w="3230"/>
+            <w:vAlign w:val="center"/>
+          </w:tcPr>
+          <w:p>
+            <w:r>
+              <w:t>Export Message KHB đã Accepted</w:t>
+            </w:r>
+          </w:p>
+        </w:tc>
+        <w:tc>
+          <w:tcPr>
+            <w:tcW w:type="dxa" w:w="3230"/>
+            <w:vAlign w:val="center"/>
+          </w:tcPr>
+          <w:p>
+            <w:r>
+              <w:t>Tạo QS MESSAGE trong T_PLAN_MESSAGE và báo đúng số chuyến</w:t>
+            </w:r>
+          </w:p>
+        </w:tc>
+      </w:tr>
+      <w:tr>
+        <w:tc>
+          <w:tcPr>
+            <w:tcW w:type="dxa" w:w="3230"/>
+            <w:vAlign w:val="center"/>
+          </w:tcPr>
+          <w:p>
+            <w:r>
+              <w:t>TC-MIL-10</w:t>
+            </w:r>
+          </w:p>
+        </w:tc>
+        <w:tc>
+          <w:tcPr>
+            <w:tcW w:type="dxa" w:w="3230"/>
+            <w:vAlign w:val="center"/>
+          </w:tcPr>
+          <w:p>
+            <w:r>
+              <w:t>Export Message gặp lỗi API/Oracle</w:t>
+            </w:r>
+          </w:p>
+        </w:tc>
+        <w:tc>
+          <w:tcPr>
+            <w:tcW w:type="dxa" w:w="3230"/>
+            <w:vAlign w:val="center"/>
+          </w:tcPr>
+          <w:p>
+            <w:r>
+              <w:t>Không báo thành công và không tạo dữ liệu dở dang</w:t>
+            </w:r>
+          </w:p>
+        </w:tc>
+      </w:tr>
+      <w:tr>
+        <w:tc>
+          <w:tcPr>
+            <w:tcW w:type="dxa" w:w="3230"/>
+            <w:vAlign w:val="center"/>
+          </w:tcPr>
+          <w:p>
+            <w:r>
+              <w:t>TC-MIL-11</w:t>
+            </w:r>
+          </w:p>
+        </w:tc>
+        <w:tc>
+          <w:tcPr>
+            <w:tcW w:type="dxa" w:w="3230"/>
+            <w:vAlign w:val="center"/>
+          </w:tcPr>
+          <w:p>
+            <w:r>
+              <w:t>Phát QS MESSAGE hợp lệ</w:t>
+            </w:r>
+          </w:p>
+        </w:tc>
+        <w:tc>
+          <w:tcPr>
+            <w:tcW w:type="dxa" w:w="3230"/>
+            <w:vAlign w:val="center"/>
+          </w:tcPr>
+          <w:p>
+            <w:r>
+              <w:t>Ghi nhận trạng thái, người và thời điểm phát</w:t>
+            </w:r>
+          </w:p>
+        </w:tc>
+      </w:tr>
+      <w:tr>
+        <w:tc>
+          <w:tcPr>
+            <w:tcW w:type="dxa" w:w="3230"/>
+            <w:vAlign w:val="center"/>
+          </w:tcPr>
+          <w:p>
+            <w:r>
+              <w:t>TC-MIL-12</w:t>
+            </w:r>
+          </w:p>
+        </w:tc>
+        <w:tc>
+          <w:tcPr>
+            <w:tcW w:type="dxa" w:w="3230"/>
+            <w:vAlign w:val="center"/>
+          </w:tcPr>
+          <w:p>
+            <w:r>
+              <w:t>Người không có quyền phát</w:t>
+            </w:r>
+          </w:p>
+        </w:tc>
+        <w:tc>
+          <w:tcPr>
+            <w:tcW w:type="dxa" w:w="3230"/>
+            <w:vAlign w:val="center"/>
+          </w:tcPr>
+          <w:p>
+            <w:r>
+              <w:t>Hệ thống từ chối thao tác</w:t>
+            </w:r>
+          </w:p>
+        </w:tc>
+      </w:tr>
+      <w:tr>
+        <w:tc>
+          <w:tcPr>
+            <w:tcW w:type="dxa" w:w="3230"/>
+            <w:vAlign w:val="center"/>
+          </w:tcPr>
+          <w:p>
+            <w:r>
+              <w:t>TC-MIL-13</w:t>
+            </w:r>
+          </w:p>
+        </w:tc>
+        <w:tc>
+          <w:tcPr>
+            <w:tcW w:type="dxa" w:w="3230"/>
+            <w:vAlign w:val="center"/>
+          </w:tcPr>
+          <w:p>
+            <w:r>
+              <w:t>Tra cứu Military Report</w:t>
+            </w:r>
+          </w:p>
+        </w:tc>
+        <w:tc>
+          <w:tcPr>
+            <w:tcW w:type="dxa" w:w="3230"/>
+            <w:vAlign w:val="center"/>
+          </w:tcPr>
+          <w:p>
+            <w:r>
+              <w:t>Chỉ hiển thị KHB ISACCEPTED = 1 phù hợp bộ lọc</w:t>
+            </w:r>
+          </w:p>
+        </w:tc>
+      </w:tr>
+      <w:tr>
+        <w:tc>
+          <w:tcPr>
+            <w:tcW w:type="dxa" w:w="3230"/>
+            <w:vAlign w:val="center"/>
+          </w:tcPr>
+          <w:p>
+            <w:r>
+              <w:t>TC-MIL-14</w:t>
+            </w:r>
+          </w:p>
+        </w:tc>
+        <w:tc>
+          <w:tcPr>
+            <w:tcW w:type="dxa" w:w="3230"/>
+            <w:vAlign w:val="center"/>
+          </w:tcPr>
+          <w:p>
+            <w:r>
+              <w:t>Thử thêm/sửa/xóa tại Military Report</w:t>
+            </w:r>
+          </w:p>
+        </w:tc>
+        <w:tc>
+          <w:tcPr>
+            <w:tcW w:type="dxa" w:w="3230"/>
+            <w:vAlign w:val="center"/>
+          </w:tcPr>
+          <w:p>
+            <w:r>
+              <w:t>Không có thao tác hoặc máy chủ từ chối</w:t>
+            </w:r>
+          </w:p>
+        </w:tc>
+      </w:tr>
+      <w:tr>
+        <w:tc>
+          <w:tcPr>
+            <w:tcW w:type="dxa" w:w="3230"/>
+            <w:vAlign w:val="center"/>
+          </w:tcPr>
+          <w:p>
+            <w:r>
+              <w:t>TC-MIL-15</w:t>
+            </w:r>
+          </w:p>
+        </w:tc>
+        <w:tc>
+          <w:tcPr>
+            <w:tcW w:type="dxa" w:w="3230"/>
+            <w:vAlign w:val="center"/>
+          </w:tcPr>
+          <w:p>
+            <w:r>
+              <w:t>Export Excel từ Military Report</w:t>
+            </w:r>
+          </w:p>
+        </w:tc>
+        <w:tc>
+          <w:tcPr>
+            <w:tcW w:type="dxa" w:w="3230"/>
+            <w:vAlign w:val="center"/>
+          </w:tcPr>
+          <w:p>
+            <w:r>
+              <w:t>File chứa đủ dữ liệu theo bộ lọc</w:t>
+            </w:r>
+          </w:p>
+        </w:tc>
+      </w:tr>
+      <w:tr>
+        <w:tc>
+          <w:tcPr>
+            <w:tcW w:type="dxa" w:w="3230"/>
+            <w:vAlign w:val="center"/>
+          </w:tcPr>
+          <w:p>
+            <w:r>
+              <w:t>TC-MIL-16</w:t>
+            </w:r>
+          </w:p>
+        </w:tc>
+        <w:tc>
+          <w:tcPr>
+            <w:tcW w:type="dxa" w:w="3230"/>
+            <w:vAlign w:val="center"/>
+          </w:tcPr>
+          <w:p>
+            <w:r>
+              <w:t>Đối chiếu màn hình quản lý và Report</w:t>
+            </w:r>
+          </w:p>
+        </w:tc>
+        <w:tc>
+          <w:tcPr>
+            <w:tcW w:type="dxa" w:w="3230"/>
+            <w:vAlign w:val="center"/>
+          </w:tcPr>
+          <w:p>
+            <w:r>
+              <w:t>Dữ liệu Đã Accepted nhất quán</w:t>
+            </w:r>
+          </w:p>
+        </w:tc>
+      </w:tr>
+    </w:tbl>
+    <w:p/>
+    <w:tbl>
+      <w:tblPr>
+        <w:tblStyle w:val="TableGrid"/>
+        <w:tblW w:type="auto" w:w="0"/>
+        <w:jc w:val="center"/>
+        <w:tblLook w:firstColumn="1" w:firstRow="1" w:lastColumn="0" w:lastRow="0" w:noHBand="0" w:noVBand="1" w:val="04A0"/>
+      </w:tblPr>
+      <w:tblGrid>
+        <w:gridCol w:w="3230"/>
+        <w:gridCol w:w="3230"/>
+        <w:gridCol w:w="3230"/>
+      </w:tblGrid>
+      <w:tr>
+        <w:trPr>
+          <w:tblHeader w:val="true"/>
+        </w:trPr>
+        <w:tc>
+          <w:tcPr>
+            <w:tcW w:type="dxa" w:w="3230"/>
+            <w:shd w:fill="D9EAF7"/>
+          </w:tcPr>
+          <w:p>
+            <w:r>
+              <w:rPr>
+                <w:b/>
+              </w:rPr>
+              <w:t>Mã yêu cầu</w:t>
+            </w:r>
+          </w:p>
+        </w:tc>
+        <w:tc>
+          <w:tcPr>
+            <w:tcW w:type="dxa" w:w="3230"/>
+            <w:shd w:fill="D9EAF7"/>
+          </w:tcPr>
+          <w:p>
+            <w:r>
+              <w:rPr>
+                <w:b/>
+              </w:rPr>
+              <w:t>Nội dung</w:t>
+            </w:r>
+          </w:p>
+        </w:tc>
+        <w:tc>
+          <w:tcPr>
+            <w:tcW w:type="dxa" w:w="3230"/>
+            <w:shd w:fill="D9EAF7"/>
+          </w:tcPr>
+          <w:p>
+            <w:r>
+              <w:rPr>
+                <w:b/>
+              </w:rPr>
+              <w:t>Kiểm thử</w:t>
+            </w:r>
+          </w:p>
+        </w:tc>
+      </w:tr>
+      <w:tr>
+        <w:tc>
+          <w:tcPr>
+            <w:tcW w:type="dxa" w:w="3230"/>
+            <w:vAlign w:val="center"/>
+          </w:tcPr>
+          <w:p>
+            <w:r>
+              <w:t>FR-MIL-01…FR-MIL-06</w:t>
+            </w:r>
+          </w:p>
+        </w:tc>
+        <w:tc>
+          <w:tcPr>
+            <w:tcW w:type="dxa" w:w="3230"/>
+            <w:vAlign w:val="center"/>
+          </w:tcPr>
+          <w:p>
+            <w:r>
+              <w:t>Nhập và quản lý KHB</w:t>
+            </w:r>
+          </w:p>
+        </w:tc>
+        <w:tc>
+          <w:tcPr>
+            <w:tcW w:type="dxa" w:w="3230"/>
+            <w:vAlign w:val="center"/>
+          </w:tcPr>
+          <w:p>
+            <w:r>
+              <w:t>TC-MIL-01…TC-MIL-03</w:t>
+            </w:r>
+          </w:p>
+        </w:tc>
+      </w:tr>
+      <w:tr>
+        <w:tc>
+          <w:tcPr>
+            <w:tcW w:type="dxa" w:w="3230"/>
+            <w:vAlign w:val="center"/>
+          </w:tcPr>
+          <w:p>
+            <w:r>
+              <w:t>FR-MIL-07…FR-MIL-12</w:t>
+            </w:r>
+          </w:p>
+        </w:tc>
+        <w:tc>
+          <w:tcPr>
+            <w:tcW w:type="dxa" w:w="3230"/>
+            <w:vAlign w:val="center"/>
+          </w:tcPr>
+          <w:p>
+            <w:r>
+              <w:t>Accepted KHB quân sự</w:t>
+            </w:r>
+          </w:p>
+        </w:tc>
+        <w:tc>
+          <w:tcPr>
+            <w:tcW w:type="dxa" w:w="3230"/>
+            <w:vAlign w:val="center"/>
+          </w:tcPr>
+          <w:p>
+            <w:r>
+              <w:t>TC-MIL-04…TC-MIL-07</w:t>
+            </w:r>
+          </w:p>
+        </w:tc>
+      </w:tr>
+      <w:tr>
+        <w:tc>
+          <w:tcPr>
+            <w:tcW w:type="dxa" w:w="3230"/>
+            <w:vAlign w:val="center"/>
+          </w:tcPr>
+          <w:p>
+            <w:r>
+              <w:t>FR-MIL-13…FR-MIL-20</w:t>
+            </w:r>
+          </w:p>
+        </w:tc>
+        <w:tc>
+          <w:tcPr>
+            <w:tcW w:type="dxa" w:w="3230"/>
+            <w:vAlign w:val="center"/>
+          </w:tcPr>
+          <w:p>
+            <w:r>
+              <w:t>Export Message và Phát đi</w:t>
+            </w:r>
+          </w:p>
+        </w:tc>
+        <w:tc>
+          <w:tcPr>
+            <w:tcW w:type="dxa" w:w="3230"/>
+            <w:vAlign w:val="center"/>
+          </w:tcPr>
+          <w:p>
+            <w:r>
+              <w:t>TC-MIL-08…TC-MIL-12</w:t>
+            </w:r>
+          </w:p>
+        </w:tc>
+      </w:tr>
+      <w:tr>
+        <w:tc>
+          <w:tcPr>
+            <w:tcW w:type="dxa" w:w="3230"/>
+            <w:vAlign w:val="center"/>
+          </w:tcPr>
+          <w:p>
+            <w:r>
+              <w:t>FR-MIL-21…FR-MIL-25</w:t>
+            </w:r>
+          </w:p>
+        </w:tc>
+        <w:tc>
+          <w:tcPr>
+            <w:tcW w:type="dxa" w:w="3230"/>
+            <w:vAlign w:val="center"/>
+          </w:tcPr>
+          <w:p>
+            <w:r>
+              <w:t>Military Report chỉ xem</w:t>
+            </w:r>
+          </w:p>
+        </w:tc>
+        <w:tc>
+          <w:tcPr>
+            <w:tcW w:type="dxa" w:w="3230"/>
+            <w:vAlign w:val="center"/>
+          </w:tcPr>
+          <w:p>
+            <w:r>
+              <w:t>TC-MIL-13…TC-MIL-16</w:t>
+            </w:r>
+          </w:p>
+        </w:tc>
+      </w:tr>
+      <w:tr>
+        <w:tc>
+          <w:tcPr>
+            <w:tcW w:type="dxa" w:w="3230"/>
+            <w:vAlign w:val="center"/>
+          </w:tcPr>
+          <w:p>
+            <w:r>
+              <w:t>NFR-MIL-01…NFR-MIL-05</w:t>
+            </w:r>
+          </w:p>
+        </w:tc>
+        <w:tc>
+          <w:tcPr>
+            <w:tcW w:type="dxa" w:w="3230"/>
+            <w:vAlign w:val="center"/>
+          </w:tcPr>
+          <w:p>
+            <w:r>
+              <w:t>Bảo mật, nhật ký, hiệu năng và truy vết</w:t>
+            </w:r>
+          </w:p>
+        </w:tc>
+        <w:tc>
+          <w:tcPr>
+            <w:tcW w:type="dxa" w:w="3230"/>
+            <w:vAlign w:val="center"/>
+          </w:tcPr>
+          <w:p>
+            <w:r>
+              <w:t>TC-MIL-07, TC-MIL-10…TC-MIL-16</w:t>
             </w:r>
           </w:p>
         </w:tc>

</xml_diff>